<commit_message>
# Usando variáveis de ambiente
Adicionando variáveis de ambiente
No cypress.config.js habilitar allowCypressEnv: true
</commit_message>
<xml_diff>
--- a/Módulo_6_Testando e Automatizando Testes em Aplicações Web/Módulo 6 - Audio.docx
+++ b/Módulo_6_Testando e Automatizando Testes em Aplicações Web/Módulo 6 - Audio.docx
@@ -11414,6 +11414,10 @@
     <w:p>
       <w:pPr>
         <w:spacing w:after="0"/>
+        <w:rPr>
+          <w:b/>
+          <w:bCs/>
+        </w:rPr>
       </w:pPr>
       <w:r>
         <w:rPr>
@@ -11436,6 +11440,671 @@
         </w:rPr>
         <w:t xml:space="preserve">. </w:t>
       </w:r>
+      <w:r>
+        <w:rPr>
+          <w:b/>
+          <w:bCs/>
+        </w:rPr>
+        <w:t>Utilizando variáveis de ambiente</w:t>
+      </w:r>
+    </w:p>
+    <w:p>
+      <w:pPr>
+        <w:spacing w:after="0"/>
+      </w:pPr>
+      <w:r>
+        <w:t xml:space="preserve">A gente vai falar agora sobre algo que é muito comum dentro de automação de testes, que é o uso de variáveis de ambiente pra que você consiga fazer pequenas mudanças nos dados que são variáveis e que precisam ser utilizados dentro do seu script de testes. Pra que você possa entender esse conceito de 1 maneira pouco mais sólida, é necessário que você entenda que todas as vezes que você tem script de testes, e ele tem lá os seus dados de utilização, ok? Esse script vai ser </w:t>
+      </w:r>
+      <w:proofErr w:type="spellStart"/>
+      <w:r>
+        <w:t>versionado</w:t>
+      </w:r>
+      <w:proofErr w:type="spellEnd"/>
+      <w:r>
+        <w:t xml:space="preserve">, ele ser </w:t>
+      </w:r>
+      <w:proofErr w:type="spellStart"/>
+      <w:r>
+        <w:t>versionado</w:t>
+      </w:r>
+      <w:proofErr w:type="spellEnd"/>
+      <w:r>
+        <w:t xml:space="preserve"> como você já viu até aqui. E pra que você, de fato, faça a mudança num script, tá? Eu estou falando aqui da mudança final, tá? Porque por exemplo, aqui eu posso simplesmente chegar nesse script e mudar o que eu </w:t>
+      </w:r>
+      <w:r>
+        <w:lastRenderedPageBreak/>
+        <w:t xml:space="preserve">quiser, mas 1 vez que eu já decidi que o meu script está pronto, eu tenho que fazer o </w:t>
+      </w:r>
+      <w:proofErr w:type="spellStart"/>
+      <w:r>
+        <w:t>git</w:t>
+      </w:r>
+      <w:proofErr w:type="spellEnd"/>
+      <w:r>
+        <w:t xml:space="preserve"> </w:t>
+      </w:r>
+      <w:proofErr w:type="spellStart"/>
+      <w:r>
+        <w:t>add</w:t>
+      </w:r>
+      <w:proofErr w:type="spellEnd"/>
+      <w:r>
+        <w:t xml:space="preserve">, tenho que fazer o </w:t>
+      </w:r>
+      <w:proofErr w:type="spellStart"/>
+      <w:r>
+        <w:t>git</w:t>
+      </w:r>
+      <w:proofErr w:type="spellEnd"/>
+      <w:r>
+        <w:t xml:space="preserve"> </w:t>
+      </w:r>
+      <w:proofErr w:type="spellStart"/>
+      <w:r>
+        <w:t>commit</w:t>
+      </w:r>
+      <w:proofErr w:type="spellEnd"/>
+      <w:r>
+        <w:t xml:space="preserve">, tenho que fazer </w:t>
+      </w:r>
+      <w:proofErr w:type="spellStart"/>
+      <w:r>
+        <w:t>push</w:t>
+      </w:r>
+      <w:proofErr w:type="spellEnd"/>
+      <w:r>
+        <w:t xml:space="preserve">, tenho que abrir PR, tenho que esperar o meu time avaliar o PR, e aí quando ele, quando o for avaliado, aí sim esse código é feito na nossa principal, entendeu? Então é negócio que demora. Agora vamos dizer, que eu digo assim pra você, olha, é o seguinte, agora eu quero rodar os testes com </w:t>
+      </w:r>
+      <w:proofErr w:type="spellStart"/>
+      <w:r>
+        <w:t>localhost</w:t>
+      </w:r>
+      <w:proofErr w:type="spellEnd"/>
+      <w:r>
+        <w:t xml:space="preserve"> 4000 e daqui </w:t>
+      </w:r>
+      <w:proofErr w:type="spellStart"/>
+      <w:r>
+        <w:t>daqui</w:t>
+      </w:r>
+      <w:proofErr w:type="spellEnd"/>
+      <w:r>
+        <w:t xml:space="preserve"> a mais tempo eu quero rodar esses mesmos testes, só que com outro endereço, sei lá, julho de lima ponto com ponto t r. Entende? Aí você vai virar pra mim e vai falar, ah, </w:t>
+      </w:r>
+      <w:proofErr w:type="spellStart"/>
+      <w:r>
+        <w:t>Julio</w:t>
+      </w:r>
+      <w:proofErr w:type="spellEnd"/>
+      <w:r>
+        <w:t xml:space="preserve">, então vamos esperar aí dia porque eu vou ter que fazer as alterações, </w:t>
+      </w:r>
+      <w:proofErr w:type="spellStart"/>
+      <w:r>
+        <w:t>comitar</w:t>
+      </w:r>
+      <w:proofErr w:type="spellEnd"/>
+      <w:r>
+        <w:t xml:space="preserve"> tudo, </w:t>
+      </w:r>
+      <w:proofErr w:type="spellStart"/>
+      <w:r>
+        <w:t>versionar</w:t>
+      </w:r>
+      <w:proofErr w:type="spellEnd"/>
+      <w:r>
+        <w:t xml:space="preserve"> e esperar a galera do time, né, aprovar o PR pra depois isso, né, a gente conseguir fazer essa mudança. Não, não dá pra ser assim, entende? Tem que ter 1 forma que você consegue mudar dado como esse rápido, entende? Sem alterar o script. Pegou aqui o ponto? Então quando você tem alguma informação dentro do seu teste que você quer alterar, sabe, de 1 execução pra outra, sem alterar o script, é quando você vai usar esse recurso que a gente vai aprender hoje que são variáveis de ambiente. Como que a gente </w:t>
+      </w:r>
+      <w:proofErr w:type="gramStart"/>
+      <w:r>
+        <w:t>usa elas</w:t>
+      </w:r>
+      <w:proofErr w:type="gramEnd"/>
+      <w:r>
+        <w:t xml:space="preserve">? Vou te mostrar 1º aqui, né? Veja, isso daqui é a variável, isso daqui é o valor que a gente quer que seja variável, certo? A cada execução e que a gente não quer ficar mexendo nesse código o tempo todo. Então o que eu vou fazer? Vou copiar esse valor daqui, vou ir lá pro meu </w:t>
+      </w:r>
+      <w:proofErr w:type="spellStart"/>
+      <w:proofErr w:type="gramStart"/>
+      <w:r>
+        <w:t>package.json</w:t>
+      </w:r>
+      <w:proofErr w:type="spellEnd"/>
+      <w:proofErr w:type="gramEnd"/>
+      <w:r>
+        <w:t xml:space="preserve">, ok? E eu tenho aqui esse meu teste, vamos dizer que esse meu teste ele vai rodar, sempre quando eu chamar n p m teste ele está rodando os testes localmente, ou seja, estou na minha máquina rodando aqui no meu computador, beleza? Então se ele vai ser sempre localmente, que eu vou fazer? Vou vir aqui e vou digitar isso olha, </w:t>
+      </w:r>
+      <w:proofErr w:type="gramStart"/>
+      <w:r>
+        <w:t>traço</w:t>
+      </w:r>
+      <w:proofErr w:type="gramEnd"/>
+      <w:r>
+        <w:t xml:space="preserve"> </w:t>
+      </w:r>
+      <w:proofErr w:type="spellStart"/>
+      <w:r>
+        <w:t>traço</w:t>
+      </w:r>
+      <w:proofErr w:type="spellEnd"/>
+      <w:r>
+        <w:t xml:space="preserve"> </w:t>
+      </w:r>
+      <w:proofErr w:type="spellStart"/>
+      <w:r>
+        <w:t>env</w:t>
+      </w:r>
+      <w:proofErr w:type="spellEnd"/>
+      <w:r>
+        <w:t xml:space="preserve">, aí vou dar mais espaço, e vou digitar aqui o nome pra essa minha variável de ambiente, vou chamar ela de URL, por exemplo, está bom? URL, aqui eu vou colocar igual e vou colar aqui esse endereço, está vendo? Então o que que eu estou fazendo aqui? Eu estou criando 1 variável de ambiente chamada URL que tem dentro dela essa URL aqui. </w:t>
+      </w:r>
+      <w:proofErr w:type="spellStart"/>
+      <w:r>
+        <w:t>Julio</w:t>
+      </w:r>
+      <w:proofErr w:type="spellEnd"/>
+      <w:r>
+        <w:t xml:space="preserve">, e se você quisesse criar outra variável, você poderia? Sei lá, 1 variável, criar qualquer coisa que token, poderia? Poderia. É só você aqui dentro mesmo desse, né, dessa </w:t>
+      </w:r>
+      <w:proofErr w:type="spellStart"/>
+      <w:r>
+        <w:t>dessa</w:t>
+      </w:r>
+      <w:proofErr w:type="spellEnd"/>
+      <w:r>
+        <w:t xml:space="preserve"> definição de </w:t>
+      </w:r>
+      <w:proofErr w:type="spellStart"/>
+      <w:r>
+        <w:t>env</w:t>
+      </w:r>
+      <w:proofErr w:type="spellEnd"/>
+      <w:r>
+        <w:t xml:space="preserve"> aqui, você colocar 1 vírgula aqui no final e digitar assim olha, token igual e colocar aqui o número do token, entendeu? É assim que você declara mais do que 1 variável de ambiente no Cypress, está bom? Mas a gente só vai precisar de 1 que é essa. E aí? Vamos dizer que agora eu quero, que eu quero que eu quisesse rodar esse teste apontando pra produção. Então vem aqui olha, coloca o teste traço </w:t>
+      </w:r>
+      <w:proofErr w:type="spellStart"/>
+      <w:r>
+        <w:t>prod</w:t>
+      </w:r>
+      <w:proofErr w:type="spellEnd"/>
+      <w:r>
+        <w:t xml:space="preserve"> de produção, entendeu? E aí aqui, ele não seria mais o r l h t p </w:t>
+      </w:r>
+      <w:proofErr w:type="spellStart"/>
+      <w:r>
+        <w:t>localhost</w:t>
+      </w:r>
+      <w:proofErr w:type="spellEnd"/>
+      <w:r>
+        <w:t xml:space="preserve"> 4000 seria, não é? W </w:t>
+      </w:r>
+      <w:proofErr w:type="spellStart"/>
+      <w:r>
+        <w:t>ww</w:t>
+      </w:r>
+      <w:proofErr w:type="spellEnd"/>
+      <w:r>
+        <w:t xml:space="preserve"> ponto </w:t>
+      </w:r>
+      <w:proofErr w:type="spellStart"/>
+      <w:r>
+        <w:t>Julio</w:t>
+      </w:r>
+      <w:proofErr w:type="spellEnd"/>
+      <w:r>
+        <w:t xml:space="preserve"> De Lima ponto com ponto b r. Entendeu aqui o conceito de? De variável de ambiente. Esse comando vai passar 1 variável de ambiente que é a URL com esse valor, e esse outro comando vai passar essa variável de ambiente com esse valor aqui. Beleza? Esse daqui é o teste em </w:t>
+      </w:r>
+      <w:proofErr w:type="spellStart"/>
+      <w:r>
+        <w:t>prod</w:t>
+      </w:r>
+      <w:proofErr w:type="spellEnd"/>
+      <w:r>
+        <w:t xml:space="preserve">, tipo teste em produção, daqui é o teste normal que vai rodar localmente no meu computador aqui, tá bom? Apontando pro pra </w:t>
+      </w:r>
+      <w:proofErr w:type="spellStart"/>
+      <w:r>
+        <w:t>pra</w:t>
+      </w:r>
+      <w:proofErr w:type="spellEnd"/>
+      <w:r>
+        <w:t xml:space="preserve"> aplicação que está no meu computador, ok? Então está aí, isso daqui. Agora o que acontece? Gente tem que mudar o código, só que veja, aqui a gente já tem 2 variações, e eu preciso mudar o código aqui olha, apenas 1 vez. Então eu vir aqui no login, e aqui olha, no lugar de colocar aqui esse site </w:t>
+      </w:r>
+      <w:proofErr w:type="spellStart"/>
+      <w:r>
+        <w:t>visit</w:t>
+      </w:r>
+      <w:proofErr w:type="spellEnd"/>
+      <w:r>
+        <w:t xml:space="preserve"> com </w:t>
+      </w:r>
+      <w:proofErr w:type="spellStart"/>
+      <w:r>
+        <w:t>httplocalhostquatromil</w:t>
+      </w:r>
+      <w:proofErr w:type="spellEnd"/>
+      <w:r>
+        <w:t xml:space="preserve">, o que que eu vou fazer? Eu vou colocar aqui o comando </w:t>
+      </w:r>
+      <w:proofErr w:type="spellStart"/>
+      <w:r>
+        <w:t>cypress</w:t>
+      </w:r>
+      <w:proofErr w:type="spellEnd"/>
+      <w:r>
+        <w:t xml:space="preserve"> ponto </w:t>
+      </w:r>
+      <w:proofErr w:type="spellStart"/>
+      <w:r>
+        <w:t>env</w:t>
+      </w:r>
+      <w:proofErr w:type="spellEnd"/>
+      <w:r>
+        <w:t xml:space="preserve">, só esse comando aqui, </w:t>
+      </w:r>
+      <w:proofErr w:type="spellStart"/>
+      <w:r>
+        <w:t>cypress</w:t>
+      </w:r>
+      <w:proofErr w:type="spellEnd"/>
+      <w:r>
+        <w:t xml:space="preserve"> ponto </w:t>
+      </w:r>
+      <w:proofErr w:type="spellStart"/>
+      <w:r>
+        <w:t>env</w:t>
+      </w:r>
+      <w:proofErr w:type="spellEnd"/>
+      <w:r>
+        <w:t xml:space="preserve">, ele já vai falar o seguinte, tem algum </w:t>
+      </w:r>
+      <w:proofErr w:type="spellStart"/>
+      <w:r>
+        <w:t>env</w:t>
+      </w:r>
+      <w:proofErr w:type="spellEnd"/>
+      <w:r>
+        <w:t xml:space="preserve"> que foi enviado aí durante a execução do comando? Tem. Qual que é as, qual que a variável que eu quero usar lá? Quero usar a variável URL, então, copio daqui a variável URL e coloco aqui </w:t>
+      </w:r>
+      <w:proofErr w:type="gramStart"/>
+      <w:r>
+        <w:t>dentro do parênteses</w:t>
+      </w:r>
+      <w:proofErr w:type="gramEnd"/>
+      <w:r>
+        <w:t xml:space="preserve">, olha. Pronto. Então agora, isso daqui olha, nunca mais muda. Se eu quiser agora criar outro ambiente, por exemplo, ambiente de QA, que eu vou fazer? Vou vir aqui olha, vou copiar aqui o teste </w:t>
+      </w:r>
+      <w:proofErr w:type="spellStart"/>
+      <w:r>
+        <w:t>prod</w:t>
+      </w:r>
+      <w:proofErr w:type="spellEnd"/>
+      <w:r>
+        <w:t xml:space="preserve">, colocar aqui em cima, </w:t>
+      </w:r>
+      <w:proofErr w:type="gramStart"/>
+      <w:r>
+        <w:t>Vamos</w:t>
+      </w:r>
+      <w:proofErr w:type="gramEnd"/>
+      <w:r>
+        <w:t xml:space="preserve"> dizer que fosse teste q a, está vendo? Aí aqui tivesse endereço que fosse, por exemplo, q a </w:t>
+      </w:r>
+      <w:proofErr w:type="spellStart"/>
+      <w:r>
+        <w:t>environment</w:t>
+      </w:r>
+      <w:proofErr w:type="spellEnd"/>
+      <w:r>
+        <w:t xml:space="preserve">, né? Daqueles aqui fosse ambiente de q a do </w:t>
+      </w:r>
+      <w:proofErr w:type="spellStart"/>
+      <w:r>
+        <w:t>Julio</w:t>
+      </w:r>
+      <w:proofErr w:type="spellEnd"/>
+      <w:r>
+        <w:t xml:space="preserve"> Denim, entendeu? Então, olha só, se eu rodasse só </w:t>
+      </w:r>
+      <w:proofErr w:type="spellStart"/>
+      <w:r>
+        <w:t>npm</w:t>
+      </w:r>
+      <w:proofErr w:type="spellEnd"/>
+      <w:r>
+        <w:t xml:space="preserve"> </w:t>
+      </w:r>
+      <w:proofErr w:type="spellStart"/>
+      <w:r>
+        <w:t>test</w:t>
+      </w:r>
+      <w:proofErr w:type="spellEnd"/>
+      <w:r>
+        <w:t xml:space="preserve"> rodaria apontando pra aplicação rodando local, se eu rodasse </w:t>
+      </w:r>
+      <w:proofErr w:type="spellStart"/>
+      <w:r>
+        <w:t>npm</w:t>
+      </w:r>
+      <w:proofErr w:type="spellEnd"/>
+      <w:r>
+        <w:t xml:space="preserve"> </w:t>
+      </w:r>
+      <w:proofErr w:type="spellStart"/>
+      <w:r>
+        <w:t>run</w:t>
+      </w:r>
+      <w:proofErr w:type="spellEnd"/>
+      <w:r>
+        <w:t xml:space="preserve"> </w:t>
+      </w:r>
+      <w:proofErr w:type="spellStart"/>
+      <w:r>
+        <w:t>test</w:t>
+      </w:r>
+      <w:proofErr w:type="spellEnd"/>
+      <w:r>
+        <w:t xml:space="preserve"> traço q </w:t>
+      </w:r>
+      <w:proofErr w:type="gramStart"/>
+      <w:r>
+        <w:t>a, ele</w:t>
+      </w:r>
+      <w:proofErr w:type="gramEnd"/>
+      <w:r>
+        <w:t xml:space="preserve"> iria então apontar aqui para q a </w:t>
+      </w:r>
+      <w:proofErr w:type="spellStart"/>
+      <w:r>
+        <w:t>environment</w:t>
+      </w:r>
+      <w:proofErr w:type="spellEnd"/>
+      <w:r>
+        <w:t xml:space="preserve"> ponto </w:t>
+      </w:r>
+      <w:proofErr w:type="spellStart"/>
+      <w:r>
+        <w:t>jodurian</w:t>
+      </w:r>
+      <w:proofErr w:type="spellEnd"/>
+      <w:r>
+        <w:t xml:space="preserve"> </w:t>
+      </w:r>
+      <w:proofErr w:type="gramStart"/>
+      <w:r>
+        <w:t>ponto</w:t>
+      </w:r>
+      <w:proofErr w:type="gramEnd"/>
+      <w:r>
+        <w:t xml:space="preserve"> </w:t>
+      </w:r>
+      <w:proofErr w:type="spellStart"/>
+      <w:r>
+        <w:t>ponto</w:t>
+      </w:r>
+      <w:proofErr w:type="spellEnd"/>
+      <w:r>
+        <w:t xml:space="preserve"> b r, se fosse teste </w:t>
+      </w:r>
+      <w:proofErr w:type="spellStart"/>
+      <w:r>
+        <w:t>prod</w:t>
+      </w:r>
+      <w:proofErr w:type="spellEnd"/>
+      <w:r>
+        <w:t xml:space="preserve"> né, </w:t>
+      </w:r>
+      <w:proofErr w:type="spellStart"/>
+      <w:r>
+        <w:t>npm</w:t>
+      </w:r>
+      <w:proofErr w:type="spellEnd"/>
+      <w:r>
+        <w:t xml:space="preserve"> </w:t>
+      </w:r>
+      <w:proofErr w:type="spellStart"/>
+      <w:r>
+        <w:t>run</w:t>
+      </w:r>
+      <w:proofErr w:type="spellEnd"/>
+      <w:r>
+        <w:t xml:space="preserve"> </w:t>
+      </w:r>
+      <w:proofErr w:type="spellStart"/>
+      <w:r>
+        <w:t>test</w:t>
+      </w:r>
+      <w:proofErr w:type="spellEnd"/>
+      <w:r>
+        <w:t xml:space="preserve"> </w:t>
+      </w:r>
+      <w:proofErr w:type="spellStart"/>
+      <w:r>
+        <w:t>prod</w:t>
+      </w:r>
+      <w:proofErr w:type="spellEnd"/>
+      <w:r>
+        <w:t xml:space="preserve"> iria </w:t>
+      </w:r>
+      <w:r>
+        <w:lastRenderedPageBreak/>
+        <w:t xml:space="preserve">apontar para o site em produção, entendeu? Então esse daqui é a forma que a gente faz. Agora, eu já tenho aqui o a variável definida aqui e que eu já tenho aqui o Cypress olha, está vendo? Já definido aqui o </w:t>
+      </w:r>
+      <w:proofErr w:type="spellStart"/>
+      <w:r>
+        <w:t>CyVisit</w:t>
+      </w:r>
+      <w:proofErr w:type="spellEnd"/>
+      <w:r>
+        <w:t xml:space="preserve"> já definido com o </w:t>
+      </w:r>
+      <w:proofErr w:type="spellStart"/>
+      <w:r>
+        <w:t>CypressEnf</w:t>
+      </w:r>
+      <w:proofErr w:type="spellEnd"/>
+      <w:r>
+        <w:t xml:space="preserve">, então agora não está salvo ainda, eu vou salvar. E agora eu vou vir aqui, só pra você ver quais são os comandos que eu rodar, vou vir aqui e vou rodar então o comando </w:t>
+      </w:r>
+      <w:proofErr w:type="spellStart"/>
+      <w:r>
+        <w:t>test</w:t>
+      </w:r>
+      <w:proofErr w:type="spellEnd"/>
+      <w:r>
+        <w:t xml:space="preserve">, olha. </w:t>
+      </w:r>
+      <w:proofErr w:type="spellStart"/>
+      <w:r>
+        <w:t>Npm</w:t>
+      </w:r>
+      <w:proofErr w:type="spellEnd"/>
+      <w:r>
+        <w:t xml:space="preserve"> test. Aqui ele vai rodar com o local host, então o que a gente espera aqui. Esse aqui é só pra você ver quais são os comandos que eu rodar. Vou vir aqui e vou rodar então o comando </w:t>
+      </w:r>
+      <w:proofErr w:type="spellStart"/>
+      <w:r>
+        <w:t>test</w:t>
+      </w:r>
+      <w:proofErr w:type="spellEnd"/>
+      <w:r>
+        <w:t xml:space="preserve">, olha. </w:t>
+      </w:r>
+      <w:proofErr w:type="spellStart"/>
+      <w:r>
+        <w:t>Npm</w:t>
+      </w:r>
+      <w:proofErr w:type="spellEnd"/>
+      <w:r>
+        <w:t xml:space="preserve"> test. Aqui ele vai rodar com o local host, então o que a gente espera aqui é que ele tenha sucesso, né? Que ele rode porque ele está ele vai fazer o </w:t>
+      </w:r>
+      <w:proofErr w:type="spellStart"/>
+      <w:r>
+        <w:t>visit</w:t>
+      </w:r>
+      <w:proofErr w:type="spellEnd"/>
+      <w:r>
+        <w:t xml:space="preserve"> na página que existe, é o </w:t>
+      </w:r>
+      <w:proofErr w:type="spellStart"/>
+      <w:r>
+        <w:t>localhost</w:t>
+      </w:r>
+      <w:proofErr w:type="spellEnd"/>
+      <w:r>
+        <w:t xml:space="preserve"> 4000, certo? Agora, se eu for chamar o teste q a ou teste </w:t>
+      </w:r>
+      <w:proofErr w:type="spellStart"/>
+      <w:r>
+        <w:t>prod</w:t>
+      </w:r>
+      <w:proofErr w:type="spellEnd"/>
+      <w:r>
+        <w:t xml:space="preserve">, eu vou chamar o teste </w:t>
+      </w:r>
+      <w:proofErr w:type="spellStart"/>
+      <w:r>
+        <w:t>prod</w:t>
+      </w:r>
+      <w:proofErr w:type="spellEnd"/>
+      <w:r>
+        <w:t xml:space="preserve"> por exemplo, ele não tem que funcionar por quê? Porque ele está apontando lá pra </w:t>
+      </w:r>
+      <w:proofErr w:type="spellStart"/>
+      <w:r>
+        <w:t>Julio</w:t>
+      </w:r>
+      <w:proofErr w:type="spellEnd"/>
+      <w:r>
+        <w:t xml:space="preserve"> </w:t>
+      </w:r>
+      <w:proofErr w:type="spellStart"/>
+      <w:r>
+        <w:t>Delima</w:t>
+      </w:r>
+      <w:proofErr w:type="spellEnd"/>
+      <w:r>
+        <w:t xml:space="preserve"> ponto com ponto b r. Não tem nada de aplicação de banco lá. Aí eu venho aqui e coloco, olha, </w:t>
+      </w:r>
+      <w:proofErr w:type="spellStart"/>
+      <w:r>
+        <w:t>npm</w:t>
+      </w:r>
+      <w:proofErr w:type="spellEnd"/>
+      <w:r>
+        <w:t xml:space="preserve"> </w:t>
+      </w:r>
+      <w:proofErr w:type="spellStart"/>
+      <w:r>
+        <w:t>run</w:t>
+      </w:r>
+      <w:proofErr w:type="spellEnd"/>
+      <w:r>
+        <w:t xml:space="preserve">, e aí eu coloco </w:t>
+      </w:r>
+      <w:proofErr w:type="spellStart"/>
+      <w:r>
+        <w:t>test</w:t>
+      </w:r>
+      <w:proofErr w:type="spellEnd"/>
+      <w:r>
+        <w:t xml:space="preserve"> traço prod. Você vai ver, que ele está rodando aqui apontando pra w </w:t>
+      </w:r>
+      <w:proofErr w:type="spellStart"/>
+      <w:r>
+        <w:t>w</w:t>
+      </w:r>
+      <w:proofErr w:type="spellEnd"/>
+      <w:r>
+        <w:t xml:space="preserve"> </w:t>
+      </w:r>
+      <w:proofErr w:type="spellStart"/>
+      <w:r>
+        <w:t>w</w:t>
+      </w:r>
+      <w:proofErr w:type="spellEnd"/>
+      <w:r>
+        <w:t xml:space="preserve"> </w:t>
+      </w:r>
+      <w:proofErr w:type="spellStart"/>
+      <w:r>
+        <w:t>punto</w:t>
+      </w:r>
+      <w:proofErr w:type="spellEnd"/>
+      <w:r>
+        <w:t xml:space="preserve"> </w:t>
+      </w:r>
+      <w:proofErr w:type="spellStart"/>
+      <w:r>
+        <w:t>julie</w:t>
+      </w:r>
+      <w:proofErr w:type="spellEnd"/>
+      <w:r>
+        <w:t xml:space="preserve"> de lima Ponto com Ponto B R. Olha, está vendo? Não vai dar certo. Quando ele fazer o </w:t>
+      </w:r>
+      <w:proofErr w:type="spellStart"/>
+      <w:r>
+        <w:t>visit</w:t>
+      </w:r>
+      <w:proofErr w:type="spellEnd"/>
+      <w:r>
+        <w:t xml:space="preserve">, ele vai visitar, tá? Mas aí quando ele tentar executar o teste não vai funcionar, então aqui esse teste tem que falhar, né? Vamos aguardar aqui pra que você possa ver. E aí a gente vai poder ver lá nos nossos </w:t>
+      </w:r>
+      <w:proofErr w:type="spellStart"/>
+      <w:r>
+        <w:t>screenshots</w:t>
+      </w:r>
+      <w:proofErr w:type="spellEnd"/>
+      <w:r>
+        <w:t xml:space="preserve">, né? Porque você já sabe, lá no nosso login, a gente colocou aqui </w:t>
+      </w:r>
+      <w:proofErr w:type="spellStart"/>
+      <w:r>
+        <w:t>screenshot</w:t>
+      </w:r>
+      <w:proofErr w:type="spellEnd"/>
+      <w:r>
+        <w:t xml:space="preserve"> logo depois de fazer o </w:t>
+      </w:r>
+      <w:proofErr w:type="spellStart"/>
+      <w:r>
+        <w:t>visit</w:t>
+      </w:r>
+      <w:proofErr w:type="spellEnd"/>
+      <w:r>
+        <w:t xml:space="preserve">. Então, se essa questão do da variável de ambiente funcionou, a gente vai ver o site do julho aqui, né, depois desse </w:t>
+      </w:r>
+      <w:proofErr w:type="spellStart"/>
+      <w:r>
+        <w:t>desse</w:t>
+      </w:r>
+      <w:proofErr w:type="spellEnd"/>
+      <w:r>
+        <w:t xml:space="preserve"> </w:t>
+      </w:r>
+      <w:proofErr w:type="spellStart"/>
+      <w:r>
+        <w:t>visit</w:t>
+      </w:r>
+      <w:proofErr w:type="spellEnd"/>
+      <w:r>
+        <w:t xml:space="preserve">. Vamos ver, olha, já falhou o teste. Certo? Se a gente ver aqui no </w:t>
+      </w:r>
+      <w:proofErr w:type="spellStart"/>
+      <w:r>
+        <w:t>screenshot</w:t>
+      </w:r>
+      <w:proofErr w:type="spellEnd"/>
+      <w:r>
+        <w:t xml:space="preserve">, olha lá, olha. Após visitar a página. Tinha 1 foto gigantesca aqui da página inteira, né? Você olha lá. Está vendo? Ele abriu o site do </w:t>
+      </w:r>
+      <w:proofErr w:type="spellStart"/>
+      <w:r>
+        <w:t>Julio</w:t>
+      </w:r>
+      <w:proofErr w:type="spellEnd"/>
+      <w:r>
+        <w:t>, aqui que é nosso site da mentoria 10.0. Ok? Então, isso daqui é como você faz pra criar variáveis de ambiente. Você pode criar, como eu disse pra você, quantas você quiser, basta você separar por vírgula aqui, e aí lá dentro do seu do seu da sua aplicação você colocar, né? K.</w:t>
+      </w:r>
     </w:p>
     <w:p>
       <w:pPr>
@@ -11455,6 +12124,10 @@
     <w:p>
       <w:pPr>
         <w:spacing w:after="0"/>
+        <w:rPr>
+          <w:b/>
+          <w:bCs/>
+        </w:rPr>
       </w:pPr>
       <w:r>
         <w:rPr>
@@ -11477,6 +12150,18 @@
         </w:rPr>
         <w:t xml:space="preserve">. </w:t>
       </w:r>
+      <w:r>
+        <w:rPr>
+          <w:b/>
+          <w:bCs/>
+        </w:rPr>
+        <w:t>Utilizando Variáveis de Ambiente</w:t>
+      </w:r>
+    </w:p>
+    <w:p>
+      <w:pPr>
+        <w:spacing w:after="0"/>
+      </w:pPr>
     </w:p>
     <w:p>
       <w:pPr>
@@ -11531,7 +12216,6 @@
         <w:spacing w:after="0"/>
       </w:pPr>
       <w:r>
-        <w:lastRenderedPageBreak/>
         <w:pict w14:anchorId="3AE0A69E">
           <v:rect id="_x0000_i1040" style="width:0;height:1.5pt" o:bullet="t" o:hrstd="t" o:hr="t" fillcolor="#a0a0a0" stroked="f"/>
         </w:pict>

</xml_diff>

<commit_message>
# Configurando a Geração de Relatórios em HTML
Adicionando relatorio html Mochawesome

Relatórios: https://docs.cypress.io/app/plugins/plugins-list#code-coverage-&-reporting
</commit_message>
<xml_diff>
--- a/Módulo_6_Testando e Automatizando Testes em Aplicações Web/Módulo 6 - Audio.docx
+++ b/Módulo_6_Testando e Automatizando Testes em Aplicações Web/Módulo 6 - Audio.docx
@@ -7,13 +7,21 @@
         <w:pStyle w:val="Ttulo"/>
       </w:pPr>
       <w:r>
-        <w:t xml:space="preserve">Módulo 6 </w:t>
-      </w:r>
-      <w:r>
-        <w:t xml:space="preserve"> </w:t>
-      </w:r>
-      <w:r>
-        <w:t>- Testando e Automatizando Testes em Aplicações Web</w:t>
+        <w:t xml:space="preserve">Módulo </w:t>
+      </w:r>
+      <w:proofErr w:type="gramStart"/>
+      <w:r>
+        <w:t xml:space="preserve">6 </w:t>
+      </w:r>
+      <w:r>
+        <w:t xml:space="preserve"> </w:t>
+      </w:r>
+      <w:r>
+        <w:t>-</w:t>
+      </w:r>
+      <w:proofErr w:type="gramEnd"/>
+      <w:r>
+        <w:t xml:space="preserve"> Testando e Automatizando Testes em Aplicações Web</w:t>
       </w:r>
       <w:r>
         <w:t xml:space="preserve"> – Cypress</w:t>
@@ -443,10 +451,12 @@
         <w:t xml:space="preserve"> </w:t>
       </w:r>
       <w:proofErr w:type="spellStart"/>
+      <w:proofErr w:type="gramStart"/>
       <w:r>
         <w:t>julio.lima</w:t>
       </w:r>
       <w:proofErr w:type="spellEnd"/>
+      <w:proofErr w:type="gramEnd"/>
       <w:r>
         <w:t xml:space="preserve"> </w:t>
       </w:r>
@@ -470,10 +480,12 @@
         <w:t xml:space="preserve"> </w:t>
       </w:r>
       <w:proofErr w:type="spellStart"/>
+      <w:proofErr w:type="gramStart"/>
       <w:r>
         <w:t>junior.lima</w:t>
       </w:r>
       <w:proofErr w:type="spellEnd"/>
+      <w:proofErr w:type="gramEnd"/>
       <w:r>
         <w:t xml:space="preserve"> (</w:t>
       </w:r>
@@ -588,7 +600,15 @@
       </w:r>
       <w:proofErr w:type="spellEnd"/>
       <w:r>
-        <w:t xml:space="preserve">, que está, então fornecendo informações, capturando informações que foram informadas por você, testador ao front </w:t>
+        <w:t xml:space="preserve">, que </w:t>
+      </w:r>
+      <w:proofErr w:type="gramStart"/>
+      <w:r>
+        <w:t>está, então fornecendo</w:t>
+      </w:r>
+      <w:proofErr w:type="gramEnd"/>
+      <w:r>
+        <w:t xml:space="preserve"> informações, capturando informações que foram informadas por você, testador ao front </w:t>
       </w:r>
       <w:proofErr w:type="spellStart"/>
       <w:r>
@@ -792,7 +812,15 @@
       </w:r>
       <w:proofErr w:type="spellEnd"/>
       <w:r>
-        <w:t xml:space="preserve"> pessoas, por exemplo, as pessoas que não conseguem enxergar, por exemplo, não </w:t>
+        <w:t xml:space="preserve"> pessoas, por exemplo, as pessoas que não conseguem enxergar, por exemplo, </w:t>
+      </w:r>
+      <w:proofErr w:type="gramStart"/>
+      <w:r>
+        <w:t>não</w:t>
+      </w:r>
+      <w:proofErr w:type="gramEnd"/>
+      <w:r>
+        <w:t xml:space="preserve"> </w:t>
       </w:r>
       <w:proofErr w:type="spellStart"/>
       <w:r>
@@ -900,12 +928,20 @@
       </w:r>
       <w:proofErr w:type="spellEnd"/>
       <w:r>
-        <w:t xml:space="preserve">, e conseguir então identificar problemas que estão relacionados à acessibilidade com base no site do banco, que é a aplicação que nós temos e que nós estamos utilizando aqui durante as nossas aulas, beleza? Vamos nessa? Legal. O que vocês veem aqui é o banco, a gente está na tela de realizar transferência, vocês já conhecem aqui essa tela, então está </w:t>
-      </w:r>
-      <w:proofErr w:type="spellStart"/>
+        <w:t xml:space="preserve">, e conseguir então identificar problemas que estão relacionados à acessibilidade com base no site do banco, que é a aplicação que nós temos e que nós estamos utilizando aqui durante as nossas aulas, beleza? Vamos nessa? Legal. O que vocês veem aqui é o banco, a gente está na tela de realizar transferência, vocês já conhecem aqui essa tela, então </w:t>
+      </w:r>
+      <w:proofErr w:type="gramStart"/>
       <w:r>
         <w:t>está</w:t>
       </w:r>
+      <w:proofErr w:type="gramEnd"/>
+      <w:r>
+        <w:t xml:space="preserve"> </w:t>
+      </w:r>
+      <w:proofErr w:type="spellStart"/>
+      <w:r>
+        <w:t>está</w:t>
+      </w:r>
       <w:proofErr w:type="spellEnd"/>
       <w:r>
         <w:t xml:space="preserve"> bem simples, né? Beleza, o que a gente vai fazer aqui é o seguinte, a gente vai vir aqui olha, esses pontinhos, e você vai selecionar aqui olha, a opção extensões, visitar Chrome Web Store, ou visitar a loja web do Chrome, tá? Essa Chrome Web Store é lugar onde você pode baixar aqui extensões pra que você possa utilizar dentro do Google Chrome, beleza? Então o que que você vai fazer? Você vai vim aqui em cima na barra de pesquisas e vai digitar a x e, </w:t>
@@ -980,7 +1016,15 @@
       </w:r>
       <w:proofErr w:type="spellEnd"/>
       <w:r>
-        <w:t xml:space="preserve"> barrinha que vai ser aberta, ok? Pode ser que no seu computador essa barrinha esteja do lado direito ou do lado esquerdo. Júlio, como que eu faço pra ela ficar embaixo assim como está sua? Você clica nesses 3 pontinhos aqui, está vendo? E aí você selecionar essa opção, que é quadrado com retângulo embaixo, é essa opção que eu estou, tá? Se você tiver assim olha, com a ela pro lado, vai estar desse jeito, né? Clica aqui nos 3 pontinhos, coloca nessa daqui, ela vai ficar lá embaixo, ok? Próximo passo, você vai clicar aqui olha, nessas 2 flechinhas, ou se você estiver vendo aqui nessa fileira já, você vai clicar em </w:t>
+        <w:t xml:space="preserve"> barrinha que vai ser aberta, ok? Pode ser que no seu computador essa barrinha esteja do lado direito ou do lado esquerdo. Júlio, como que eu faço pra ela ficar embaixo assim como está sua? Você clica nesses 3 pontinhos aqui, está vendo? E aí você selecionar essa opção, que é quadrado com retângulo embaixo, é essa opção que eu estou, tá? Se você tiver assim olha, com a ela pro lado, vai estar desse jeito, né? Clica aqui nos 3 pontinhos, coloca nessa </w:t>
+      </w:r>
+      <w:proofErr w:type="gramStart"/>
+      <w:r>
+        <w:t>daqui, ela</w:t>
+      </w:r>
+      <w:proofErr w:type="gramEnd"/>
+      <w:r>
+        <w:t xml:space="preserve"> vai ficar lá embaixo, ok? Próximo passo, você vai clicar aqui olha, nessas 2 flechinhas, ou se você estiver vendo aqui nessa fileira já, você vai clicar em </w:t>
       </w:r>
       <w:proofErr w:type="spellStart"/>
       <w:r>
@@ -1176,12 +1220,20 @@
       </w:r>
       <w:proofErr w:type="spellEnd"/>
       <w:r>
-        <w:t xml:space="preserve"> descrever o que é do que se trata aquele determinado elemento. Só de ler isso daqui você já fala, pô, legal, já estou aprendendo monte de coisa, mas não é só isso, porque ele também te traz isso olha, você clica aqui, ele te traz aqui 1 descrição mais detalhada do que está acontecendo, olha que legal, ele fala olha, garanta que o contraste entre a cor da fonte e o background atenda </w:t>
-      </w:r>
-      <w:proofErr w:type="spellStart"/>
+        <w:t xml:space="preserve"> descrever o que é do que se trata aquele determinado elemento. Só de ler isso daqui você já fala, pô, legal, já estou aprendendo monte de coisa, mas não é só isso, porque ele também te traz isso olha, você clica aqui, ele te traz aqui 1 descrição mais detalhada do que está acontecendo, olha que legal, ele fala olha, garanta que o contraste entre a cor da fonte e o background </w:t>
+      </w:r>
+      <w:proofErr w:type="gramStart"/>
       <w:r>
         <w:t>atenda</w:t>
       </w:r>
+      <w:proofErr w:type="gramEnd"/>
+      <w:r>
+        <w:t xml:space="preserve"> </w:t>
+      </w:r>
+      <w:proofErr w:type="spellStart"/>
+      <w:r>
+        <w:t>atenda</w:t>
+      </w:r>
       <w:proofErr w:type="spellEnd"/>
       <w:r>
         <w:t xml:space="preserve"> às recomendações do WCAG 2 2 </w:t>
@@ -1192,12 +1244,20 @@
       </w:r>
       <w:proofErr w:type="spellEnd"/>
       <w:r>
-        <w:t xml:space="preserve">, ok? AA. WCAG é grupo que cuida de definir quais são as regras relacionadas à acessibilidade, e eles têm classificações que vão de a até o AA. Então tem 3 definições, AA e AA. A significa que o site atende as características básicas, AA significa que ele já é o intermediário e AA significa que ele atingiu ali nível muito alto de acessibilidade, né. Então depende aí de quais são as características que o seu time, a sua empresa, o seu produto estão perseguindo, né. Se você está </w:t>
-      </w:r>
-      <w:proofErr w:type="spellStart"/>
+        <w:t xml:space="preserve">, ok? AA. WCAG é grupo que cuida de definir quais são as regras relacionadas à acessibilidade, e eles têm classificações que vão de a até o AA. Então tem 3 definições, AA e AA. A significa que o site atende as características básicas, AA significa que ele já é o intermediário e AA significa que ele atingiu ali nível muito alto de acessibilidade, né. Então depende aí de quais são as características que o seu time, a sua empresa, o seu produto estão perseguindo, né. Se você </w:t>
+      </w:r>
+      <w:proofErr w:type="gramStart"/>
       <w:r>
         <w:t>está</w:t>
       </w:r>
+      <w:proofErr w:type="gramEnd"/>
+      <w:r>
+        <w:t xml:space="preserve"> </w:t>
+      </w:r>
+      <w:proofErr w:type="spellStart"/>
+      <w:r>
+        <w:t>está</w:t>
+      </w:r>
       <w:proofErr w:type="spellEnd"/>
       <w:r>
         <w:t xml:space="preserve"> buscando nível A ou nível AA e assim por diante, tá. Então aqui ele descreve o que é que está acontecendo, ele está falando olha, tem ali uns itens que não têm o contraste suficiente. Aí ele fala, qual que é o elemento? Ele localizou de fato o elemento na tela, o elemento é o conta origem. Aí ele fala, e o elemento conta origem é </w:t>
@@ -1240,7 +1300,15 @@
       </w:r>
       <w:proofErr w:type="spellEnd"/>
       <w:r>
-        <w:t xml:space="preserve"> problema, vou descer aqui pouquinho, é aqui olha, está vendo olha? Essa letrinha cinza aqui não está com contraste suficiente, então tem pessoas que não vão conseguir enxergar isso, entendeu? Por isso que ele relatou aqui esse problema. E se você for andando pra casa, vai ver que muitos outros têm isso né, afinal olha, conta origem, conta destino, valor, token, todos esses carinhas que estão com letra cinza não são, não têm 1 boa sensibilidade, tá. E continua aqui, valor, token, está vendo? O botão fazer transferência e o botão próximo, todos eles têm aí problemas relacionados a contraste. Se você vem aqui mais pra baixo e clica aqui olha, </w:t>
+        <w:t xml:space="preserve"> problema, vou descer aqui pouquinho, é aqui olha, está vendo olha? Essa letrinha cinza aqui não está com contraste suficiente, então tem pessoas que não vão conseguir enxergar isso, entendeu? Por isso que ele relatou aqui esse problema. E se você for andando pra casa, vai ver que muitos outros têm isso né, afinal olha, conta origem, conta destino, valor, token, </w:t>
+      </w:r>
+      <w:proofErr w:type="gramStart"/>
+      <w:r>
+        <w:t>todos esses carinhas que estão com letra cinza</w:t>
+      </w:r>
+      <w:proofErr w:type="gramEnd"/>
+      <w:r>
+        <w:t xml:space="preserve"> não são, não têm 1 boa sensibilidade, tá. E continua aqui, valor, token, está vendo? O botão fazer transferência e o botão próximo, todos eles têm aí problemas relacionados a contraste. Se você vem aqui mais pra baixo e clica aqui olha, </w:t>
       </w:r>
       <w:proofErr w:type="spellStart"/>
       <w:r>
@@ -1300,7 +1368,15 @@
       </w:r>
       <w:proofErr w:type="spellEnd"/>
       <w:r>
-        <w:t xml:space="preserve">, valor tem valor e assim sucessivamente, está bom? Mas tem alguns aqui que não tem. Quais? Ele está falando olha, o elemento que não tem é esse daqui, esse input aqui de </w:t>
+        <w:t xml:space="preserve">, valor tem valor e assim sucessivamente, está bom? Mas tem alguns aqui que não tem. Quais? Ele está falando olha, o elemento que não tem é esse </w:t>
+      </w:r>
+      <w:proofErr w:type="gramStart"/>
+      <w:r>
+        <w:t>daqui, esse</w:t>
+      </w:r>
+      <w:proofErr w:type="gramEnd"/>
+      <w:r>
+        <w:t xml:space="preserve"> input aqui de </w:t>
       </w:r>
       <w:proofErr w:type="spellStart"/>
       <w:r>
@@ -1841,7 +1917,15 @@
       </w:r>
       <w:proofErr w:type="spellEnd"/>
       <w:r>
-        <w:t xml:space="preserve">, os recursos que bloqueiam a renderização. E se a gente fizer isso, de 0.6 segundos, tá, a gente pode pular pra 0.6 menos 350, que vai ser o total de 0 ponto 250. O que seria muito bom pro nosso site, afinal, esse daqui é algo que está vermelho, Está usando muitos milissegundos. O desenvolvedor fala, ah, mas me fala mais sobre isso. Você clica aqui nessa flechinha, e aqui ele traz mais informações, né, relacionadas ao que está acontecendo, mostra aqui link pra o que você pode fazer, traz aqui algumas informações relacionadas a isso que está sendo carregado e assim por diante, certo? Ah, você pode </w:t>
+        <w:t xml:space="preserve">, os recursos que bloqueiam a renderização. E se a gente fizer isso, de 0.6 segundos, tá, a gente pode pular pra 0.6 menos 350, que vai ser o total de 0 ponto 250. O que seria muito bom pro nosso site, afinal, esse daqui é algo que está vermelho, </w:t>
+      </w:r>
+      <w:proofErr w:type="gramStart"/>
+      <w:r>
+        <w:t>Está</w:t>
+      </w:r>
+      <w:proofErr w:type="gramEnd"/>
+      <w:r>
+        <w:t xml:space="preserve"> usando muitos milissegundos. O desenvolvedor fala, ah, mas me fala mais sobre isso. Você clica aqui nessa flechinha, e aqui ele traz mais informações, né, relacionadas ao que está acontecendo, mostra aqui link pra o que você pode fazer, traz aqui algumas informações relacionadas a isso que está sendo carregado e assim por diante, certo? Ah, você pode </w:t>
       </w:r>
       <w:proofErr w:type="spellStart"/>
       <w:r>
@@ -2054,13 +2138,13 @@
       </w:r>
       <w:proofErr w:type="spellEnd"/>
       <w:r>
-        <w:t xml:space="preserve"> sua mesa 1 televisão de muitas polegadas e abre os sites nesse tipo de tela. E o que acontece com o seu site? Ele vai se adaptando a cada desses dessas dimensões de telas, tá, ou pelo menos, ele precisaria se adaptar. Eu estou falando aqui sobre conceito de responsividade, você já ouviu falar sobre isso? Significa que o seu site, independente de qual seja o tamanho da tela, ele vai se reajustar, mas não é simplesmente pegar aquele site que era desse tamanho e apertar </w:t>
-      </w:r>
-      <w:proofErr w:type="spellStart"/>
+        <w:t xml:space="preserve"> sua mesa 1 televisão de muitas polegadas e abre os sites nesse tipo de tela. E o que acontece com o seu site? Ele vai se adaptando a cada desses dessas dimensões de telas, tá, ou pelo menos, ele precisaria se adaptar. Eu estou falando aqui sobre conceito de responsividade, você já ouviu falar sobre isso? Significa que o seu site, independente de qual seja o tamanho da tela, ele vai se reajustar, mas não é simplesmente pegar aquele site que era desse tamanho e </w:t>
+      </w:r>
+      <w:proofErr w:type="gramStart"/>
       <w:r>
         <w:t>apertar</w:t>
       </w:r>
-      <w:proofErr w:type="spellEnd"/>
+      <w:proofErr w:type="gramEnd"/>
       <w:r>
         <w:t xml:space="preserve"> </w:t>
       </w:r>
@@ -2070,11 +2154,27 @@
       </w:r>
       <w:proofErr w:type="spellEnd"/>
       <w:r>
+        <w:t xml:space="preserve"> </w:t>
+      </w:r>
+      <w:proofErr w:type="spellStart"/>
+      <w:r>
+        <w:t>apertar</w:t>
+      </w:r>
+      <w:proofErr w:type="spellEnd"/>
+      <w:r>
         <w:t xml:space="preserve"> até que as coisas fiquem 1 em cima das outras todas embaralhadas, não. É ele realmente conseguir identificar que existe 1 dimensão de tamanho de tela menor, e ele então reposicionar os elementos elegantemente pra fazer com que o usuário tenha 1 melhor </w:t>
       </w:r>
       <w:r>
         <w:lastRenderedPageBreak/>
-        <w:t xml:space="preserve">experiência. É disso que eu estou falando quando falo sobre responsividade. Responsividade não é 1 coisa que vem por padrão, o desenvolvedor precisa habilitar esse recurso. Em alguns momentos, ele precisa de construir esse recurso. Por exemplo, há anos atrás, na 1º vez que eu ouvi falar sobre responsividade, o que eu tinha que fazer era que eu, Júlio, programador, tinha que ir lá e criar programação específica para fazer com que cada dos elementos se reajustassem, se reorganizassem dependendo de qual fosse o tamanho da tela. Hoje em dia, muitos frameworks já trazem esse tipo de </w:t>
+        <w:t xml:space="preserve">experiência. É disso que eu estou falando quando falo sobre responsividade. Responsividade não é 1 coisa que vem por padrão, o desenvolvedor precisa habilitar esse recurso. Em alguns momentos, ele precisa de construir esse recurso. Por exemplo, há anos atrás, na 1º vez que eu ouvi falar sobre responsividade, o que eu tinha que fazer era que eu, Júlio, programador, tinha que ir lá e criar programação específica para fazer com que </w:t>
+      </w:r>
+      <w:proofErr w:type="gramStart"/>
+      <w:r>
+        <w:t>cada dos elementos se reajustassem</w:t>
+      </w:r>
+      <w:proofErr w:type="gramEnd"/>
+      <w:r>
+        <w:t xml:space="preserve">, se reorganizassem dependendo de qual fosse o tamanho da tela. Hoje em dia, muitos frameworks já trazem esse tipo de </w:t>
       </w:r>
       <w:proofErr w:type="spellStart"/>
       <w:r>
@@ -2082,7 +2182,15 @@
       </w:r>
       <w:proofErr w:type="spellEnd"/>
       <w:r>
-        <w:t xml:space="preserve"> características já por padrão, mas o desenvolvedor tem que escolher o framework, e muitas vezes ele tem que configurar esse framework também, entendeu? E de toda forma, o que você vai precisar fazer já no seu próximo passo que depois que você terminar de assistir essa aula, é conversar com os desenvolvedores da empresa onde você trabalha, ou se você ainda não trabalha e está buscando 1º oportunidade, é você então explorar essa atividade, essa característica do site pra saber se o site é ou não responsivo. Bacana, né? Agora eu quero mostrar aqui pra vocês nessa aula pouco mais sobre essa questão de responsividade, e mostrar pra vocês 1 ferramenta que tem dentro do próprio Google Chrome que vai ajudar você a conseguir então testar a responsividade de 1 aplicação web. Vamos lá. Bem, esse daqui é o banco, e desde quando a gente começou aqui os nossos encontros, você está vendo o banco desse jeitinho aqui. Por quê? Porque eu estou oferecendo ele pra </w:t>
+        <w:t xml:space="preserve"> características já por padrão, mas o desenvolvedor tem que escolher o framework, e muitas vezes ele tem que configurar esse framework também, entendeu? E de toda forma, o que você vai precisar fazer já no seu próximo passo que depois que você terminar de assistir essa aula, é conversar com os desenvolvedores da empresa onde você trabalha, ou se você ainda não trabalha e está buscando 1º oportunidade, é você então explorar essa atividade, essa característica do site pra saber se o site é ou não responsivo. Bacana, né? Agora eu quero mostrar aqui pra vocês nessa aula pouco mais sobre essa questão de responsividade, e mostrar pra vocês 1 ferramenta que tem dentro do próprio Google Chrome que vai ajudar você a conseguir então testar a responsividade de 1 aplicação web. Vamos lá. Bem, esse daqui é o banco, e desde quando a gente começou aqui os nossos encontros, você está vendo o banco desse jeitinho aqui. Por quê? Porque eu estou </w:t>
+      </w:r>
+      <w:proofErr w:type="gramStart"/>
+      <w:r>
+        <w:t>oferecendo ele</w:t>
+      </w:r>
+      <w:proofErr w:type="gramEnd"/>
+      <w:r>
+        <w:t xml:space="preserve"> pra </w:t>
       </w:r>
       <w:proofErr w:type="spellStart"/>
       <w:r>
@@ -2098,7 +2206,15 @@
       </w:r>
       <w:proofErr w:type="spellEnd"/>
       <w:r>
-        <w:t xml:space="preserve"> vocês em formato quadrado. E ele está aparecendo assim nesse formato quadrado porque foi a forma com que eu escolhi aqui de layout pra gente fazer os nossos encontros, certo? No entanto, a forma a forma com que o banco está sendo apresentado aqui pra vocês é como se eles tivessem algum dispositivo com a tela menor, como por exemplo iPad. E eu sei disso por quê? Porque a logo do banco ela geralmente está à esquerda, mas, quando a gente tem tamanho de tamanho de a dimensão de tela, como estamos vendo aqui agora, foi programado pra que o a logo do banco ficasse ao centro, e é por isso que você vê ela dessa forma, ok? Se a gente fosse expandir essa </w:t>
+        <w:t xml:space="preserve"> vocês em formato quadrado. E ele está aparecendo assim nesse formato quadrado porque foi a forma com que eu escolhi aqui de layout pra gente fazer os nossos encontros, certo? No entanto, a forma a forma com que o banco está sendo apresentado aqui pra vocês é como se eles tivessem algum dispositivo com a tela menor, como por exemplo iPad. E eu sei disso por quê? Porque a logo do banco ela geralmente está à esquerda, mas, quando a gente tem tamanho de tamanho de a dimensão de tela, como estamos vendo aqui agora, foi programado pra que o a logo do banco ficasse ao centro, e é por isso que você </w:t>
+      </w:r>
+      <w:proofErr w:type="gramStart"/>
+      <w:r>
+        <w:t>vê ela</w:t>
+      </w:r>
+      <w:proofErr w:type="gramEnd"/>
+      <w:r>
+        <w:t xml:space="preserve"> dessa forma, ok? Se a gente fosse expandir essa </w:t>
       </w:r>
       <w:proofErr w:type="spellStart"/>
       <w:r>
@@ -2106,7 +2222,15 @@
       </w:r>
       <w:proofErr w:type="spellEnd"/>
       <w:r>
-        <w:t xml:space="preserve"> tela aqui, definitivamente você veria a logo do banco do lado esquerdo, ok? Bem, é necessário que a gente seja capaz de conseguir testar isso, e quando a gente fala de </w:t>
+        <w:t xml:space="preserve"> tela aqui, definitivamente você veria a logo do banco do lado esquerdo, ok? Bem, é necessário que a gente seja </w:t>
+      </w:r>
+      <w:proofErr w:type="gramStart"/>
+      <w:r>
+        <w:t>capaz</w:t>
+      </w:r>
+      <w:proofErr w:type="gramEnd"/>
+      <w:r>
+        <w:t xml:space="preserve"> de conseguir testar isso, e quando a gente fala de </w:t>
       </w:r>
       <w:proofErr w:type="spellStart"/>
       <w:r>
@@ -2178,7 +2302,23 @@
       </w:r>
       <w:proofErr w:type="spellEnd"/>
       <w:r>
-        <w:t xml:space="preserve">, que pra mim é muito mais fácil, está bom? Você decida qual é mais fácil pra você, tem gente que gosta de, você vai ter aqui em, você também pode. Olha, eu quero testar agora com a largura 2000, agora eu quero testar com a largura 1000 e ver como é que a aplicação se comporta naquela </w:t>
+        <w:t xml:space="preserve">, que pra mim é muito mais fácil, está bom? Você decida qual é mais fácil pra você, tem gente que gosta </w:t>
+      </w:r>
+      <w:proofErr w:type="gramStart"/>
+      <w:r>
+        <w:t>de, você</w:t>
+      </w:r>
+      <w:proofErr w:type="gramEnd"/>
+      <w:r>
+        <w:t xml:space="preserve"> vai ter aqui </w:t>
+      </w:r>
+      <w:proofErr w:type="gramStart"/>
+      <w:r>
+        <w:t>em, você</w:t>
+      </w:r>
+      <w:proofErr w:type="gramEnd"/>
+      <w:r>
+        <w:t xml:space="preserve"> também pode. Olha, eu quero testar agora com a largura 2000, agora eu quero testar com a largura 1000 e ver como é que a aplicação se comporta naquela </w:t>
       </w:r>
       <w:proofErr w:type="spellStart"/>
       <w:r>
@@ -2230,7 +2370,15 @@
       </w:r>
       <w:proofErr w:type="spellEnd"/>
       <w:r>
-        <w:t xml:space="preserve"> que pra mim é muito mais fácil, está bom? Você decida qual é mais fácil pra você. Tem gente que gosta de comando de teclado, se você for lá nos 3 pontinhos e em, desculpa, fiquei errado, nos 3 pontinhos aqui, não, aqui em cima, e escolher a opção More Tools, você vai ver que tem aqui comando de teclado pra que você possa executar e então ele vai abrir a tela pra você. Bom, cliquei aqui, que que você tem que fazer? Tem que vir aqui olha, e clicar nesse botãozinho aqui olha, computador, está vendo olha? Se eu clico aqui olha, o meu já estava clicado olha, está clicado aparece essa janela aqui em cima olha, </w:t>
+        <w:t xml:space="preserve"> que pra mim é muito mais fácil, está bom? Você decida qual é mais fácil pra você. Tem gente que gosta de comando de teclado, se você for lá nos 3 pontinhos e </w:t>
+      </w:r>
+      <w:proofErr w:type="gramStart"/>
+      <w:r>
+        <w:t>em, desculpa</w:t>
+      </w:r>
+      <w:proofErr w:type="gramEnd"/>
+      <w:r>
+        <w:t xml:space="preserve">, fiquei errado, nos 3 pontinhos aqui, não, aqui em cima, e escolher a opção More Tools, você vai ver que tem aqui comando de teclado pra que você possa executar e então ele vai abrir a tela pra você. Bom, cliquei aqui, que que você tem que fazer? Tem que vir aqui olha, e clicar nesse botãozinho aqui olha, computador, está vendo olha? Se eu clico aqui olha, o meu já estava clicado olha, está clicado aparece essa janela aqui em cima olha, </w:t>
       </w:r>
       <w:proofErr w:type="spellStart"/>
       <w:r>
@@ -2419,12 +2567,20 @@
       </w:r>
       <w:proofErr w:type="spellEnd"/>
       <w:r>
-        <w:t xml:space="preserve">. E raramente </w:t>
-      </w:r>
-      <w:proofErr w:type="spellStart"/>
+        <w:t xml:space="preserve">. E </w:t>
+      </w:r>
+      <w:proofErr w:type="gramStart"/>
       <w:r>
         <w:t>raramente</w:t>
       </w:r>
+      <w:proofErr w:type="gramEnd"/>
+      <w:r>
+        <w:t xml:space="preserve"> </w:t>
+      </w:r>
+      <w:proofErr w:type="spellStart"/>
+      <w:r>
+        <w:t>raramente</w:t>
+      </w:r>
       <w:proofErr w:type="spellEnd"/>
       <w:r>
         <w:t xml:space="preserve"> você tem algo no mercado que eles chamam de desenvolvedor full </w:t>
@@ -2531,7 +2687,15 @@
       </w:r>
       <w:proofErr w:type="spellEnd"/>
       <w:r>
-        <w:t xml:space="preserve">. Deixa eu te mostrar. Aqui está o site do </w:t>
+        <w:t xml:space="preserve">. </w:t>
+      </w:r>
+      <w:proofErr w:type="gramStart"/>
+      <w:r>
+        <w:t>Deixa eu</w:t>
+      </w:r>
+      <w:proofErr w:type="gramEnd"/>
+      <w:r>
+        <w:t xml:space="preserve"> te mostrar. Aqui está o site do </w:t>
       </w:r>
       <w:proofErr w:type="spellStart"/>
       <w:r>
@@ -2659,7 +2823,15 @@
       </w:r>
       <w:proofErr w:type="spellEnd"/>
       <w:r>
-        <w:t xml:space="preserve"> é isso daqui que você vê. 1 tela desse jeitinho aqui, aqui do lado esquerdo ela está como informação sobre o servidor, aqui no meio a gente ter algumas rotas, então se você clicar em rotas você vai ver isso aqui também, né, aqui não tem nada, e aqui do lado direito a gente vai ter algumas informações complementares, a rota que foi selecionada aqui. Você vai ver que aqui olha, nós temos o servidor e ele está com a porta 3000. Essa porta aqui é escolhida lá dentro do settings. Vou mostrar pra você como faz. Procura aí a </w:t>
+        <w:t xml:space="preserve"> é isso daqui que você vê. 1 tela desse jeitinho aqui, aqui do lado esquerdo ela está como informação sobre o servidor, aqui no meio a gente ter algumas rotas, então se você clicar em rotas você vai ver isso aqui também, né, aqui não tem nada, e aqui do lado direito a gente vai ter algumas informações complementares, a rota que foi selecionada aqui. Você vai ver que aqui olha, nós temos o servidor e ele está com a porta 3000. Essa porta aqui é escolhida lá </w:t>
+      </w:r>
+      <w:proofErr w:type="gramStart"/>
+      <w:r>
+        <w:t>dentro do settings</w:t>
+      </w:r>
+      <w:proofErr w:type="gramEnd"/>
+      <w:r>
+        <w:t xml:space="preserve">. Vou mostrar pra você como faz. Procura aí a </w:t>
       </w:r>
       <w:proofErr w:type="spellStart"/>
       <w:r>
@@ -2695,7 +2867,15 @@
       </w:r>
       <w:proofErr w:type="spellEnd"/>
       <w:r>
-        <w:t xml:space="preserve">? Deixa eu te mostrar. Eu vou vir aqui olha, na minha aplicação </w:t>
+        <w:t xml:space="preserve">? </w:t>
+      </w:r>
+      <w:proofErr w:type="gramStart"/>
+      <w:r>
+        <w:t>Deixa eu</w:t>
+      </w:r>
+      <w:proofErr w:type="gramEnd"/>
+      <w:r>
+        <w:t xml:space="preserve"> te mostrar. Eu vou vir aqui olha, na minha aplicação </w:t>
       </w:r>
       <w:proofErr w:type="spellStart"/>
       <w:r>
@@ -2727,7 +2907,15 @@
       </w:r>
       <w:proofErr w:type="spellEnd"/>
       <w:r>
-        <w:t xml:space="preserve"> barra login. Esse barra b f </w:t>
+        <w:t xml:space="preserve"> barra login. </w:t>
+      </w:r>
+      <w:proofErr w:type="gramStart"/>
+      <w:r>
+        <w:t>Esse barra</w:t>
+      </w:r>
+      <w:proofErr w:type="gramEnd"/>
+      <w:r>
+        <w:t xml:space="preserve"> b f </w:t>
       </w:r>
       <w:proofErr w:type="spellStart"/>
       <w:r>
@@ -2759,12 +2947,28 @@
       </w:r>
       <w:proofErr w:type="spellEnd"/>
       <w:r>
-        <w:t xml:space="preserve"> para post, daqui ele está fazendo 1 requisição via post pra lugar. Qual lugar? Pra API que a gente tem no barra login. Olha só que interessante hein? Então aqui olha, isso daqui é API base é </w:t>
-      </w:r>
-      <w:proofErr w:type="spellStart"/>
+        <w:t xml:space="preserve"> para post, daqui ele está fazendo 1 requisição via post pra lugar. Qual lugar? Pra API que a gente tem </w:t>
+      </w:r>
+      <w:proofErr w:type="gramStart"/>
+      <w:r>
+        <w:t>no barra</w:t>
+      </w:r>
+      <w:proofErr w:type="gramEnd"/>
+      <w:r>
+        <w:t xml:space="preserve"> login. Olha só que interessante hein? Então aqui olha, isso daqui é API base </w:t>
+      </w:r>
+      <w:proofErr w:type="gramStart"/>
       <w:r>
         <w:t>é</w:t>
       </w:r>
+      <w:proofErr w:type="gramEnd"/>
+      <w:r>
+        <w:t xml:space="preserve"> </w:t>
+      </w:r>
+      <w:proofErr w:type="spellStart"/>
+      <w:r>
+        <w:t>é</w:t>
+      </w:r>
       <w:proofErr w:type="spellEnd"/>
       <w:r>
         <w:t xml:space="preserve"> valor que está vindo de arquivo de configurações. Vou mostrar pra você olha, API base URL, clica aqui no files, vem aqui olha, em ponto </w:t>
@@ -2799,7 +3003,15 @@
       </w:r>
       <w:proofErr w:type="spellEnd"/>
       <w:r>
-        <w:t xml:space="preserve"> que é esse daqui, Ele, eu vou permitir que o usuário digite alguma coisa aqui, </w:t>
+        <w:t xml:space="preserve"> que é esse </w:t>
+      </w:r>
+      <w:proofErr w:type="gramStart"/>
+      <w:r>
+        <w:t>daqui, Ele</w:t>
+      </w:r>
+      <w:proofErr w:type="gramEnd"/>
+      <w:r>
+        <w:t xml:space="preserve">, eu vou permitir que o usuário digite alguma coisa aqui, </w:t>
       </w:r>
       <w:proofErr w:type="spellStart"/>
       <w:r>
@@ -2879,7 +3091,15 @@
       </w:r>
       <w:proofErr w:type="spellEnd"/>
       <w:r>
-        <w:t xml:space="preserve"> terminou a tela, está bonitinho aqui. Ele já criou lá </w:t>
+        <w:t xml:space="preserve"> terminou a tela, está bonitinho aqui. Ele já criou </w:t>
+      </w:r>
+      <w:proofErr w:type="gramStart"/>
+      <w:r>
+        <w:t>lá</w:t>
+      </w:r>
+      <w:proofErr w:type="gramEnd"/>
+      <w:r>
+        <w:t xml:space="preserve"> </w:t>
       </w:r>
       <w:proofErr w:type="spellStart"/>
       <w:r>
@@ -2971,7 +3191,15 @@
       </w:r>
       <w:proofErr w:type="spellEnd"/>
       <w:r>
-        <w:t xml:space="preserve">. Se a gente tem qualquer tipo de erro aqui, por exemplo, não veio o 1 1 resposta de sucesso, resposta de sucesso aqui está na casa dos 200, então, isso daqui deveria vir com o status post 200, né. Vamos dizer que não veio, veio qualquer outro, vai cair aqui no </w:t>
+        <w:t xml:space="preserve">. Se a gente tem qualquer tipo de erro aqui, por exemplo, não veio </w:t>
+      </w:r>
+      <w:proofErr w:type="gramStart"/>
+      <w:r>
+        <w:t>o 1 1 resposta</w:t>
+      </w:r>
+      <w:proofErr w:type="gramEnd"/>
+      <w:r>
+        <w:t xml:space="preserve"> de sucesso, resposta de sucesso aqui está na casa dos 200, então, isso daqui deveria vir com o status post 200, né. Vamos dizer que não veio, veio qualquer outro, vai cair aqui no </w:t>
       </w:r>
       <w:proofErr w:type="spellStart"/>
       <w:r>
@@ -3163,7 +3391,15 @@
         <w:spacing w:after="0"/>
       </w:pPr>
       <w:r>
-        <w:t xml:space="preserve">A gente vai falar agora sobre alguns dos erros mais comuns quando se fala em aplicações web. E por que isso é importante pra você? Porque quando você for testar 1 aplicação web, você vai dar 1 olhadinha nessa aula e vai conseguir, então, tentar procurar por defeitos similares lá na aplicação que você estiver testando. Bacana, né? Vamos lá então. A gente vai começar aqui 1º pelo nosso erro mais comum aqui, número Esse erro mais comum número </w:t>
+        <w:t xml:space="preserve">A gente vai falar agora sobre alguns dos erros mais comuns quando se fala em aplicações web. E por que isso é importante pra você? Porque quando você for testar 1 aplicação web, você vai dar 1 olhadinha nessa aula e vai conseguir, então, tentar procurar por defeitos similares lá na aplicação que você estiver testando. Bacana, né? Vamos lá então. A gente vai começar aqui 1º pelo nosso erro mais comum aqui, </w:t>
+      </w:r>
+      <w:proofErr w:type="gramStart"/>
+      <w:r>
+        <w:t>número Esse</w:t>
+      </w:r>
+      <w:proofErr w:type="gramEnd"/>
+      <w:r>
+        <w:t xml:space="preserve"> erro mais comum número </w:t>
       </w:r>
       <w:proofErr w:type="spellStart"/>
       <w:r>
@@ -3183,7 +3419,15 @@
       </w:r>
       <w:r>
         <w:lastRenderedPageBreak/>
-        <w:t xml:space="preserve">vendo de, formulário de cadastro aceita e salva </w:t>
+        <w:t xml:space="preserve">vendo </w:t>
+      </w:r>
+      <w:proofErr w:type="gramStart"/>
+      <w:r>
+        <w:t>de, formulário</w:t>
+      </w:r>
+      <w:proofErr w:type="gramEnd"/>
+      <w:r>
+        <w:t xml:space="preserve"> de cadastro aceita e salva </w:t>
       </w:r>
       <w:proofErr w:type="spellStart"/>
       <w:r>
@@ -3199,12 +3443,20 @@
       </w:r>
       <w:proofErr w:type="spellEnd"/>
       <w:r>
-        <w:t xml:space="preserve"> arroba </w:t>
-      </w:r>
-      <w:proofErr w:type="spellStart"/>
+        <w:t xml:space="preserve"> </w:t>
+      </w:r>
+      <w:proofErr w:type="gramStart"/>
       <w:r>
         <w:t>arroba</w:t>
       </w:r>
+      <w:proofErr w:type="gramEnd"/>
+      <w:r>
+        <w:t xml:space="preserve"> </w:t>
+      </w:r>
+      <w:proofErr w:type="spellStart"/>
+      <w:r>
+        <w:t>arroba</w:t>
+      </w:r>
       <w:proofErr w:type="spellEnd"/>
       <w:r>
         <w:t xml:space="preserve">. </w:t>
@@ -3247,15 +3499,39 @@
       </w:r>
       <w:proofErr w:type="spellEnd"/>
       <w:r>
-        <w:t xml:space="preserve"> página não encontrada, né. Então é caso como esse, isso é link quebrado, então links quebrados são aqueles que não funcionam de forma alguma, ou que funcionam mas se levam pra 1 página que não existe, isso é link quebrado. Então, como você testa isso? Como você usa essa informação ao seu favor? Quando você for testar 1 aplicação web, dá 1 varredura nos links que existem, ou então faça uso de ferramentas específicas. Existem ferramentas que podem ajudar você a conseguir encontrar links quebrados em aplicações que estão em produção, tá? Geralmente são </w:t>
-      </w:r>
-      <w:proofErr w:type="spellStart"/>
+        <w:t xml:space="preserve"> página não encontrada, né. Então é caso como esse, isso é link quebrado, então links quebrados são aqueles que não funcionam de forma alguma, ou que </w:t>
+      </w:r>
+      <w:proofErr w:type="gramStart"/>
+      <w:r>
+        <w:t>funcionam</w:t>
+      </w:r>
+      <w:proofErr w:type="gramEnd"/>
+      <w:r>
+        <w:t xml:space="preserve"> mas se levam pra 1 página que não existe, isso é link quebrado. Então, como você testa isso? Como você usa essa informação ao seu favor? Quando você for testar 1 aplicação web, dá 1 varredura nos links que existem, ou então faça uso de ferramentas específicas. Existem ferramentas que podem ajudar você a conseguir encontrar links quebrados em aplicações que estão em produção, tá? Geralmente </w:t>
+      </w:r>
+      <w:proofErr w:type="gramStart"/>
       <w:r>
         <w:t>são</w:t>
       </w:r>
-      <w:proofErr w:type="spellEnd"/>
-      <w:r>
-        <w:t xml:space="preserve"> as aplicações que já estão disponíveis pro seu usuário. Mas se a sua aplicação ainda não está disponível, vai você mesmo ali e testa pra tentar identificar alguns links quebrados. Se a sua aplicação já estiver na internet, procure algum serviço de testes de link quebrado. Deixa eu te mostrar aqui. Está aqui olha, esse é o online </w:t>
+      <w:proofErr w:type="gramEnd"/>
+      <w:r>
+        <w:t xml:space="preserve"> </w:t>
+      </w:r>
+      <w:proofErr w:type="spellStart"/>
+      <w:r>
+        <w:t>são</w:t>
+      </w:r>
+      <w:proofErr w:type="spellEnd"/>
+      <w:r>
+        <w:t xml:space="preserve"> as aplicações que já estão disponíveis pro seu usuário. Mas se a sua aplicação ainda não está disponível, vai você mesmo ali e testa pra tentar identificar alguns links quebrados. Se a sua aplicação já estiver na internet, procure algum serviço de testes de link quebrado. </w:t>
+      </w:r>
+      <w:proofErr w:type="gramStart"/>
+      <w:r>
+        <w:t>Deixa eu</w:t>
+      </w:r>
+      <w:proofErr w:type="gramEnd"/>
+      <w:r>
+        <w:t xml:space="preserve"> te mostrar aqui. Está aqui olha, esse é o online </w:t>
       </w:r>
       <w:proofErr w:type="spellStart"/>
       <w:r>
@@ -3287,7 +3563,15 @@
       </w:r>
       <w:proofErr w:type="spellEnd"/>
       <w:r>
-        <w:t xml:space="preserve"> links, vem aqui e digita esse código de segurança, ele faz isso pra que você não consiga automatizar esse processo, né? Então, vou colocar aqui o número 6, letra s, número 5, h q, se eu peguei direito, né? Vou pegar aqui e vou clicar em </w:t>
+        <w:t xml:space="preserve"> links, vem aqui e digita esse código de segurança, ele faz isso pra que você não consiga automatizar esse processo, né? Então, vou colocar aqui o número 6, </w:t>
+      </w:r>
+      <w:proofErr w:type="gramStart"/>
+      <w:r>
+        <w:t>letra s</w:t>
+      </w:r>
+      <w:proofErr w:type="gramEnd"/>
+      <w:r>
+        <w:t xml:space="preserve">, número 5, h q, se eu peguei direito, né? Vou pegar aqui e vou clicar em </w:t>
       </w:r>
       <w:proofErr w:type="spellStart"/>
       <w:r>
@@ -3311,27 +3595,51 @@
       </w:r>
       <w:proofErr w:type="spellEnd"/>
       <w:r>
-        <w:t xml:space="preserve">, opa, coloquei o número errado. Vamos lá de novo, 7 5 v p 3. Acho que agora dá certo, hein? Vamos ver? Está rodando olha, está vendo? E está processando as páginas e os links. O que que essa ferramenta vai fazer? Ela vai procurar por links quebrados naquela determinada página, né? Falei que ela tem que em produção, porque como você viu você tem que apontar ali qual é a URL de acesso a essa determinada aplicação. Aqui no caso do Terra, vai demorar pouco por quê? Porque provavelmente são muitas páginas que eles têm dentro da página inicial, mas só pra você entender, olha só, vou vir aqui e vou colocar aqui olha, Terra ponto com ponto b r. Aqui olha, está vendo? Tem muitos links ou botões que tem aqui nessa página, tá, e aí cada deles vai levar pra algum tipo de caminho diferente né, por exemplo, esse daqui leva pra 1 notícia, está vendo, esse daqui leva pra outra, pra outra e assim sucessivamente, então, né, o que que aquele site vai fazer? Vai tentar localizar se algum desses está quebrado. Literalmente, né, a gente fosse pensar de maneira literal, você teria que clicar </w:t>
-      </w:r>
-      <w:proofErr w:type="spellStart"/>
+        <w:t xml:space="preserve">, opa, coloquei o número errado. Vamos lá de novo, 7 5 v p 3. Acho que agora dá certo, hein? Vamos ver? Está rodando olha, está vendo? E está processando as páginas e os links. O que que essa ferramenta vai fazer? Ela vai procurar por links quebrados naquela determinada página, né? Falei que ela tem que em produção, porque como você viu você tem que apontar ali qual é a URL de acesso a essa determinada aplicação. Aqui no caso do Terra, vai demorar pouco por quê? Porque provavelmente são muitas páginas que eles têm dentro da página inicial, mas só pra você entender, olha só, vou vir aqui e vou colocar aqui olha, Terra ponto com ponto b r. Aqui olha, está vendo? Tem muitos links ou botões que tem aqui nessa página, tá, e aí cada deles vai levar pra algum tipo de caminho diferente né, por exemplo, esse daqui leva pra 1 notícia, está vendo, esse daqui leva pra outra, pra outra e assim sucessivamente, então, né, o que que aquele site vai fazer? Vai tentar localizar se algum desses está quebrado. Literalmente, né, a gente fosse pensar de maneira literal, você teria que </w:t>
+      </w:r>
+      <w:proofErr w:type="gramStart"/>
       <w:r>
         <w:t>clicar</w:t>
       </w:r>
-      <w:proofErr w:type="spellEnd"/>
-      <w:r>
-        <w:t xml:space="preserve"> aqui e ver se na próxima tela que for ser aberta, se está aparecendo lá a realmente a notícia, ou se apareceu erro 404 falando que a página não foi encontrada, entendeu? Mas a ferramenta não, a ferramenta ela vai rodar isso e fazer todas essas ações de 1 maneira automática, ok? Então ela vai daqui a pouco trazer aqui pra gente os resultados aqui de quais são os links quebrados. Enquanto isso, vamos navegar pra pro nosso próximo erro e já </w:t>
-      </w:r>
-      <w:proofErr w:type="spellStart"/>
+      <w:proofErr w:type="gramEnd"/>
+      <w:r>
+        <w:t xml:space="preserve"> </w:t>
+      </w:r>
+      <w:proofErr w:type="spellStart"/>
+      <w:r>
+        <w:t>clicar</w:t>
+      </w:r>
+      <w:proofErr w:type="spellEnd"/>
+      <w:r>
+        <w:t xml:space="preserve"> aqui e ver se na próxima tela que for ser aberta, se está aparecendo lá a realmente a notícia, ou se apareceu erro 404 falando que a página não foi encontrada, entendeu? Mas a ferramenta não, a ferramenta ela vai rodar isso e fazer todas essas ações de 1 maneira automática, ok? Então ela vai daqui a pouco trazer aqui pra gente os resultados aqui de quais são os links quebrados. Enquanto isso, vamos navegar pra pro nosso próximo erro e </w:t>
+      </w:r>
+      <w:proofErr w:type="gramStart"/>
       <w:r>
         <w:t>já</w:t>
       </w:r>
+      <w:proofErr w:type="gramEnd"/>
+      <w:r>
+        <w:t xml:space="preserve"> </w:t>
+      </w:r>
+      <w:proofErr w:type="spellStart"/>
+      <w:r>
+        <w:t>já</w:t>
+      </w:r>
       <w:proofErr w:type="spellEnd"/>
       <w:r>
         <w:t xml:space="preserve"> eu volto aqui pra te mostrar esse relatório, beleza? Vamos lá então pro nosso próximo erro. Fluxo de navegação </w:t>
       </w:r>
       <w:r>
         <w:lastRenderedPageBreak/>
-        <w:t xml:space="preserve">interrompido. Nesse caso aqui é o seguinte olha, aqui tem exemplo pra você. Em site de pedido de comida o cliente adiciona itens ao carrinho, mas ao tentar fazer o checkout, o sistema exibe o carrinho vazio. Veja, o usuário foi, navegou no site, ele fez pesquisas, adicionou produtos no carrinho, e aí ele chega num momento que é o momento de falar assim, agora eu quero fechar a compra, finalizar a compra. O que tem que acontecer? Ao clicar finalizar a compra ele tem que fazer os cálculos e trazer já aquela lista de todos os produtos que já estavam no carrinho já calculados pra ele completar a venda, só que a compra, só que nesse caso não apareceu nada, por isso que não apareceu nada, porque provavelmente houve ali erro que fez com que esse essa jornada dele fosse quebrada. Então você tem que fazer a jornada do usuário, ou seja, ir executando os passos até a conclusão do seu objetivo, e ver se alguma das informações que você já preencheu, já informou no passado, se elas foram perdidas no decorrer desse fluxo do usuário, né. Isso aqui funciona muito pra </w:t>
+        <w:t xml:space="preserve">interrompido. Nesse caso aqui é o seguinte olha, aqui tem exemplo pra você. Em site de pedido de comida o cliente adiciona itens ao carrinho, mas ao tentar fazer o checkout, o sistema exibe o carrinho vazio. Veja, o usuário foi, navegou no site, ele fez pesquisas, adicionou produtos no carrinho, e aí ele chega num momento que é o momento de falar assim, agora eu quero fechar a compra, finalizar a compra. O que tem que acontecer? Ao clicar finalizar a compra ele tem que fazer os cálculos e trazer já aquela lista de todos os produtos que já estavam no carrinho já calculados pra ele completar a venda, só que a compra, só que nesse caso não apareceu nada, por isso que não apareceu nada, porque provavelmente houve ali erro que fez com que </w:t>
+      </w:r>
+      <w:proofErr w:type="gramStart"/>
+      <w:r>
+        <w:t>esse essa jornada</w:t>
+      </w:r>
+      <w:proofErr w:type="gramEnd"/>
+      <w:r>
+        <w:t xml:space="preserve"> dele fosse quebrada. Então você tem que fazer a jornada do usuário, ou seja, ir executando os passos até a conclusão do seu objetivo, e ver se alguma das informações que você já preencheu, já informou no passado, se elas foram perdidas no decorrer desse fluxo do usuário, né. Isso aqui funciona muito pra </w:t>
       </w:r>
       <w:proofErr w:type="spellStart"/>
       <w:r>
@@ -3395,7 +3703,15 @@
       </w:r>
       <w:proofErr w:type="spellEnd"/>
       <w:r>
-        <w:t xml:space="preserve"> mensagem que foi definida antes tem que ser utilizada aqui, e tem que ser escrita de maneira correta, ok? Hoje em dia com as essa diversidade de ferramentas que você encontra na internet você poderia também utilizar corretor ortográfico do </w:t>
+        <w:t xml:space="preserve"> mensagem que foi definida antes tem que ser utilizada aqui, e tem que ser escrita de maneira correta, ok? Hoje em dia com </w:t>
+      </w:r>
+      <w:proofErr w:type="gramStart"/>
+      <w:r>
+        <w:t>as essa diversidade</w:t>
+      </w:r>
+      <w:proofErr w:type="gramEnd"/>
+      <w:r>
+        <w:t xml:space="preserve"> de ferramentas que você encontra na internet você poderia também utilizar corretor ortográfico do </w:t>
       </w:r>
       <w:proofErr w:type="spellStart"/>
       <w:r>
@@ -3455,12 +3771,20 @@
       </w:r>
       <w:proofErr w:type="spellEnd"/>
       <w:r>
-        <w:t xml:space="preserve"> BRPTBR temas, bolsas de estudos e financiamentos estudantis, que tem esse link aqui olha, esse link aqui, está </w:t>
-      </w:r>
-      <w:proofErr w:type="spellStart"/>
+        <w:t xml:space="preserve"> BRPTBR temas, bolsas de estudos e financiamentos estudantis, que tem esse link aqui olha, esse link aqui, </w:t>
+      </w:r>
+      <w:proofErr w:type="gramStart"/>
       <w:r>
         <w:t>está</w:t>
       </w:r>
+      <w:proofErr w:type="gramEnd"/>
+      <w:r>
+        <w:t xml:space="preserve"> </w:t>
+      </w:r>
+      <w:proofErr w:type="spellStart"/>
+      <w:r>
+        <w:t>está</w:t>
+      </w:r>
       <w:proofErr w:type="spellEnd"/>
       <w:r>
         <w:t xml:space="preserve"> vendo? Ele respondeu 404. Aí aqui está aparecendo o outro também olha, está vendo? Funarte ponto </w:t>
@@ -3551,7 +3875,15 @@
       </w:r>
       <w:proofErr w:type="spellEnd"/>
       <w:r>
-        <w:t xml:space="preserve"> da aula pra que você possa então acessar e conseguir então também utilizar essa ferramenta. Lembrando, esses daqui são pra sites que já estão em produção. Mensagens de erro não amigáveis aos usuários. Isso daqui é o seguinte, como a aplicação web se comunica com a API, geralmente a API retorna erro que é erro que é muito muito ruim de você entender </w:t>
+        <w:t xml:space="preserve"> da aula pra que você possa então acessar e conseguir então também utilizar essa ferramenta. Lembrando, esses daqui são pra sites que já estão em produção. Mensagens de erro não amigáveis aos usuários. Isso daqui é o seguinte, como a aplicação web se comunica com a API, geralmente a API retorna erro que é erro que é </w:t>
+      </w:r>
+      <w:proofErr w:type="gramStart"/>
+      <w:r>
+        <w:t>muito</w:t>
+      </w:r>
+      <w:proofErr w:type="gramEnd"/>
+      <w:r>
+        <w:t xml:space="preserve"> muito ruim de você entender </w:t>
       </w:r>
       <w:proofErr w:type="spellStart"/>
       <w:r>
@@ -3656,7 +3988,15 @@
       </w:r>
       <w:proofErr w:type="spellEnd"/>
       <w:r>
-        <w:t xml:space="preserve">, ele vai abrir pra você essa página aqui. E dentro dessa página, você vai ter aqui olha, a opção de conseguir navegar dentre algumas das vertentes do Cypress. Então por exemplo aqui, você tem as informações com relação ao Cypress App, que é, a gente vai conhecer já </w:t>
+        <w:t xml:space="preserve">, ele vai abrir pra você essa página aqui. E dentro dessa página, você vai ter aqui olha, a opção de conseguir navegar dentre algumas das vertentes do Cypress. Então por exemplo aqui, você tem as informações com relação ao Cypress App, que é, a gente vai conhecer </w:t>
+      </w:r>
+      <w:proofErr w:type="gramStart"/>
+      <w:r>
+        <w:t>já</w:t>
+      </w:r>
+      <w:proofErr w:type="gramEnd"/>
+      <w:r>
+        <w:t xml:space="preserve"> </w:t>
       </w:r>
       <w:proofErr w:type="spellStart"/>
       <w:r>
@@ -3772,7 +4112,15 @@
       </w:r>
       <w:proofErr w:type="spellEnd"/>
       <w:r>
-        <w:t xml:space="preserve"> da melhor forma possível, ok? Então está tudo aqui na documentação. A gente vai consultar aqui a documentação, né, conforme a gente for evoluindo aqui no uso da ferramenta, mas fica aqui pra você essa esse seu 1º contato como sendo algo muito importante pra você conhecer, que é como navegar aqui nessa documentação, beleza? Então agora vamos pra próxima aula, para que a gente possa criar o nosso 1º repositório de testes web, e aí depois a gente poder, então, instalar o Cypress e começar com essa nossa jornada rumo a automatizar nossos testes web.</w:t>
+        <w:t xml:space="preserve"> da melhor forma possível, ok? Então está tudo aqui na documentação. A gente vai consultar aqui a documentação, né, conforme a gente for evoluindo aqui no uso da ferramenta, mas fica aqui pra você </w:t>
+      </w:r>
+      <w:proofErr w:type="gramStart"/>
+      <w:r>
+        <w:t>essa esse seu 1º contato</w:t>
+      </w:r>
+      <w:proofErr w:type="gramEnd"/>
+      <w:r>
+        <w:t xml:space="preserve"> como sendo algo muito importante pra você conhecer, que é como navegar aqui nessa documentação, beleza? Então agora vamos pra próxima aula, para que a gente possa criar o nosso 1º repositório de testes web, e aí depois a gente poder, então, instalar o Cypress e começar com essa nossa jornada rumo a automatizar nossos testes web.</w:t>
       </w:r>
     </w:p>
     <w:p>
@@ -3813,7 +4161,15 @@
         <w:spacing w:after="0"/>
       </w:pPr>
       <w:r>
-        <w:t xml:space="preserve">Vamos lá, então. O que a gente vai fazer agora é criar repositório de testes pra dos nossos repositórios aqui, que é o repositório da aplicação banco web, que é 1 aplicação web que se conecta diretamente com a nossa banco API, beleza? Pra isso eu estou aqui já no meu GitHub, e aqui dentro, que eu vou clicar aqui nesse símbolo de mais pra criar novo repositório. Aqui eu vou colocar o nome do repositório, vou chamar de banco web </w:t>
+        <w:t xml:space="preserve">Vamos lá, então. O que a gente vai fazer agora é criar repositório de testes pra dos nossos repositórios aqui, que é o repositório da aplicação banco web, que é 1 aplicação web que se conecta diretamente com a </w:t>
+      </w:r>
+      <w:proofErr w:type="gramStart"/>
+      <w:r>
+        <w:t>nossa banco</w:t>
+      </w:r>
+      <w:proofErr w:type="gramEnd"/>
+      <w:r>
+        <w:t xml:space="preserve"> API, beleza? Pra isso eu estou aqui já no meu GitHub, e aqui dentro, que eu vou clicar aqui nesse símbolo de mais pra criar novo repositório. Aqui eu vou colocar o nome do repositório, vou chamar de banco web </w:t>
       </w:r>
       <w:proofErr w:type="spellStart"/>
       <w:r>
@@ -3861,7 +4217,15 @@
       </w:r>
       <w:proofErr w:type="spellEnd"/>
       <w:r>
-        <w:t xml:space="preserve"> que geralmente são utilizadas em aplicações Node, ok? Feito isso, eu vou clicar em </w:t>
+        <w:t xml:space="preserve"> que geralmente são utilizadas em </w:t>
+      </w:r>
+      <w:proofErr w:type="gramStart"/>
+      <w:r>
+        <w:t>aplicações Node</w:t>
+      </w:r>
+      <w:proofErr w:type="gramEnd"/>
+      <w:r>
+        <w:t xml:space="preserve">, ok? Feito isso, eu vou clicar em </w:t>
       </w:r>
       <w:proofErr w:type="spellStart"/>
       <w:r>
@@ -3885,7 +4249,15 @@
       </w:r>
       <w:proofErr w:type="spellEnd"/>
       <w:r>
-        <w:t xml:space="preserve">, vou copiar, vou </w:t>
+        <w:t xml:space="preserve">, vou copiar, </w:t>
+      </w:r>
+      <w:proofErr w:type="gramStart"/>
+      <w:r>
+        <w:t>vou</w:t>
+      </w:r>
+      <w:proofErr w:type="gramEnd"/>
+      <w:r>
+        <w:t xml:space="preserve"> </w:t>
       </w:r>
       <w:proofErr w:type="spellStart"/>
       <w:r>
@@ -4121,18 +4493,22 @@
         <w:t xml:space="preserve">, olha só, ele já cria aqui pra mim o meu </w:t>
       </w:r>
       <w:proofErr w:type="spellStart"/>
+      <w:proofErr w:type="gramStart"/>
       <w:r>
         <w:t>package.json</w:t>
       </w:r>
       <w:proofErr w:type="spellEnd"/>
+      <w:proofErr w:type="gramEnd"/>
       <w:r>
         <w:t xml:space="preserve">, ele já está criado, e aqui dentro já tem as configurações principais aqui do </w:t>
       </w:r>
       <w:proofErr w:type="spellStart"/>
+      <w:proofErr w:type="gramStart"/>
       <w:r>
         <w:t>package.json</w:t>
       </w:r>
       <w:proofErr w:type="spellEnd"/>
+      <w:proofErr w:type="gramEnd"/>
       <w:r>
         <w:t xml:space="preserve">, ok? E o 2º passo é eu vir aqui e instalar o Cypress. Só que pra que eu possa instalar o Cypress, vai ser necessário que eu saiba exatamente qual é a versão necessária que eu quero usar. Então o que eu vou fazer? Vou ir lá no site do </w:t>
       </w:r>
@@ -4190,7 +4566,15 @@
       </w:r>
       <w:proofErr w:type="spellEnd"/>
       <w:r>
-        <w:t xml:space="preserve"> frente do Cypress arroba e vou colocar 14.5 ponto que é aquela versão que a gente viu aqui, olha, 14.5 ponto Fiz isso, vou pressionar a tecla </w:t>
+        <w:t xml:space="preserve"> frente do Cypress arroba e vou colocar 14.5 ponto que é aquela versão que a gente viu aqui, olha, 14.5 </w:t>
+      </w:r>
+      <w:proofErr w:type="gramStart"/>
+      <w:r>
+        <w:t>ponto Fiz</w:t>
+      </w:r>
+      <w:proofErr w:type="gramEnd"/>
+      <w:r>
+        <w:t xml:space="preserve"> isso, vou pressionar a tecla </w:t>
       </w:r>
       <w:proofErr w:type="spellStart"/>
       <w:r>
@@ -4201,20 +4585,38 @@
         <w:t xml:space="preserve">, e aí então ele vai fazer a instalação do Cypress aqui nesse nosso projeto. Olha só o que ele está fazendo agora, olha. Você vai ver aqui dentro do próprio, do próprio </w:t>
       </w:r>
       <w:proofErr w:type="spellStart"/>
+      <w:proofErr w:type="gramStart"/>
       <w:r>
         <w:t>package.json</w:t>
       </w:r>
       <w:proofErr w:type="spellEnd"/>
-      <w:r>
-        <w:t xml:space="preserve"> que já </w:t>
-      </w:r>
-      <w:proofErr w:type="spellStart"/>
+      <w:proofErr w:type="gramEnd"/>
+      <w:r>
+        <w:t xml:space="preserve"> que </w:t>
+      </w:r>
+      <w:proofErr w:type="gramStart"/>
       <w:r>
         <w:t>já</w:t>
       </w:r>
-      <w:proofErr w:type="spellEnd"/>
-      <w:r>
-        <w:t xml:space="preserve"> ele vai criar aqui 1 nova propriedade de dependências, e aqui nessa propriedade de dependências vai ter a biblioteca do Cypress sendo mencionada. E que aqui, do lado direito, a gente vai ter esse node modules, está vendo? Que já está criado aqui, ele está populando aqui o node modules com informações. Inclusive aqui dentro do node modules a gente já vai conseguir. E ver, por exemplo, o Cypress aqui, mas tem outras várias, né, dependências que o Cypress faz uso, né, por isso que apareceu essas várias aqui, certo? Olha lá, ele já terminou, eu sei disso porque aqui ele já falou que ele adicionou esse essa quantidade de </w:t>
+      <w:proofErr w:type="gramEnd"/>
+      <w:r>
+        <w:t xml:space="preserve"> </w:t>
+      </w:r>
+      <w:proofErr w:type="spellStart"/>
+      <w:r>
+        <w:t>já</w:t>
+      </w:r>
+      <w:proofErr w:type="spellEnd"/>
+      <w:r>
+        <w:t xml:space="preserve"> ele vai criar aqui 1 nova propriedade de dependências, e aqui nessa propriedade de dependências vai ter a biblioteca do Cypress sendo mencionada. E que aqui, do lado direito, a gente vai ter esse node modules, está vendo? Que já está criado aqui, ele está populando aqui o node modules com informações. Inclusive aqui dentro do node modules a gente já vai conseguir. E ver, por exemplo, o Cypress aqui, mas tem outras várias, né, dependências que o Cypress faz uso, né, por isso que apareceu essas várias aqui, certo? Olha lá, ele já terminou, eu sei disso porque aqui ele já falou que ele adicionou </w:t>
+      </w:r>
+      <w:proofErr w:type="gramStart"/>
+      <w:r>
+        <w:t>esse essa quantidade</w:t>
+      </w:r>
+      <w:proofErr w:type="gramEnd"/>
+      <w:r>
+        <w:t xml:space="preserve"> de </w:t>
       </w:r>
       <w:proofErr w:type="spellStart"/>
       <w:r>
@@ -4270,7 +4672,15 @@
       </w:r>
       <w:proofErr w:type="spellEnd"/>
       <w:r>
-        <w:t xml:space="preserve">. No meu Windows vai aparecer algumas coisas, como por exemplo isso daqui, E aqui nessa janelinha ele pergunta se eu quero permitir que as redes públicas e privadas possam acessar esse app que é o Cypress, vou dizer aqui que sim, então vou clicar aqui, em. Beleza? E aqui, olha, você vai ver. Que ele já abriu aqui, está vendo? Ele tinha falado lá pra mim né que parecia que essa é a 1º vez que estou usando o Cypress, é isso mesmo. Ele já verificou aqui o Cypress e abriu o Cypress. E agora aqui olha, essa janelona, eu vou puxar pouco mais pra cá só pra centralizar ela aqui dentro dessa nossa área, pra você conseguir ver todos os itens que tem dentro dessa janela. Prontinho, já está aqui. Ele traz aqui pra gente o que é que tem de novo, né, no Cypress. Eu vem aqui e clica em continuar, e ele me abre aqui essa opção onde eu tenho </w:t>
+        <w:t xml:space="preserve">. No meu Windows vai aparecer algumas coisas, como por exemplo isso daqui, E aqui nessa janelinha ele pergunta se eu quero permitir que as redes públicas e privadas possam acessar esse app que é o Cypress, vou dizer aqui que sim, então vou clicar aqui, em. Beleza? E aqui, olha, você vai ver. Que ele já abriu aqui, está vendo? Ele tinha falado lá pra mim né que parecia que essa é a 1º vez que estou usando o Cypress, é isso mesmo. Ele já verificou aqui o Cypress e abriu o Cypress. E agora aqui olha, essa janelona, eu vou puxar pouco mais pra cá só pra centralizar ela aqui dentro dessa nossa área, pra você conseguir ver todos os itens que tem dentro dessa janela. Prontinho, já está aqui. Ele traz aqui pra gente o que é que tem de novo, né, no Cypress. </w:t>
+      </w:r>
+      <w:proofErr w:type="gramStart"/>
+      <w:r>
+        <w:t>Eu vem</w:t>
+      </w:r>
+      <w:proofErr w:type="gramEnd"/>
+      <w:r>
+        <w:t xml:space="preserve"> aqui e clica em continuar, e ele me abre aqui essa opção onde eu tenho </w:t>
       </w:r>
       <w:r>
         <w:lastRenderedPageBreak/>
@@ -4306,7 +4716,15 @@
       </w:r>
       <w:proofErr w:type="spellEnd"/>
       <w:r>
-        <w:t xml:space="preserve"> web. Não é esse, não é essa opção que nós vamos utilizar aqui dentro do treinamento. A gente vai utilizar essa daqui, que é o </w:t>
+        <w:t xml:space="preserve"> web. Não é esse, não é essa opção que nós vamos utilizar aqui dentro do treinamento. A gente vai utilizar essa </w:t>
+      </w:r>
+      <w:proofErr w:type="gramStart"/>
+      <w:r>
+        <w:t>daqui, que</w:t>
+      </w:r>
+      <w:proofErr w:type="gramEnd"/>
+      <w:r>
+        <w:t xml:space="preserve"> é o </w:t>
       </w:r>
       <w:proofErr w:type="spellStart"/>
       <w:r>
@@ -4330,7 +4748,15 @@
       </w:r>
       <w:proofErr w:type="spellEnd"/>
       <w:r>
-        <w:t xml:space="preserve">, ok? Você vê que ela está aqui ainda como não configurada. Vou clicar aqui pra que gente possa iniciar essa configuração. Então cliquei, aí ele vai falar aqui pra mim olha, essas daqui, esses daqui são os arquivos de configuração que vão ser, que foram adicionados ao seu projeto. Adicionei Cypress ponto </w:t>
+        <w:t xml:space="preserve">, ok? Você vê que ela está aqui ainda como não configurada. Vou clicar aqui pra que gente possa iniciar essa configuração. Então cliquei, aí ele vai falar aqui pra mim olha, essas </w:t>
+      </w:r>
+      <w:proofErr w:type="gramStart"/>
+      <w:r>
+        <w:t>daqui, esses</w:t>
+      </w:r>
+      <w:proofErr w:type="gramEnd"/>
+      <w:r>
+        <w:t xml:space="preserve"> daqui são os arquivos de configuração que vão ser, que foram adicionados ao seu projeto. Adicionei Cypress ponto </w:t>
       </w:r>
       <w:proofErr w:type="spellStart"/>
       <w:r>
@@ -4338,7 +4764,11 @@
       </w:r>
       <w:proofErr w:type="spellEnd"/>
       <w:r>
-        <w:t xml:space="preserve">, que é onde a vai conseguir configurar algumas coisas pra ficar já com padrão dentro do nosso projeto de automação com Cypress, ela fala olha, já criei também aqui olha, essa esse </w:t>
+        <w:t xml:space="preserve">, que é onde a vai conseguir configurar algumas coisas pra ficar já com padrão dentro do nosso projeto de automação com Cypress, ela fala olha, já criei também aqui olha, </w:t>
+      </w:r>
+      <w:proofErr w:type="gramStart"/>
+      <w:r>
+        <w:t xml:space="preserve">essa esse </w:t>
       </w:r>
       <w:proofErr w:type="spellStart"/>
       <w:r>
@@ -4346,7 +4776,11 @@
       </w:r>
       <w:proofErr w:type="spellEnd"/>
       <w:r>
-        <w:t xml:space="preserve"> arquivo aqui </w:t>
+        <w:t xml:space="preserve"> arquivo</w:t>
+      </w:r>
+      <w:proofErr w:type="gramEnd"/>
+      <w:r>
+        <w:t xml:space="preserve"> aqui </w:t>
       </w:r>
       <w:proofErr w:type="spellStart"/>
       <w:r>
@@ -4798,12 +5232,20 @@
       </w:r>
       <w:proofErr w:type="spellEnd"/>
       <w:r>
-        <w:t xml:space="preserve"> é 1 função que faz com que o Cypress navegue até 1 página, nesse caso até a página h t </w:t>
-      </w:r>
-      <w:proofErr w:type="spellStart"/>
+        <w:t xml:space="preserve"> é 1 função que faz com que o Cypress navegue até 1 página, nesse caso até a página h </w:t>
+      </w:r>
+      <w:proofErr w:type="gramStart"/>
       <w:r>
         <w:t>t</w:t>
       </w:r>
+      <w:proofErr w:type="gramEnd"/>
+      <w:r>
+        <w:t xml:space="preserve"> </w:t>
+      </w:r>
+      <w:proofErr w:type="spellStart"/>
+      <w:r>
+        <w:t>t</w:t>
+      </w:r>
       <w:proofErr w:type="spellEnd"/>
       <w:r>
         <w:t xml:space="preserve"> p s </w:t>
@@ -4878,7 +5320,15 @@
       </w:r>
       <w:proofErr w:type="spellEnd"/>
       <w:r>
-        <w:t xml:space="preserve">, olha só, ele já está carregando os testes, carregou, e agora ele já executou o teste, certo? Ele já executou esse teste. E aqui está o navegador do Cypress, então se puxar pouquinho mais pra cá, Esse navegador que está aqui, esse espaço, essa área que está aqui é a área do Electron, ok? É a área do Electron. E aqui a gente vai ver o site onde a gente está nesse momento e aqui do lado esquerdo a gente vai ver, olha só, os passos dessa execução, Ok? Então o que a gente teve aqui foi apenas esse </w:t>
+        <w:t xml:space="preserve">, olha só, ele já está carregando os testes, carregou, e agora ele já executou o teste, certo? Ele já executou esse teste. E aqui está o navegador do Cypress, então se puxar pouquinho mais pra cá, </w:t>
+      </w:r>
+      <w:proofErr w:type="gramStart"/>
+      <w:r>
+        <w:t>Esse</w:t>
+      </w:r>
+      <w:proofErr w:type="gramEnd"/>
+      <w:r>
+        <w:t xml:space="preserve"> navegador que está aqui, esse espaço, essa área que está aqui é a área do Electron, ok? É a área do Electron. E aqui a gente vai ver o site onde a gente está nesse momento e aqui do lado esquerdo a gente vai ver, olha só, os passos dessa execução, Ok? Então o que a gente teve aqui foi apenas esse </w:t>
       </w:r>
       <w:proofErr w:type="spellStart"/>
       <w:r>
@@ -4886,7 +5336,15 @@
       </w:r>
       <w:proofErr w:type="spellEnd"/>
       <w:r>
-        <w:t xml:space="preserve"> aqui, só visitamos determinado site que foi esse site aqui, beleza? Então esse daqui, esse daqui é o rostinho mais comum que você vai ver nas próximas aulas, afinal é através desse dessa área aqui que a gente vai executar os testes, debugar os testes enquanto a gente ainda estiver fazendo isso aqui na nossa máquina, beleza? Bom, vamos pra próxima aula.</w:t>
+        <w:t xml:space="preserve"> aqui, só visitamos determinado site que foi esse site aqui, beleza? Então esse </w:t>
+      </w:r>
+      <w:proofErr w:type="gramStart"/>
+      <w:r>
+        <w:t>daqui, esse</w:t>
+      </w:r>
+      <w:proofErr w:type="gramEnd"/>
+      <w:r>
+        <w:t xml:space="preserve"> daqui é o rostinho mais comum que você vai ver nas próximas aulas, afinal é através desse dessa área aqui que a gente vai executar os testes, debugar os testes enquanto a gente ainda estiver fazendo isso aqui na nossa máquina, beleza? Bom, vamos pra próxima aula.</w:t>
       </w:r>
     </w:p>
     <w:p>
@@ -5033,12 +5491,20 @@
       </w:r>
       <w:proofErr w:type="spellEnd"/>
       <w:r>
-        <w:t xml:space="preserve"> ao invés de ter aqui a URL do Cypress, vai ter 0HTTP, 2 ponto barra </w:t>
-      </w:r>
-      <w:proofErr w:type="spellStart"/>
+        <w:t xml:space="preserve"> ao invés de ter aqui a URL do Cypress, vai ter 0HTTP, 2 ponto </w:t>
+      </w:r>
+      <w:proofErr w:type="gramStart"/>
       <w:r>
         <w:t>barra</w:t>
       </w:r>
+      <w:proofErr w:type="gramEnd"/>
+      <w:r>
+        <w:t xml:space="preserve"> </w:t>
+      </w:r>
+      <w:proofErr w:type="spellStart"/>
+      <w:r>
+        <w:t>barra</w:t>
+      </w:r>
       <w:proofErr w:type="spellEnd"/>
       <w:r>
         <w:t xml:space="preserve"> </w:t>
@@ -5057,12 +5523,20 @@
       </w:r>
       <w:proofErr w:type="spellEnd"/>
       <w:r>
-        <w:t xml:space="preserve"> prompt, vim aqui, fazer c d ponto </w:t>
-      </w:r>
-      <w:proofErr w:type="spellStart"/>
+        <w:t xml:space="preserve"> prompt, vim aqui, fazer c d </w:t>
+      </w:r>
+      <w:proofErr w:type="gramStart"/>
       <w:r>
         <w:t>ponto</w:t>
       </w:r>
+      <w:proofErr w:type="gramEnd"/>
+      <w:r>
+        <w:t xml:space="preserve"> </w:t>
+      </w:r>
+      <w:proofErr w:type="spellStart"/>
+      <w:r>
+        <w:t>ponto</w:t>
+      </w:r>
       <w:proofErr w:type="spellEnd"/>
       <w:r>
         <w:t xml:space="preserve"> pra voltar pra pasta </w:t>
@@ -5097,7 +5571,15 @@
       </w:r>
       <w:proofErr w:type="spellEnd"/>
       <w:r>
-        <w:t xml:space="preserve"> API. Pronto, aqui está rodando na parte 3000 a nossa banca API. Vou vir aqui e vou abrir novo prompt, está vendo? Vou fazer a mesma coisa, c d ponto </w:t>
+        <w:t xml:space="preserve"> API. Pronto, aqui está rodando na parte 3000 a nossa banca API. Vou vir aqui e vou abrir novo prompt, está vendo? Vou fazer a mesma coisa, c d </w:t>
+      </w:r>
+      <w:proofErr w:type="gramStart"/>
+      <w:r>
+        <w:t>ponto</w:t>
+      </w:r>
+      <w:proofErr w:type="gramEnd"/>
+      <w:r>
+        <w:t xml:space="preserve"> </w:t>
       </w:r>
       <w:proofErr w:type="spellStart"/>
       <w:r>
@@ -5165,12 +5647,20 @@
       </w:r>
       <w:proofErr w:type="spellEnd"/>
       <w:r>
-        <w:t xml:space="preserve">, está vendo olha? E vou trocar aqui de http 2 ponto barra </w:t>
-      </w:r>
-      <w:proofErr w:type="spellStart"/>
+        <w:t xml:space="preserve">, está vendo olha? E vou trocar aqui de http 2 ponto </w:t>
+      </w:r>
+      <w:proofErr w:type="gramStart"/>
       <w:r>
         <w:t>barra</w:t>
       </w:r>
+      <w:proofErr w:type="gramEnd"/>
+      <w:r>
+        <w:t xml:space="preserve"> </w:t>
+      </w:r>
+      <w:proofErr w:type="spellStart"/>
+      <w:r>
+        <w:t>barra</w:t>
+      </w:r>
       <w:proofErr w:type="spellEnd"/>
       <w:r>
         <w:t xml:space="preserve"> Luca o rosto 4000 e vou colocar Google ponto com. Não salvei, não aconteceu nada. Você olha lá no Cypress, olha só, ainda está no banco. Agora, se eu vier aqui e salvar, olha, já começa a se movimentar aqui, você vai lá no Cypress, olha lá, ele já carregando aqui olha, o Google, está vendo? Então é desse jeito que acontece, tá? Ele percebe essas mudanças. Então eu vou vir aqui, vou voltar pra </w:t>
@@ -5189,7 +5679,23 @@
       </w:r>
       <w:proofErr w:type="spellEnd"/>
       <w:r>
-        <w:t xml:space="preserve">. Vem aqui olha, clica no outro, ele já sabe que esse carinha aqui é o senha, está vendo? Clico aqui nesse daqui, ele já sabe que esse é o login </w:t>
+        <w:t xml:space="preserve">. Vem aqui olha, clica no outro, ele já sabe que esse carinha aqui é </w:t>
+      </w:r>
+      <w:proofErr w:type="gramStart"/>
+      <w:r>
+        <w:t>o senha</w:t>
+      </w:r>
+      <w:proofErr w:type="gramEnd"/>
+      <w:r>
+        <w:t xml:space="preserve">, está vendo? Clico aqui nesse </w:t>
+      </w:r>
+      <w:proofErr w:type="gramStart"/>
+      <w:r>
+        <w:t>daqui, ele</w:t>
+      </w:r>
+      <w:proofErr w:type="gramEnd"/>
+      <w:r>
+        <w:t xml:space="preserve"> já sabe que esse é o login </w:t>
       </w:r>
       <w:proofErr w:type="spellStart"/>
       <w:r>
@@ -5673,7 +6179,23 @@
       </w:r>
       <w:proofErr w:type="spellEnd"/>
       <w:r>
-        <w:t xml:space="preserve"> aqui. Mas novamente, volto a dizer, ainda o comando está muito curto pra que a possa fazer algo nessa linha, está bom? Lá pro próximo, pro nosso próximo comando então? O que gente vai fazer? Aqui no Cypress, você vai vir aqui olha, vai clicar aqui e vai selecionar o senha, está bom? Olha, vai aqui então, novamente tem atenção aqui quanto a isso olha. Se eu clicasse aqui ia pegar outro elemento que não é o senha, quero esse. Cliquei aqui, ele já fez aqui olha, Cypress ponto </w:t>
+        <w:t xml:space="preserve"> aqui. Mas novamente, volto a dizer, ainda o comando está muito curto pra que a possa fazer algo nessa linha, está bom? Lá pro próximo, pro nosso próximo comando então? O que gente vai fazer? Aqui no Cypress, você vai vir aqui olha, vai clicar aqui e vai selecionar </w:t>
+      </w:r>
+      <w:proofErr w:type="gramStart"/>
+      <w:r>
+        <w:t>o senha</w:t>
+      </w:r>
+      <w:proofErr w:type="gramEnd"/>
+      <w:r>
+        <w:t xml:space="preserve">, está bom? Olha, vai aqui então, novamente tem atenção aqui quanto a isso olha. Se eu clicasse aqui ia pegar outro elemento que não é </w:t>
+      </w:r>
+      <w:proofErr w:type="gramStart"/>
+      <w:r>
+        <w:t>o senha</w:t>
+      </w:r>
+      <w:proofErr w:type="gramEnd"/>
+      <w:r>
+        <w:t xml:space="preserve">, quero esse. Cliquei aqui, ele já fez aqui olha, Cypress ponto </w:t>
       </w:r>
       <w:proofErr w:type="spellStart"/>
       <w:r>
@@ -5681,7 +6203,15 @@
       </w:r>
       <w:proofErr w:type="spellEnd"/>
       <w:r>
-        <w:t xml:space="preserve"> do senha. Vou copiar, vou lá pro v s </w:t>
+        <w:t xml:space="preserve"> </w:t>
+      </w:r>
+      <w:proofErr w:type="gramStart"/>
+      <w:r>
+        <w:t>do senha</w:t>
+      </w:r>
+      <w:proofErr w:type="gramEnd"/>
+      <w:r>
+        <w:t xml:space="preserve">. Vou copiar, vou lá pro v s </w:t>
       </w:r>
       <w:proofErr w:type="spellStart"/>
       <w:r>
@@ -5717,12 +6247,20 @@
       </w:r>
       <w:proofErr w:type="spellEnd"/>
       <w:r>
-        <w:t xml:space="preserve">, clicou e digitou, pegou a senha, clicou e digitou. Ah, eu quero ver executar de novo esse teste. Clica aqui olha. Olha lá, ele rodou tudo de novo. Ah, eu quero saber o que que tinha antes do clique. Deixa o mouse lá </w:t>
-      </w:r>
-      <w:proofErr w:type="spellStart"/>
+        <w:t xml:space="preserve">, clicou e digitou, pegou a senha, clicou e digitou. Ah, eu quero ver executar de novo esse teste. Clica aqui olha. Olha lá, ele rodou tudo de novo. Ah, eu quero saber o que que tinha antes do clique. Deixa o mouse </w:t>
+      </w:r>
+      <w:proofErr w:type="gramStart"/>
       <w:r>
         <w:t>lá</w:t>
       </w:r>
+      <w:proofErr w:type="gramEnd"/>
+      <w:r>
+        <w:t xml:space="preserve"> </w:t>
+      </w:r>
+      <w:proofErr w:type="spellStart"/>
+      <w:r>
+        <w:t>lá</w:t>
+      </w:r>
       <w:proofErr w:type="spellEnd"/>
       <w:r>
         <w:t xml:space="preserve">, </w:t>
@@ -5773,7 +6311,15 @@
       </w:r>
       <w:proofErr w:type="spellEnd"/>
       <w:r>
-        <w:t xml:space="preserve">, embaixo do senha, e vou colar. Então esse daqui é o </w:t>
+        <w:t xml:space="preserve">, </w:t>
+      </w:r>
+      <w:proofErr w:type="gramStart"/>
+      <w:r>
+        <w:t>embaixo do senha</w:t>
+      </w:r>
+      <w:proofErr w:type="gramEnd"/>
+      <w:r>
+        <w:t xml:space="preserve">, e vou colar. Então esse daqui é o </w:t>
       </w:r>
       <w:proofErr w:type="spellStart"/>
       <w:r>
@@ -5797,7 +6343,15 @@
       </w:r>
       <w:proofErr w:type="spellEnd"/>
       <w:r>
-        <w:t xml:space="preserve">, clicou, digitou. Pegou senha, clicou, digitou. Clicou, pegou o 0 botão aqui de entrar, clicou no botão de entrar. Olha só o aconteceu? Depois de clicar, é o antes e o depois, o antes estava na tela de login e depois foi pra realizar transferência. E o realizar transferência, realizar transferência você vai ver que ele está, olha, vou clicar aqui 1 vez nele, Se você clica, pode vir aqui e selecionar se você quer o </w:t>
+        <w:t xml:space="preserve">, clicou, digitou. Pegou senha, clicou, digitou. Clicou, pegou o 0 botão aqui de entrar, clicou no botão de entrar. Olha só o aconteceu? Depois de clicar, é o antes e o depois, o antes estava na tela de login e depois foi pra realizar transferência. E o realizar transferência, realizar transferência você vai ver que ele está, olha, vou clicar aqui 1 vez nele, </w:t>
+      </w:r>
+      <w:proofErr w:type="gramStart"/>
+      <w:r>
+        <w:t>Se</w:t>
+      </w:r>
+      <w:proofErr w:type="gramEnd"/>
+      <w:r>
+        <w:t xml:space="preserve"> você clica, pode vir aqui e selecionar se você quer o </w:t>
       </w:r>
       <w:proofErr w:type="spellStart"/>
       <w:r>
@@ -5821,7 +6375,15 @@
       </w:r>
       <w:proofErr w:type="spellEnd"/>
       <w:r>
-        <w:t xml:space="preserve">. Olha só, está tudo quebrado aqui, está vendo? Não dá pra ver o que que está escrito certinho. Por quê? Porque ainda não carregou as contas. Olha a lista de transferências, está vazia, mas eu já tenho 1 transferência. Então o que é isso daqui? Isso daqui olha, é o do BFF login, pra fazer o login, isso daqui é o do contas pra pegar todas as contas e depois carregar aqui dentro, e esse daqui é de transferências, que é pra pegar as transferências e colocar aqui dentro. Todos esses carinhas aqui são chamadas ao BFF, </w:t>
+        <w:t xml:space="preserve">. Olha só, está tudo quebrado aqui, está vendo? Não dá pra ver o que que está escrito certinho. Por quê? Porque ainda não carregou as contas. Olha a lista de transferências, está vazia, mas eu já tenho 1 transferência. Então o que é isso daqui? Isso daqui olha, é o do BFF login, pra fazer o login, isso daqui é o do contas pra pegar todas as contas e depois carregar aqui dentro, e esse daqui é de transferências, que é pra pegar as transferências e colocar aqui dentro. Todos esses carinhas aqui são </w:t>
+      </w:r>
+      <w:proofErr w:type="gramStart"/>
+      <w:r>
+        <w:t>chamadas</w:t>
+      </w:r>
+      <w:proofErr w:type="gramEnd"/>
+      <w:r>
+        <w:t xml:space="preserve"> ao BFF, </w:t>
       </w:r>
       <w:proofErr w:type="spellStart"/>
       <w:r>
@@ -5861,15 +6423,31 @@
       </w:r>
       <w:proofErr w:type="spellEnd"/>
       <w:r>
-        <w:t xml:space="preserve">, as ações e os resultados esperados. Aqui olha só o a gente tem, né? Pra fazer o login com dados válidos, olha só o que a gente tem. A gente tem aqui, barra </w:t>
-      </w:r>
-      <w:proofErr w:type="spellStart"/>
+        <w:t xml:space="preserve">, as ações e os resultados esperados. Aqui olha só o a gente tem, né? Pra fazer o login com dados válidos, olha só o que a gente tem. A gente tem aqui, </w:t>
+      </w:r>
+      <w:proofErr w:type="gramStart"/>
       <w:r>
         <w:t>barra</w:t>
       </w:r>
-      <w:proofErr w:type="spellEnd"/>
-      <w:r>
-        <w:t>, o nosso, né? Você assistiu minhas aulas de programação, você aprendeu aí sobre o, que são as nossa preparação pro nosso teste. Aqui a gente tem o, que são as ações que a gente está realizando o nosso teste. E aqui a gente tem o, que são as asserções e aqui não tem nada por enquanto. É isso daqui que a gente precisa fazer, mas a vai fazer na próxima aula, beleza? Já salvei aqui, mas lá o Cypress já rodou, está no mesmo lugar. Agora a gente tem que ir na próxima aula entender como validar que a gente de fato chegou nessa tela aqui. Se tiver gente na próxima aula.</w:t>
+      <w:proofErr w:type="gramEnd"/>
+      <w:r>
+        <w:t xml:space="preserve"> </w:t>
+      </w:r>
+      <w:proofErr w:type="spellStart"/>
+      <w:r>
+        <w:t>barra</w:t>
+      </w:r>
+      <w:proofErr w:type="spellEnd"/>
+      <w:r>
+        <w:t xml:space="preserve">, o nosso, né? Você assistiu minhas aulas de programação, você aprendeu aí sobre o, que são </w:t>
+      </w:r>
+      <w:proofErr w:type="gramStart"/>
+      <w:r>
+        <w:t>as nossa preparação</w:t>
+      </w:r>
+      <w:proofErr w:type="gramEnd"/>
+      <w:r>
+        <w:t xml:space="preserve"> pro nosso teste. Aqui a gente tem o, que são as ações que a gente está realizando o nosso teste. E aqui a gente tem o, que são as asserções e aqui não tem nada por enquanto. É isso daqui que a gente precisa fazer, mas a vai fazer na próxima aula, beleza? Já salvei aqui, mas lá o Cypress já rodou, está no mesmo lugar. Agora a gente tem que ir na próxima aula entender como validar que a gente de fato chegou nessa tela aqui. Se tiver gente na próxima aula.</w:t>
       </w:r>
     </w:p>
     <w:p>
@@ -5953,7 +6531,15 @@
       </w:r>
       <w:r>
         <w:lastRenderedPageBreak/>
-        <w:t xml:space="preserve">visitei a página, o título era login, está vendo? Agora não, agora eu quero que ele seja realizar transferência porque eu já estou dentro da página, entendeu? Então basicamente é isso que a gente vai fazer. Como? Eu vou vir aqui olha, está vendo olha? Vou pegar aqui o meu validador de elemento, ele já está com cinza claro, vou clicar aqui olha nesse elemento que é o realizar transferência, e aí quando eu olho aqui em cima, eu vejo que ele criou aqui pra gente localizador, olha o jeito que ele criou. Ele criou com esse 2 pontos </w:t>
+        <w:t xml:space="preserve">visitei a página, o título era login, está vendo? Agora não, agora eu quero que ele seja realizar transferência porque eu já estou dentro da página, entendeu? Então basicamente é isso que a gente vai fazer. Como? Eu vou vir aqui olha, está vendo olha? Vou pegar aqui o meu validador de elemento, ele já está com cinza claro, vou clicar aqui olha nesse elemento que é o realizar transferência, e aí quando eu olho aqui em cima, eu vejo que ele criou aqui pra gente localizador, olha o jeito que ele criou. Ele criou com </w:t>
+      </w:r>
+      <w:proofErr w:type="gramStart"/>
+      <w:r>
+        <w:t>esse 2 pontos</w:t>
+      </w:r>
+      <w:proofErr w:type="gramEnd"/>
+      <w:r>
+        <w:t xml:space="preserve"> </w:t>
       </w:r>
       <w:proofErr w:type="spellStart"/>
       <w:r>
@@ -6001,7 +6587,15 @@
       </w:r>
       <w:proofErr w:type="spellEnd"/>
       <w:r>
-        <w:t xml:space="preserve"> 0 que seria o login, então todos eles dentro da mesma página aqui, você não vê o login mas ele está aqui oculto, entendeu? Então, esse carinha aqui ele está falando, olha, eu estou pegando lá aquela aquele 1º aquele 1º elemento, aquele 2º elemento está ali, e lá dentro dele eu estou olhando pra elemento que tem a classe </w:t>
+        <w:t xml:space="preserve"> 0 que seria o login, então todos eles dentro da mesma página aqui, você não vê o </w:t>
+      </w:r>
+      <w:proofErr w:type="gramStart"/>
+      <w:r>
+        <w:t>login</w:t>
+      </w:r>
+      <w:proofErr w:type="gramEnd"/>
+      <w:r>
+        <w:t xml:space="preserve"> mas ele está aqui oculto, entendeu? Então, esse carinha aqui ele está falando, olha, eu estou pegando lá aquela aquele 1º aquele 1º elemento, aquele 2º elemento está ali, e lá dentro dele eu estou olhando pra elemento que tem a classe </w:t>
       </w:r>
       <w:proofErr w:type="spellStart"/>
       <w:r>
@@ -6065,7 +6659,15 @@
       </w:r>
       <w:proofErr w:type="spellEnd"/>
       <w:r>
-        <w:t xml:space="preserve">, poderia digitar, mas eu vou copiar. Copiei daqui, ok? Vou lá no meu v s </w:t>
+        <w:t xml:space="preserve">, poderia digitar, mas eu vou copiar. Copiei </w:t>
+      </w:r>
+      <w:proofErr w:type="gramStart"/>
+      <w:r>
+        <w:t>daqui, ok</w:t>
+      </w:r>
+      <w:proofErr w:type="gramEnd"/>
+      <w:r>
+        <w:t xml:space="preserve">? Vou lá no meu v s </w:t>
       </w:r>
       <w:proofErr w:type="spellStart"/>
       <w:r>
@@ -6105,7 +6707,15 @@
       </w:r>
       <w:proofErr w:type="spellEnd"/>
       <w:r>
-        <w:t xml:space="preserve"> e clico, olha só, ele já encontrou, ele marca aqui pra mim olha, coloca o mouse em cima, ele está marcando lá o realizar transferência, está vendo? Então ele achou através disso daqui, certo? Achou. Agora o que que eu faço? Se eu sei que esse é o realizar transferência, como que poderia ser a minha inserção aqui? A minha inserção aqui poderia ser ponto </w:t>
+        <w:t xml:space="preserve"> e clico, olha só, ele já encontrou, ele marca aqui pra mim olha, coloca o mouse em cima, ele está marcando lá o realizar transferência, está vendo? Então ele achou através disso </w:t>
+      </w:r>
+      <w:proofErr w:type="gramStart"/>
+      <w:r>
+        <w:t>daqui, certo</w:t>
+      </w:r>
+      <w:proofErr w:type="gramEnd"/>
+      <w:r>
+        <w:t xml:space="preserve">? Achou. Agora o que que eu faço? Se eu sei que esse é o realizar transferência, como que poderia ser a minha inserção aqui? A minha inserção aqui poderia ser ponto </w:t>
       </w:r>
       <w:proofErr w:type="spellStart"/>
       <w:r>
@@ -6357,7 +6967,15 @@
       </w:r>
       <w:proofErr w:type="spellEnd"/>
       <w:r>
-        <w:t xml:space="preserve">. Tem outros que eu posso usar? Tem outros sim. Se você vai lá na </w:t>
+        <w:t xml:space="preserve">. Tem outros que eu posso usar? Tem </w:t>
+      </w:r>
+      <w:proofErr w:type="gramStart"/>
+      <w:r>
+        <w:t>outros sim</w:t>
+      </w:r>
+      <w:proofErr w:type="gramEnd"/>
+      <w:r>
+        <w:t xml:space="preserve">. Se você vai lá na </w:t>
       </w:r>
       <w:proofErr w:type="spellStart"/>
       <w:r>
@@ -6437,12 +7055,20 @@
       </w:r>
       <w:proofErr w:type="spellEnd"/>
       <w:r>
-        <w:t xml:space="preserve"> são as nossas asserções. Então se a gente for </w:t>
-      </w:r>
-      <w:proofErr w:type="spellStart"/>
+        <w:t xml:space="preserve"> são as nossas asserções. Então se a gente </w:t>
+      </w:r>
+      <w:proofErr w:type="gramStart"/>
       <w:r>
         <w:t>for</w:t>
       </w:r>
+      <w:proofErr w:type="gramEnd"/>
+      <w:r>
+        <w:t xml:space="preserve"> </w:t>
+      </w:r>
+      <w:proofErr w:type="spellStart"/>
+      <w:r>
+        <w:t>for</w:t>
+      </w:r>
       <w:proofErr w:type="spellEnd"/>
       <w:r>
         <w:t xml:space="preserve"> vindo aqui olha, mais pra baixo, está vendo? Ele tem aqui esses </w:t>
@@ -6485,7 +7111,15 @@
       </w:r>
       <w:proofErr w:type="spellEnd"/>
       <w:r>
-        <w:t xml:space="preserve"> ou do ], está vendo? Essas são as nossas asserções. Se eu clico aqui, ele vai me mostrar todas as asserções que a gente tem olha. Do [</w:t>
+        <w:t xml:space="preserve"> ou </w:t>
+      </w:r>
+      <w:proofErr w:type="gramStart"/>
+      <w:r>
+        <w:t>do ]</w:t>
+      </w:r>
+      <w:proofErr w:type="gramEnd"/>
+      <w:r>
+        <w:t>, está vendo? Essas são as nossas asserções. Se eu clico aqui, ele vai me mostrar todas as asserções que a gente tem olha. Do [</w:t>
       </w:r>
       <w:proofErr w:type="spellStart"/>
       <w:r>
@@ -6829,7 +7463,15 @@
       </w:r>
       <w:proofErr w:type="spellEnd"/>
       <w:r>
-        <w:t xml:space="preserve"> sendo digitado, a senha sendo digitada, só que de 1 maneira incorreta, 6 5 4 3 2 ok? E aqui eu vou clicar no botão de login e aqui o que vai acontecer é algo diferente, então eu vou remover daqui por hora para que você saiba como é que a vai fazer isso, está bom? Fiz isso, dentro do Cypress a gente tem negócio que ajuda você a meio que olhar só para aquele teste que você quer testar, que é esse daqui olha, você vem aqui no ponto no it e coloca ponto </w:t>
+        <w:t xml:space="preserve"> sendo digitado, a senha sendo digitada, só que de 1 maneira incorreta, 6 5 4 3 </w:t>
+      </w:r>
+      <w:proofErr w:type="gramStart"/>
+      <w:r>
+        <w:t>2 ok</w:t>
+      </w:r>
+      <w:proofErr w:type="gramEnd"/>
+      <w:r>
+        <w:t xml:space="preserve">? E aqui eu vou clicar no botão de login e aqui o que vai acontecer é algo diferente, então eu vou remover daqui por hora para que você saiba como é que a vai fazer isso, está bom? Fiz isso, dentro do Cypress a gente tem negócio que ajuda você a meio que olhar só para aquele teste que você quer testar, que é esse daqui olha, você vem aqui no ponto no it e coloca ponto </w:t>
       </w:r>
       <w:proofErr w:type="spellStart"/>
       <w:r>
@@ -7013,7 +7655,15 @@
       </w:r>
       <w:proofErr w:type="spellEnd"/>
       <w:r>
-        <w:t xml:space="preserve">, ok? Abro parênteses aqui, e aí depois de abrir o parênteses eu vou colocar aqui 1, 1 aspas simples, e vou colocar aqui olha, o que a gente vai usar como sendo aqui o nosso </w:t>
+        <w:t xml:space="preserve">, ok? Abro parênteses aqui, e aí depois de abrir </w:t>
+      </w:r>
+      <w:proofErr w:type="gramStart"/>
+      <w:r>
+        <w:t>o parênteses</w:t>
+      </w:r>
+      <w:proofErr w:type="gramEnd"/>
+      <w:r>
+        <w:t xml:space="preserve"> eu vou colocar aqui 1, 1 aspas simples, e vou colocar aqui olha, o que a gente vai usar como sendo aqui o nosso </w:t>
       </w:r>
       <w:proofErr w:type="spellStart"/>
       <w:r>
@@ -7073,13 +7723,13 @@
       </w:r>
       <w:proofErr w:type="spellEnd"/>
       <w:r>
-        <w:t xml:space="preserve">. E isso faz com que a gente consiga ter 1 validação ainda melhor, porque apenas estar visível a gente não </w:t>
-      </w:r>
-      <w:proofErr w:type="spellStart"/>
+        <w:t xml:space="preserve">. E isso faz com que a gente consiga ter 1 validação ainda melhor, porque apenas estar visível a gente </w:t>
+      </w:r>
+      <w:proofErr w:type="gramStart"/>
       <w:r>
         <w:t>não</w:t>
       </w:r>
-      <w:proofErr w:type="spellEnd"/>
+      <w:proofErr w:type="gramEnd"/>
       <w:r>
         <w:t xml:space="preserve"> </w:t>
       </w:r>
@@ -7089,6 +7739,14 @@
       </w:r>
       <w:proofErr w:type="spellEnd"/>
       <w:r>
+        <w:t xml:space="preserve"> </w:t>
+      </w:r>
+      <w:proofErr w:type="spellStart"/>
+      <w:r>
+        <w:t>não</w:t>
+      </w:r>
+      <w:proofErr w:type="spellEnd"/>
+      <w:r>
         <w:t xml:space="preserve"> garante que a mensagem que foi apresentada aqui é a mensagem correta, entende? Então eu posso vir aqui e colocar </w:t>
       </w:r>
       <w:proofErr w:type="spellStart"/>
@@ -7209,7 +7867,15 @@
       </w:r>
       <w:proofErr w:type="spellEnd"/>
       <w:r>
-        <w:t xml:space="preserve"> ele vai já verificar se o texto que está lá dentro é aquele texto que você esperava, mas você pode descer aqui e olhar outras coisas que ele tem também, Está vendo, </w:t>
+        <w:t xml:space="preserve"> ele vai já verificar se o texto que está lá dentro é aquele texto que você esperava, mas você pode descer aqui e olhar outras coisas que ele tem também, </w:t>
+      </w:r>
+      <w:proofErr w:type="gramStart"/>
+      <w:r>
+        <w:t>Está</w:t>
+      </w:r>
+      <w:proofErr w:type="gramEnd"/>
+      <w:r>
+        <w:t xml:space="preserve"> vendo, </w:t>
       </w:r>
       <w:proofErr w:type="spellStart"/>
       <w:r>
@@ -7385,7 +8051,15 @@
       </w:r>
       <w:proofErr w:type="spellEnd"/>
       <w:r>
-        <w:t xml:space="preserve">. Oi. Está vendo? Venho aqui no Cypress, eu vou fechar. Oi, mãe. Vou salvar aquele texto, aquele nosso teste. Está vendo? Ah, não, você não colocar nada, não. Não vai ver nada, Já começou a executar. Volto lá pro Cypress. Olha só. Está bom. Dessa vez ele veio aqui. Está vendo? Foi rodou tudo isso, fez 1 inserção e a inserção que apareceu está escrito olha, erro no login, tente novamente. Então, ou seja, o que a gente fez aqui? A gente fez teste, que ele faz a, tenta fazer o login aqui com o login incorreto e apresenta a mensagem erro no login, tente novamente. E agora a gente tem aqui então 2 testes. Teste do login com dados válidos e o teste com o login com dados inválidos, ok? E aí na aula passada eu mostrei pra você o a diferença entre o </w:t>
+        <w:t xml:space="preserve">. Oi. Está vendo? Venho aqui no Cypress, eu vou fechar. Oi, mãe. Vou salvar aquele texto, aquele nosso teste. Está vendo? Ah, não, você não colocar nada, não. Não vai ver nada, </w:t>
+      </w:r>
+      <w:proofErr w:type="gramStart"/>
+      <w:r>
+        <w:t>Já</w:t>
+      </w:r>
+      <w:proofErr w:type="gramEnd"/>
+      <w:r>
+        <w:t xml:space="preserve"> começou a executar. Volto lá pro Cypress. Olha só. Está bom. Dessa vez ele veio aqui. Está vendo? Foi rodou tudo isso, fez 1 inserção e a inserção que apareceu está escrito olha, erro no login, tente novamente. Então, ou seja, o que a gente fez aqui? A gente fez teste, que ele faz a, tenta fazer o login aqui com o login incorreto e apresenta a mensagem erro no login, tente novamente. E agora a gente tem aqui então 2 testes. Teste do login com dados válidos e o teste com o login com dados inválidos, ok? E aí na aula passada eu mostrei pra você o a diferença entre o </w:t>
       </w:r>
       <w:proofErr w:type="spellStart"/>
       <w:r>
@@ -7544,10 +8218,12 @@
         <w:t xml:space="preserve">, com o </w:t>
       </w:r>
       <w:proofErr w:type="spellStart"/>
+      <w:proofErr w:type="gramStart"/>
       <w:r>
         <w:t>Cy.contents</w:t>
       </w:r>
       <w:proofErr w:type="spellEnd"/>
+      <w:proofErr w:type="gramEnd"/>
       <w:r>
         <w:t xml:space="preserve"> você pode fazer esse tipo de ação aqui pra deixar o seu comando pouco mais descritivo. Então eu vou copiar daqui, vou colar aqui em cima também porque eu, puxa, gostei muito mais desse aqui, está vendo? Salvar, né? Opa, só está rodando teste. Por que que só está rodando teste? Porque eu coloquei o </w:t>
       </w:r>
@@ -7844,7 +8520,15 @@
       </w:r>
       <w:proofErr w:type="spellEnd"/>
       <w:r>
-        <w:t xml:space="preserve"> são funções especiais que ajuda você a conseguir então interagir antes ou depois de certos eventos que podem acontecer no decorrer da execução dos seus testes automatizados. Como eu já mencionei aqui, o Cypress utiliza framework chamado Mocha, para fazer a estrutura dos testes. É Mocha que dá o super poder pro Cypress de ter a função </w:t>
+        <w:t xml:space="preserve"> são funções especiais que ajuda você a conseguir então interagir antes ou depois de certos eventos que podem acontecer no decorrer da execução dos seus testes automatizados. Como eu já mencionei aqui, o Cypress utiliza framework chamado Mocha, para fazer a estrutura dos testes. </w:t>
+      </w:r>
+      <w:proofErr w:type="gramStart"/>
+      <w:r>
+        <w:t>É Mocha</w:t>
+      </w:r>
+      <w:proofErr w:type="gramEnd"/>
+      <w:r>
+        <w:t xml:space="preserve"> que dá o super poder pro Cypress de ter a função </w:t>
       </w:r>
       <w:proofErr w:type="spellStart"/>
       <w:r>
@@ -7984,7 +8668,15 @@
       </w:r>
       <w:proofErr w:type="spellEnd"/>
       <w:r>
-        <w:t xml:space="preserve"> vazio por exemplo, eu já detecto que algo que é de fato constante aqui é essa questão da do acesso à página principal, isso daqui vai ser o mesmo, independente de qual seja o teste de login, porque para fazer login, eu preciso acessar essa página, não tem outra forma de fazer login sem acessar a página, entendeu o eu quero dizer? Então é isso que eu quero mostrar pra você agora, como que a gente faz isso né, então, eu já comecei a alterar aqui, o que eu vou fazer? Vou vir aqui olha, e vou recortar isso daqui e vou colar aqui dentro, vendo? Colei aqui dentro. Pronto, a partir de agora, aquela aquele acesso, aquele site ponto </w:t>
+        <w:t xml:space="preserve"> vazio por exemplo, eu já detecto que algo que é de fato constante aqui é essa questão da do acesso à página principal, isso daqui vai ser o mesmo, independente de qual seja o teste de login, porque para fazer login, eu preciso acessar essa página, não tem outra forma de fazer login sem acessar a página, entendeu o eu quero dizer? Então é isso que eu quero mostrar pra você agora, como que a gente faz isso né, então, eu já comecei a alterar aqui, o que eu vou fazer? Vou vir aqui olha, e vou recortar isso daqui e vou colar aqui dentro, vendo? Colei aqui dentro. Pronto, a partir de agora, </w:t>
+      </w:r>
+      <w:proofErr w:type="gramStart"/>
+      <w:r>
+        <w:t>aquela aquele acesso</w:t>
+      </w:r>
+      <w:proofErr w:type="gramEnd"/>
+      <w:r>
+        <w:t xml:space="preserve">, aquele site ponto </w:t>
       </w:r>
       <w:proofErr w:type="spellStart"/>
       <w:r>
@@ -8771,12 +9463,20 @@
       </w:r>
       <w:proofErr w:type="spellEnd"/>
       <w:r>
-        <w:t xml:space="preserve"> ainda, gente não </w:t>
-      </w:r>
-      <w:proofErr w:type="spellStart"/>
+        <w:t xml:space="preserve"> ainda, gente </w:t>
+      </w:r>
+      <w:proofErr w:type="gramStart"/>
       <w:r>
         <w:t>não</w:t>
       </w:r>
+      <w:proofErr w:type="gramEnd"/>
+      <w:r>
+        <w:t xml:space="preserve"> </w:t>
+      </w:r>
+      <w:proofErr w:type="spellStart"/>
+      <w:r>
+        <w:t>não</w:t>
+      </w:r>
       <w:proofErr w:type="spellEnd"/>
       <w:r>
         <w:t xml:space="preserve"> trabalhou com isso ainda, tá. Vídeo, está vendo? Não gravou vídeo, duração foi 4 segundos, está vendo? Então ele mostra aqui. Legal, né? Agora olha só o que acontece quando eu faço isso daqui, olha, coloco pra cima, e aqui eu venho de espaço e coloco traço, traço, </w:t>
@@ -8835,12 +9535,20 @@
       </w:r>
       <w:proofErr w:type="spellEnd"/>
       <w:r>
-        <w:t xml:space="preserve"> em específica, né? Se você quisesse rodar teste específico, você poderia colocar traço </w:t>
-      </w:r>
-      <w:proofErr w:type="spellStart"/>
+        <w:t xml:space="preserve"> em específica, né? Se você quisesse rodar teste específico, você poderia colocar </w:t>
+      </w:r>
+      <w:proofErr w:type="gramStart"/>
       <w:r>
         <w:t>traço</w:t>
       </w:r>
+      <w:proofErr w:type="gramEnd"/>
+      <w:r>
+        <w:t xml:space="preserve"> </w:t>
+      </w:r>
+      <w:proofErr w:type="spellStart"/>
+      <w:r>
+        <w:t>traço</w:t>
+      </w:r>
       <w:proofErr w:type="spellEnd"/>
       <w:r>
         <w:t xml:space="preserve"> </w:t>
@@ -8859,7 +9567,15 @@
       </w:r>
       <w:proofErr w:type="spellEnd"/>
       <w:r>
-        <w:t xml:space="preserve"> em específico, né? Você vai vir aqui e vai ver outro olha. Você pode escolher o browser usando o traço </w:t>
+        <w:t xml:space="preserve"> em específico, né? Você vai vir aqui e vai ver outro olha. Você pode escolher o browser usando o </w:t>
+      </w:r>
+      <w:proofErr w:type="gramStart"/>
+      <w:r>
+        <w:t>traço</w:t>
+      </w:r>
+      <w:proofErr w:type="gramEnd"/>
+      <w:r>
+        <w:t xml:space="preserve"> </w:t>
       </w:r>
       <w:proofErr w:type="spellStart"/>
       <w:r>
@@ -9119,7 +9835,15 @@
       </w:r>
       <w:proofErr w:type="spellEnd"/>
       <w:r>
-        <w:t xml:space="preserve"> Cypress como sendo o meu framework de execução de testes, que eu vou fazer? Ao invés de teste eco, eu vou fazer isso daqui, eu vou apagar isso e vou digitar isso daqui olha, Cypress </w:t>
+        <w:t xml:space="preserve"> Cypress como sendo o meu framework de execução de testes, que eu vou fazer? Ao invés de teste eco, eu vou fazer isso </w:t>
+      </w:r>
+      <w:proofErr w:type="gramStart"/>
+      <w:r>
+        <w:t>daqui, eu</w:t>
+      </w:r>
+      <w:proofErr w:type="gramEnd"/>
+      <w:r>
+        <w:t xml:space="preserve"> vou apagar isso e vou digitar isso daqui olha, Cypress </w:t>
       </w:r>
       <w:proofErr w:type="spellStart"/>
       <w:r>
@@ -9247,7 +9971,15 @@
       </w:r>
       <w:proofErr w:type="spellEnd"/>
       <w:r>
-        <w:t xml:space="preserve">, E aqui eu vou colocar traço </w:t>
+        <w:t xml:space="preserve">, E aqui eu vou colocar </w:t>
+      </w:r>
+      <w:proofErr w:type="gramStart"/>
+      <w:r>
+        <w:t>traço</w:t>
+      </w:r>
+      <w:proofErr w:type="gramEnd"/>
+      <w:r>
+        <w:t xml:space="preserve"> </w:t>
       </w:r>
       <w:proofErr w:type="spellStart"/>
       <w:r>
@@ -9483,15 +10215,31 @@
       </w:r>
       <w:proofErr w:type="spellEnd"/>
       <w:r>
-        <w:t xml:space="preserve">. O valor padrão dele quando ele, ou não é ponto vírgula </w:t>
-      </w:r>
-      <w:proofErr w:type="spellStart"/>
+        <w:t xml:space="preserve">. O valor padrão dele quando ele, ou não é ponto </w:t>
+      </w:r>
+      <w:proofErr w:type="gramStart"/>
       <w:r>
         <w:t>vírgula</w:t>
       </w:r>
-      <w:proofErr w:type="spellEnd"/>
-      <w:r>
-        <w:t xml:space="preserve">, o valor o valor padrão dele quando você não descreve ele dentro desse arquivo é falso, por isso que ele não gera nenhum vídeo. Aqui você vai ver que ainda passa </w:t>
+      <w:proofErr w:type="gramEnd"/>
+      <w:r>
+        <w:t xml:space="preserve"> </w:t>
+      </w:r>
+      <w:proofErr w:type="spellStart"/>
+      <w:r>
+        <w:t>vírgula</w:t>
+      </w:r>
+      <w:proofErr w:type="spellEnd"/>
+      <w:r>
+        <w:t xml:space="preserve">, o valor o valor padrão dele quando você não </w:t>
+      </w:r>
+      <w:proofErr w:type="gramStart"/>
+      <w:r>
+        <w:t>descreve ele</w:t>
+      </w:r>
+      <w:proofErr w:type="gramEnd"/>
+      <w:r>
+        <w:t xml:space="preserve"> dentro desse arquivo é falso, por isso que ele não gera nenhum vídeo. Aqui você vai ver que ainda passa </w:t>
       </w:r>
       <w:proofErr w:type="spellStart"/>
       <w:r>
@@ -9539,7 +10287,15 @@
       </w:r>
       <w:proofErr w:type="spellEnd"/>
       <w:r>
-        <w:t xml:space="preserve">, mas olha só, aqui já apareceu o pasta vídeos, e já ficou verde porque tem arquivo de vídeo aqui dentro. 2 testes passaram, tudo funcionou. Quando eu venho aqui pra passa-vídeos, olha só, tem vídeo aqui da execução. Então se eu clico aqui, dou play. Rodou o 1º, rodou o 2º. Está vendo? Então aqui ele gravou de fato o vídeo pra mim, certo? Se eu venho aqui e executo novamente, vai lá, está executando. Ele </w:t>
+        <w:t xml:space="preserve">, mas olha só, aqui já apareceu </w:t>
+      </w:r>
+      <w:proofErr w:type="gramStart"/>
+      <w:r>
+        <w:t>o pasta</w:t>
+      </w:r>
+      <w:proofErr w:type="gramEnd"/>
+      <w:r>
+        <w:t xml:space="preserve"> vídeos, e já ficou verde porque tem arquivo de vídeo aqui dentro. 2 testes passaram, tudo funcionou. Quando eu venho aqui pra passa-vídeos, olha só, tem vídeo aqui da execução. Então se eu clico aqui, dou play. Rodou o 1º, rodou o 2º. Está vendo? Então aqui ele gravou de fato o vídeo pra mim, certo? Se eu venho aqui e executo novamente, vai lá, está executando. Ele </w:t>
       </w:r>
       <w:proofErr w:type="spellStart"/>
       <w:r>
@@ -9623,7 +10379,15 @@
       </w:r>
       <w:proofErr w:type="spellEnd"/>
       <w:r>
-        <w:t xml:space="preserve">, JSE aqui tem esse arquivo login. Eu abri ele, você vai ver que aqui olha, o desenvolvedor tem a possibilidade de colocar que fala alguma coisa quando dá erro, está vendo? Por enquanto dá erro no login, tente novamente. Vamos dizer que eu sou o desenvolvedor e eu errei feio aqui, eu falei, </w:t>
+        <w:t xml:space="preserve">, JSE aqui tem esse arquivo login. Eu </w:t>
+      </w:r>
+      <w:proofErr w:type="gramStart"/>
+      <w:r>
+        <w:t>abri ele</w:t>
+      </w:r>
+      <w:proofErr w:type="gramEnd"/>
+      <w:r>
+        <w:t xml:space="preserve">, você vai ver que aqui olha, o desenvolvedor tem a possibilidade de colocar que fala alguma coisa quando dá erro, está vendo? Por enquanto dá erro no login, tente novamente. Vamos dizer que eu sou o desenvolvedor e eu errei feio aqui, eu falei, </w:t>
       </w:r>
       <w:proofErr w:type="spellStart"/>
       <w:r>
@@ -9735,12 +10499,20 @@
       </w:r>
       <w:proofErr w:type="spellEnd"/>
       <w:r>
-        <w:t xml:space="preserve">, vai ter vários. Então o que eu vou fazer? Vou vir aqui e vou desabilitar essa questão do vídeo. Basta você remover daqui ou marcar com false, está bom? Movi, salvei, tudo certo? Vou fechar essa parte do também que já está certo. Vamos ver aqui, vou rodar NPM teste. Está rodando, você vai ver aqui </w:t>
-      </w:r>
-      <w:proofErr w:type="spellStart"/>
+        <w:t xml:space="preserve">, vai ter vários. Então o que eu vou fazer? Vou vir aqui e vou desabilitar essa questão do vídeo. Basta você remover daqui ou marcar com false, está bom? Movi, salvei, tudo certo? Vou fechar essa parte do também que já está certo. Vamos ver aqui, vou rodar NPM teste. Está rodando, você vai ver </w:t>
+      </w:r>
+      <w:proofErr w:type="gramStart"/>
       <w:r>
         <w:t>aqui</w:t>
       </w:r>
+      <w:proofErr w:type="gramEnd"/>
+      <w:r>
+        <w:t xml:space="preserve"> </w:t>
+      </w:r>
+      <w:proofErr w:type="spellStart"/>
+      <w:r>
+        <w:t>aqui</w:t>
+      </w:r>
       <w:proofErr w:type="spellEnd"/>
       <w:r>
         <w:t xml:space="preserve"> já apagou o vídeo, não tem mais de </w:t>
@@ -9759,7 +10531,15 @@
       </w:r>
       <w:proofErr w:type="spellEnd"/>
       <w:r>
-        <w:t xml:space="preserve"> manualmente, quando fala. Movi, salvei, certo? Vou vir aqui vou fechar essa parte do também que já está certo. Vou vir aqui vou rodar NTM teste. Está rodando, mas aqui </w:t>
+        <w:t xml:space="preserve"> manualmente, quando fala. Movi, salvei, certo? Vou vir aqui vou fechar essa parte do também que já está certo. Vou vir aqui vou rodar NTM teste. Está rodando, mas </w:t>
+      </w:r>
+      <w:proofErr w:type="gramStart"/>
+      <w:r>
+        <w:t>aqui</w:t>
+      </w:r>
+      <w:proofErr w:type="gramEnd"/>
+      <w:r>
+        <w:t xml:space="preserve"> </w:t>
       </w:r>
       <w:proofErr w:type="spellStart"/>
       <w:r>
@@ -9962,7 +10742,31 @@
       </w:r>
       <w:proofErr w:type="spellEnd"/>
       <w:r>
-        <w:t xml:space="preserve">, vou colocar aqui. E sua senha que vou mudar pra 6 5 4 3 2 A estrutura do objeto você define, está bom? Mas você tem que escrever, né, nesse formato JSON. Fiz isso, agora já tem aqui objeto que é o válida e outro que é o inválida. Se eu quiser acessar o usuário seria válida ponto usuário, por quê? Porque eu tenho objeto aqui. A forma com que eu acesso a propriedade usuário é pegando a propriedade pai, fazendo ponto usuário, a senha, válida ponto senha, mesma coisa que o inválida. Invalida ponto usuário, inválida ponto senha, está bom? E agora a gente volta lá pro script, e aqui olha, a gente vai fazer o seguinte. Está vendo aqui esses 2 lugares onde a gente quer utilizar as credenciais? A gente já viu aqui, vou dar </w:t>
+        <w:t xml:space="preserve">, vou colocar aqui. E sua senha que vou mudar pra 6 5 4 3 2 A estrutura do objeto você define, está bom? Mas você tem que escrever, né, nesse formato JSON. Fiz isso, agora já tem aqui objeto que é </w:t>
+      </w:r>
+      <w:proofErr w:type="gramStart"/>
+      <w:r>
+        <w:t>o válida</w:t>
+      </w:r>
+      <w:proofErr w:type="gramEnd"/>
+      <w:r>
+        <w:t xml:space="preserve"> e outro que é </w:t>
+      </w:r>
+      <w:proofErr w:type="gramStart"/>
+      <w:r>
+        <w:t>o inválida</w:t>
+      </w:r>
+      <w:proofErr w:type="gramEnd"/>
+      <w:r>
+        <w:t xml:space="preserve">. Se eu quiser acessar o usuário seria válida ponto usuário, por quê? Porque eu tenho objeto aqui. A forma com que eu acesso a propriedade usuário é pegando a propriedade pai, fazendo ponto usuário, a senha, </w:t>
+      </w:r>
+      <w:proofErr w:type="gramStart"/>
+      <w:r>
+        <w:t>válida ponto</w:t>
+      </w:r>
+      <w:proofErr w:type="gramEnd"/>
+      <w:r>
+        <w:t xml:space="preserve"> senha, mesma coisa que o inválida. Invalida ponto usuário, inválida ponto senha, está bom? E agora a gente volta lá pro script, e aqui olha, a gente vai fazer o seguinte. Está vendo aqui esses 2 lugares onde a gente quer utilizar as credenciais? A gente já viu aqui, vou dar </w:t>
       </w:r>
       <w:proofErr w:type="spellStart"/>
       <w:r>
@@ -10098,7 +10902,23 @@
       </w:r>
       <w:proofErr w:type="spellEnd"/>
       <w:r>
-        <w:t xml:space="preserve">? Está aqui olha, está vendo? Usuário válida, né? Então, se o arquivo é credenciais, ponto válida entra aqui, ponto usuário entra aqui. Está lá. Agora eu venho aqui olha, copio esse e altero aqui a senha apagando aspas simples, credenciais válida, vou colocar aqui, senha. Vou fazer a mesma coisa no arquivo de baixo olha, está vendo? Dá espacinho aqui, vou pegar esses 2 aqui e jogar pra frente, Vou vir aqui e colocar, sai ponto </w:t>
+        <w:t xml:space="preserve">? Está aqui olha, está vendo? Usuário válida, né? Então, se o arquivo é credenciais, ponto válida entra aqui, ponto usuário entra aqui. Está lá. Agora eu venho aqui olha, copio esse e altero aqui a senha apagando aspas simples, </w:t>
+      </w:r>
+      <w:proofErr w:type="gramStart"/>
+      <w:r>
+        <w:t>credenciais válida</w:t>
+      </w:r>
+      <w:proofErr w:type="gramEnd"/>
+      <w:r>
+        <w:t xml:space="preserve">, vou colocar aqui, senha. Vou fazer a mesma coisa no arquivo de baixo olha, está vendo? Dá espacinho aqui, vou pegar esses 2 aqui e jogar pra frente, </w:t>
+      </w:r>
+      <w:proofErr w:type="gramStart"/>
+      <w:r>
+        <w:t>Vou</w:t>
+      </w:r>
+      <w:proofErr w:type="gramEnd"/>
+      <w:r>
+        <w:t xml:space="preserve"> vir aqui e colocar, sai ponto </w:t>
       </w:r>
       <w:proofErr w:type="spellStart"/>
       <w:r>
@@ -10130,11 +10950,19 @@
       </w:r>
       <w:proofErr w:type="spellEnd"/>
       <w:r>
-        <w:t xml:space="preserve">. Coloco aqui o nome, credenciais, está vendo? Coloco a flechinha. Pego aqui o fechar do, da chave e do </w:t>
+        <w:t xml:space="preserve">. Coloco aqui o nome, credenciais, está vendo? Coloco a flechinha. Pego aqui o fechar do, da chave e </w:t>
+      </w:r>
+      <w:proofErr w:type="gramStart"/>
+      <w:r>
+        <w:t xml:space="preserve">do </w:t>
       </w:r>
       <w:r>
         <w:lastRenderedPageBreak/>
-        <w:t xml:space="preserve">parênteses, coloco aqui embaixo, que eu estou circundando essa parte, porque é aqui que eu estou usando os dados. Vem aqui olha, Júlio ponto Lima, credenciais ponto, agora vai mudar, né? Inválida ponto usuário. Credenciais ponto inválida ponto usuário. Copio daqui e colo aqui embaixo. Credenciais ponto inválida, senha. Pronto, salvei. Agora eu vou vir aqui olha, e vou fazer NPM, </w:t>
+        <w:t>parênteses</w:t>
+      </w:r>
+      <w:proofErr w:type="gramEnd"/>
+      <w:r>
+        <w:t xml:space="preserve">, coloco aqui embaixo, que eu estou circundando essa parte, porque é aqui que eu estou usando os dados. Vem aqui olha, Júlio ponto Lima, credenciais ponto, agora vai mudar, né? Inválida ponto usuário. Credenciais ponto inválida ponto usuário. Copio daqui e colo aqui embaixo. Credenciais ponto inválida, senha. Pronto, salvei. Agora eu vou vir aqui olha, e vou fazer NPM, </w:t>
       </w:r>
       <w:proofErr w:type="spellStart"/>
       <w:r>
@@ -10182,7 +11010,15 @@
       </w:r>
       <w:proofErr w:type="spellEnd"/>
       <w:r>
-        <w:t xml:space="preserve">, ok? E se em algum momento eu tivesse que alterar esse essa credencial válida, viria aqui no credenciais ponto </w:t>
+        <w:t xml:space="preserve">, ok? E se em algum momento eu tivesse que alterar </w:t>
+      </w:r>
+      <w:proofErr w:type="gramStart"/>
+      <w:r>
+        <w:t>esse essa credencial válida</w:t>
+      </w:r>
+      <w:proofErr w:type="gramEnd"/>
+      <w:r>
+        <w:t xml:space="preserve">, viria aqui no credenciais ponto </w:t>
       </w:r>
       <w:proofErr w:type="spellStart"/>
       <w:r>
@@ -10350,7 +11186,15 @@
       </w:r>
       <w:proofErr w:type="spellEnd"/>
       <w:r>
-        <w:t xml:space="preserve">. Está vendo? Tudo aqui muda. Esse daqui já fica cinza porque, Porque a partir de agora, isso daqui nem entra pra gente no </w:t>
+        <w:t xml:space="preserve">. Está vendo? Tudo aqui muda. Esse daqui já fica cinza porque, </w:t>
+      </w:r>
+      <w:proofErr w:type="gramStart"/>
+      <w:r>
+        <w:t>Porque</w:t>
+      </w:r>
+      <w:proofErr w:type="gramEnd"/>
+      <w:r>
+        <w:t xml:space="preserve"> a partir de agora, isso daqui nem entra pra gente no </w:t>
       </w:r>
       <w:proofErr w:type="spellStart"/>
       <w:r>
@@ -10374,7 +11218,15 @@
       </w:r>
       <w:proofErr w:type="spellEnd"/>
       <w:r>
-        <w:t xml:space="preserve"> ignore porque a gente mudou ele. O sai ponto login ponto sai e o credenciais. Vou vir aqui? Eu vou fazer </w:t>
+        <w:t xml:space="preserve"> ignore porque a gente </w:t>
+      </w:r>
+      <w:proofErr w:type="gramStart"/>
+      <w:r>
+        <w:t>mudou ele</w:t>
+      </w:r>
+      <w:proofErr w:type="gramEnd"/>
+      <w:r>
+        <w:t xml:space="preserve">. O sai ponto login ponto sai e o credenciais. Vou vir aqui? Eu vou fazer </w:t>
       </w:r>
       <w:proofErr w:type="spellStart"/>
       <w:r>
@@ -10701,20 +11553,38 @@
       </w:r>
       <w:proofErr w:type="spellEnd"/>
       <w:r>
-        <w:t xml:space="preserve"> e esperar a galera do time, né, aprovar o PR pra depois isso, né, a gente conseguir fazer essa mudança. Não, não dá pra ser assim, entende? Tem que ter 1 forma que você consegue mudar dado como esse rápido, entende? Sem alterar o script. Pegou aqui o ponto? Então quando você tem alguma informação dentro do seu teste que você quer alterar, sabe, de 1 execução pra outra, sem alterar o script, é quando você vai usar esse recurso que a gente vai aprender hoje que são variáveis de ambiente. Como que a gente usa elas? Vou te mostrar 1º aqui, né? Veja, isso daqui é a variável, isso daqui é o valor que a gente quer que seja variável, certo? A cada execução e que a gente não quer ficar mexendo nesse código o tempo todo. Então o que eu vou fazer? Vou copiar esse valor daqui, vou ir lá pro meu </w:t>
-      </w:r>
-      <w:proofErr w:type="spellStart"/>
+        <w:t xml:space="preserve"> e esperar a galera do time, né, aprovar o PR pra depois isso, né, a gente conseguir fazer essa mudança. Não, não dá pra ser assim, entende? Tem que ter 1 forma que você consegue mudar dado como esse rápido, entende? Sem alterar o script. Pegou aqui o ponto? Então quando você tem alguma informação dentro do seu teste que você quer alterar, sabe, de 1 execução pra outra, sem alterar o script, é quando você vai usar esse recurso que a gente vai aprender hoje que são variáveis de ambiente. Como que a gente </w:t>
+      </w:r>
+      <w:proofErr w:type="gramStart"/>
+      <w:r>
+        <w:t>usa elas</w:t>
+      </w:r>
+      <w:proofErr w:type="gramEnd"/>
+      <w:r>
+        <w:t xml:space="preserve">? Vou te mostrar 1º aqui, né? Veja, isso daqui é a variável, isso daqui é o valor que a gente quer que seja variável, certo? A cada execução e que a gente não quer ficar mexendo nesse código o tempo todo. Então o que eu vou fazer? Vou copiar esse valor daqui, vou ir lá pro meu </w:t>
+      </w:r>
+      <w:proofErr w:type="spellStart"/>
+      <w:proofErr w:type="gramStart"/>
       <w:r>
         <w:t>package.json</w:t>
       </w:r>
       <w:proofErr w:type="spellEnd"/>
-      <w:r>
-        <w:t xml:space="preserve">, ok? E eu tenho aqui esse meu teste, vamos dizer que esse meu teste ele vai rodar, sempre quando eu chamar n p m teste ele está rodando os testes localmente, ou seja, estou na minha máquina rodando aqui no meu computador, beleza? Então se ele vai ser sempre localmente, que eu vou fazer? Vou vir aqui e vou digitar isso olha, traço </w:t>
-      </w:r>
-      <w:proofErr w:type="spellStart"/>
+      <w:proofErr w:type="gramEnd"/>
+      <w:r>
+        <w:t xml:space="preserve">, ok? E eu tenho aqui esse meu teste, vamos dizer que esse meu teste ele vai rodar, sempre quando eu chamar n p m teste ele está rodando os testes localmente, ou seja, estou na minha máquina rodando aqui no meu computador, beleza? Então se ele vai ser sempre localmente, que eu vou fazer? Vou vir aqui e vou digitar isso olha, </w:t>
+      </w:r>
+      <w:proofErr w:type="gramStart"/>
       <w:r>
         <w:t>traço</w:t>
       </w:r>
+      <w:proofErr w:type="gramEnd"/>
+      <w:r>
+        <w:t xml:space="preserve"> </w:t>
+      </w:r>
+      <w:proofErr w:type="spellStart"/>
+      <w:r>
+        <w:t>traço</w:t>
+      </w:r>
       <w:proofErr w:type="spellEnd"/>
       <w:r>
         <w:t xml:space="preserve"> </w:t>
@@ -10853,7 +11723,15 @@
       </w:r>
       <w:proofErr w:type="spellEnd"/>
       <w:r>
-        <w:t xml:space="preserve"> que foi enviado aí durante a execução do comando? Tem. Qual que é as, qual que a variável que eu quero usar lá? Quero usar a variável URL, então, copio daqui a variável URL e coloco aqui dentro do parênteses, olha. Pronto. Então agora, isso daqui olha, nunca mais muda. Se eu quiser agora criar outro ambiente, por exemplo, ambiente de QA, que eu vou fazer? Vou vir aqui olha, vou copiar aqui o teste </w:t>
+        <w:t xml:space="preserve"> que foi enviado aí durante a execução do comando? Tem. Qual que é as, qual que a variável que eu quero usar lá? Quero usar a variável URL, então, copio daqui a variável URL e coloco aqui </w:t>
+      </w:r>
+      <w:proofErr w:type="gramStart"/>
+      <w:r>
+        <w:t>dentro do parênteses</w:t>
+      </w:r>
+      <w:proofErr w:type="gramEnd"/>
+      <w:r>
+        <w:t xml:space="preserve">, olha. Pronto. Então agora, isso daqui olha, nunca mais muda. Se eu quiser agora criar outro ambiente, por exemplo, ambiente de QA, que eu vou fazer? Vou vir aqui olha, vou copiar aqui o teste </w:t>
       </w:r>
       <w:proofErr w:type="spellStart"/>
       <w:r>
@@ -10861,7 +11739,15 @@
       </w:r>
       <w:proofErr w:type="spellEnd"/>
       <w:r>
-        <w:t xml:space="preserve">, colocar aqui em cima, Vamos dizer que fosse teste q a, está vendo? Aí aqui tivesse endereço que fosse, por exemplo, q a </w:t>
+        <w:t xml:space="preserve">, colocar aqui em cima, </w:t>
+      </w:r>
+      <w:proofErr w:type="gramStart"/>
+      <w:r>
+        <w:t>Vamos</w:t>
+      </w:r>
+      <w:proofErr w:type="gramEnd"/>
+      <w:r>
+        <w:t xml:space="preserve"> dizer que fosse teste q a, está vendo? Aí aqui tivesse endereço que fosse, por exemplo, q a </w:t>
       </w:r>
       <w:proofErr w:type="spellStart"/>
       <w:r>
@@ -10917,7 +11803,15 @@
       </w:r>
       <w:proofErr w:type="spellEnd"/>
       <w:r>
-        <w:t xml:space="preserve"> traço q a, ele iria então apontar aqui para q a </w:t>
+        <w:t xml:space="preserve"> traço q </w:t>
+      </w:r>
+      <w:proofErr w:type="gramStart"/>
+      <w:r>
+        <w:t>a, ele</w:t>
+      </w:r>
+      <w:proofErr w:type="gramEnd"/>
+      <w:r>
+        <w:t xml:space="preserve"> iria então apontar aqui para q a </w:t>
       </w:r>
       <w:proofErr w:type="spellStart"/>
       <w:r>
@@ -10933,7 +11827,15 @@
       </w:r>
       <w:proofErr w:type="spellEnd"/>
       <w:r>
-        <w:t xml:space="preserve"> ponto </w:t>
+        <w:t xml:space="preserve"> </w:t>
+      </w:r>
+      <w:proofErr w:type="gramStart"/>
+      <w:r>
+        <w:t>ponto</w:t>
+      </w:r>
+      <w:proofErr w:type="gramEnd"/>
+      <w:r>
+        <w:t xml:space="preserve"> </w:t>
       </w:r>
       <w:proofErr w:type="spellStart"/>
       <w:r>
@@ -11317,7 +12219,23 @@
       </w:r>
       <w:proofErr w:type="spellEnd"/>
       <w:r>
-        <w:t xml:space="preserve"> ponto b r. Então o que a gente pode colocar? Colocar dentro do base URL o aquele aquela parte do endereço que não muda, entendeu? Isso contribui muito para que você possa poupar </w:t>
+        <w:t xml:space="preserve"> ponto b r. Então o que a gente pode colocar? Colocar dentro do base URL o </w:t>
+      </w:r>
+      <w:proofErr w:type="gramStart"/>
+      <w:r>
+        <w:t>aquele aquela parte</w:t>
+      </w:r>
+      <w:proofErr w:type="gramEnd"/>
+      <w:r>
+        <w:t xml:space="preserve"> do endereço que não muda, entendeu? Isso contribui muito para que você possa </w:t>
+      </w:r>
+      <w:proofErr w:type="gramStart"/>
+      <w:r>
+        <w:t>poupar</w:t>
+      </w:r>
+      <w:proofErr w:type="gramEnd"/>
+      <w:r>
+        <w:t xml:space="preserve"> </w:t>
       </w:r>
       <w:proofErr w:type="spellStart"/>
       <w:r>
@@ -11361,12 +12279,28 @@
       </w:r>
       <w:proofErr w:type="spellEnd"/>
       <w:r>
-        <w:t xml:space="preserve"> aqui a abertura do objeto na linha de baixo, colo base URL. Coloco aqui o 2 pontos, abre e fecha aspas simples, vírgula. O que eu coloco aqui dentro? Coloca o URL, h t e t p, 2 pontos barra </w:t>
-      </w:r>
-      <w:proofErr w:type="spellStart"/>
+        <w:t xml:space="preserve"> aqui a abertura do objeto na linha de baixo, colo base URL. Coloco aqui </w:t>
+      </w:r>
+      <w:proofErr w:type="gramStart"/>
+      <w:r>
+        <w:t>o 2 pontos</w:t>
+      </w:r>
+      <w:proofErr w:type="gramEnd"/>
+      <w:r>
+        <w:t xml:space="preserve">, abre e fecha aspas simples, vírgula. O que eu coloco aqui dentro? Coloca o URL, h t e t p, 2 pontos </w:t>
+      </w:r>
+      <w:proofErr w:type="gramStart"/>
       <w:r>
         <w:t>barra</w:t>
       </w:r>
+      <w:proofErr w:type="gramEnd"/>
+      <w:r>
+        <w:t xml:space="preserve"> </w:t>
+      </w:r>
+      <w:proofErr w:type="spellStart"/>
+      <w:r>
+        <w:t>barra</w:t>
+      </w:r>
       <w:proofErr w:type="spellEnd"/>
       <w:r>
         <w:t xml:space="preserve">, venho aqui e coloca o </w:t>
@@ -11393,13 +12327,31 @@
       </w:r>
       <w:proofErr w:type="spellEnd"/>
       <w:r>
-        <w:t xml:space="preserve"> apenas aspas simples barra, está vendo? Por quê? Porque agora ele já sabe que quando tiver o aspas simples barra aqui é, então é como se aqui a gente só precisasse colocar o que vem depois daquele determinado barra. Legal, né? E se a gente está usando esse tipo de abordagem aqui, é claro que não vai fazer sentido a gente continuar usando aquela abordagem, né, aqui dentro do nosso </w:t>
-      </w:r>
-      <w:proofErr w:type="spellStart"/>
+        <w:t xml:space="preserve"> apenas aspas simples barra, está vendo? Por quê? Porque agora ele já sabe que quando tiver </w:t>
+      </w:r>
+      <w:proofErr w:type="gramStart"/>
+      <w:r>
+        <w:t>o aspas simples</w:t>
+      </w:r>
+      <w:proofErr w:type="gramEnd"/>
+      <w:r>
+        <w:t xml:space="preserve"> barra aqui é, então é como se aqui a gente só precisasse colocar o que vem depois daquele </w:t>
+      </w:r>
+      <w:proofErr w:type="gramStart"/>
+      <w:r>
+        <w:t>determinado barra</w:t>
+      </w:r>
+      <w:proofErr w:type="gramEnd"/>
+      <w:r>
+        <w:t xml:space="preserve">. Legal, né? E se a gente está usando esse tipo de abordagem aqui, é claro que não vai fazer sentido a gente continuar usando aquela abordagem, né, aqui dentro do nosso </w:t>
+      </w:r>
+      <w:proofErr w:type="spellStart"/>
+      <w:proofErr w:type="gramStart"/>
       <w:r>
         <w:t>package.json</w:t>
       </w:r>
       <w:proofErr w:type="spellEnd"/>
+      <w:proofErr w:type="gramEnd"/>
       <w:r>
         <w:t xml:space="preserve">, de ficar chamando aqui 1 </w:t>
       </w:r>
@@ -11417,13 +12369,23 @@
       </w:r>
       <w:proofErr w:type="spellEnd"/>
       <w:r>
-        <w:t xml:space="preserve"> o r l, né? Afinal, a gente já não está mais fazendo o uso dela lá. Então eu só vou apagar daqui, pra que você possa se lembrar depois. Beleza? Agora eu vou rodar pra que você possa ver que de fato isso daqui funciona. Então eu vou vir aqui. Daquele determinado barra. Legal, né? E se a gente está usando esse tipo de abordagem aqui, é claro que não vai fazer sentido a gente continuar usando aquela abordagem, né, aqui dentro do nosso </w:t>
-      </w:r>
-      <w:proofErr w:type="spellStart"/>
+        <w:t xml:space="preserve"> o r l, né? Afinal, a gente já não está mais fazendo o uso dela lá. Então eu só vou apagar daqui, pra que você possa se lembrar depois. Beleza? Agora eu vou rodar pra que você possa ver que de fato isso daqui funciona. Então eu vou vir aqui. Daquele </w:t>
+      </w:r>
+      <w:proofErr w:type="gramStart"/>
+      <w:r>
+        <w:t>determinado barra</w:t>
+      </w:r>
+      <w:proofErr w:type="gramEnd"/>
+      <w:r>
+        <w:t xml:space="preserve">. Legal, né? E se a gente está usando esse tipo de abordagem aqui, é claro que não vai fazer sentido a gente continuar usando aquela abordagem, né, aqui dentro do nosso </w:t>
+      </w:r>
+      <w:proofErr w:type="spellStart"/>
+      <w:proofErr w:type="gramStart"/>
       <w:r>
         <w:t>package.json</w:t>
       </w:r>
       <w:proofErr w:type="spellEnd"/>
+      <w:proofErr w:type="gramEnd"/>
       <w:r>
         <w:t xml:space="preserve">, de ficar chamando aqui 1 </w:t>
       </w:r>
@@ -11444,12 +12406,17 @@
         <w:t xml:space="preserve"> a URL, né? Afinal, a gente já não está mais fazendo o uso dela lá. Então, apagar daqui, pra que você possa se lembrar depois, beleza? Agora eu vou rodar pra que você possa ver que de fato isso aqui funciona. Então, vir aqui, eu vou fazer n p m, n p m, </w:t>
       </w:r>
       <w:proofErr w:type="spellStart"/>
+      <w:proofErr w:type="gramStart"/>
       <w:r>
         <w:t>run</w:t>
       </w:r>
       <w:proofErr w:type="spellEnd"/>
       <w:r>
-        <w:t xml:space="preserve">,, que a gente possa abrir o pra se você ver de fato né, visualmente isso acontecendo. Vou ver aqui no, vou ver aqui no Electron. Vou clicar aqui no login. Está rodando os testes, né? Esse aqui é teste que a gente queria, olha só, ele fez </w:t>
+        <w:t>,,</w:t>
+      </w:r>
+      <w:proofErr w:type="gramEnd"/>
+      <w:r>
+        <w:t xml:space="preserve"> que a gente possa abrir o pra se você ver de fato né, visualmente isso acontecendo. Vou ver aqui no, vou ver aqui no Electron. Vou clicar aqui no login. Está rodando os testes, né? Esse aqui é teste que a gente queria, olha só, ele fez </w:t>
       </w:r>
       <w:proofErr w:type="spellStart"/>
       <w:r>
@@ -11665,13 +12632,18 @@
       </w:r>
       <w:proofErr w:type="spellEnd"/>
       <w:r>
-        <w:t xml:space="preserve"> então e clicaria em, </w:t>
+        <w:t xml:space="preserve"> então e clicaria </w:t>
+      </w:r>
+      <w:proofErr w:type="gramStart"/>
+      <w:r>
+        <w:t xml:space="preserve">em, </w:t>
       </w:r>
       <w:proofErr w:type="spellStart"/>
       <w:r>
         <w:t>confirm</w:t>
       </w:r>
       <w:proofErr w:type="spellEnd"/>
+      <w:proofErr w:type="gramEnd"/>
       <w:r>
         <w:t xml:space="preserve">. E a gente aí depois de confirmado né, aqui a gente iria fazer e </w:t>
       </w:r>
@@ -12194,7 +13166,15 @@
       </w:r>
       <w:proofErr w:type="spellEnd"/>
       <w:r>
-        <w:t xml:space="preserve"> e esse daqui que a gente está vendo. Olha, é 1 mudança gigante, né? Esse daqui, ele é maior, mais bonito, quando você, ele tem 1 linha verde aqui, quando você clica ele abre 1 janela maior, mais bonita, com cores, né, com essa parte escrita aqui escolha a conta origem pra mostrar pra você que é o momento agora de você escolher a conta origem. Por que eles são diferentes? Porque esse daqui é o campo, esse daqui é o é o elemento padrão do HTML e esse daqui é elemento desenhado por desenvolvedor, entendeu? Então, o que acontece aqui é que quando isso acontece, a estrutura do elemento é diferente. Por exemplo, aqui quando a gente olha na internet esse elemento, que qual que é a estrutura dele? Se eu clicar aqui com o botão direito e fizer </w:t>
+        <w:t xml:space="preserve"> e esse daqui que a gente está vendo. Olha, é 1 mudança gigante, né? Esse </w:t>
+      </w:r>
+      <w:proofErr w:type="gramStart"/>
+      <w:r>
+        <w:t>daqui, ele</w:t>
+      </w:r>
+      <w:proofErr w:type="gramEnd"/>
+      <w:r>
+        <w:t xml:space="preserve"> é maior, mais bonito, quando você, ele tem 1 linha verde aqui, quando você clica ele abre 1 janela maior, mais bonita, com cores, né, com essa parte escrita aqui escolha a conta origem pra mostrar pra você que é o momento agora de você escolher a conta origem. Por que eles são diferentes? Porque esse daqui é o campo, esse daqui é o é o elemento padrão do HTML e esse daqui é elemento desenhado por desenvolvedor, entendeu? Então, o que acontece aqui é que quando isso acontece, a estrutura do elemento é diferente. Por exemplo, aqui quando a gente olha na internet esse elemento, que qual que é a estrutura dele? Se eu clicar aqui com o botão direito e fizer </w:t>
       </w:r>
       <w:proofErr w:type="spellStart"/>
       <w:r>
@@ -12226,7 +13206,15 @@
       </w:r>
       <w:proofErr w:type="spellEnd"/>
       <w:r>
-        <w:t xml:space="preserve">. O Cypress tem até comando que você pode utilizar para interagir com esse tipo de elemento aqui. Deixa eu te mostrar aqui </w:t>
+        <w:t xml:space="preserve">. O Cypress tem até comando que você pode utilizar para interagir com esse tipo de elemento aqui. </w:t>
+      </w:r>
+      <w:proofErr w:type="gramStart"/>
+      <w:r>
+        <w:t>Deixa eu</w:t>
+      </w:r>
+      <w:proofErr w:type="gramEnd"/>
+      <w:r>
+        <w:t xml:space="preserve"> te mostrar aqui </w:t>
       </w:r>
       <w:proofErr w:type="spellStart"/>
       <w:r>
@@ -12470,7 +13458,15 @@
       </w:r>
       <w:proofErr w:type="spellEnd"/>
       <w:r>
-        <w:t xml:space="preserve">, a gente vai ter que, pular, ela não vamos utilizar, então a gente tem que fazer com outro recurso. Aí, </w:t>
+        <w:t xml:space="preserve">, a gente vai ter que, pular, </w:t>
+      </w:r>
+      <w:proofErr w:type="gramStart"/>
+      <w:r>
+        <w:t>ela não vamos</w:t>
+      </w:r>
+      <w:proofErr w:type="gramEnd"/>
+      <w:r>
+        <w:t xml:space="preserve"> utilizar, então a gente tem que fazer com outro recurso. Aí, </w:t>
       </w:r>
       <w:proofErr w:type="spellStart"/>
       <w:r>
@@ -12574,7 +13570,15 @@
       </w:r>
       <w:proofErr w:type="spellEnd"/>
       <w:r>
-        <w:t xml:space="preserve">. Ah, aqui, espera ele. Aqui, Esse daqui é nosso </w:t>
+        <w:t xml:space="preserve">. Ah, aqui, espera ele. Aqui, </w:t>
+      </w:r>
+      <w:proofErr w:type="gramStart"/>
+      <w:r>
+        <w:t>Esse</w:t>
+      </w:r>
+      <w:proofErr w:type="gramEnd"/>
+      <w:r>
+        <w:t xml:space="preserve"> daqui é nosso </w:t>
       </w:r>
       <w:proofErr w:type="spellStart"/>
       <w:r>
@@ -12614,11 +13618,35 @@
       </w:r>
       <w:proofErr w:type="spellEnd"/>
       <w:r>
-        <w:t xml:space="preserve"> só tem aqui dentro da, só tem aqui dentro do nosso, só tem aqui dentro do nosso elemento conta origem, né? Então, se eu fechar aqui, mostrar pra você, olha só tem conta origem aqui, ou seja, toda essa área aqui é do conta origem, toda essa área aqui é do conta destino. Então, ele acaba sendo pra nós o nosso identificador único desse elemento, ok? Mas lembrando, ele está dentro de outro elemento, né? Então, o que que eu faço </w:t>
+        <w:t xml:space="preserve"> só tem aqui dentro da, só tem aqui dentro do nosso, só tem aqui dentro do nosso elemento conta origem, né? Então, se eu fechar aqui, mostrar pra você, olha só tem conta origem aqui, ou seja, toda essa área aqui é </w:t>
+      </w:r>
+      <w:proofErr w:type="gramStart"/>
+      <w:r>
+        <w:t>do conta</w:t>
+      </w:r>
+      <w:proofErr w:type="gramEnd"/>
+      <w:r>
+        <w:t xml:space="preserve"> origem, toda essa área aqui é </w:t>
+      </w:r>
+      <w:proofErr w:type="gramStart"/>
+      <w:r>
+        <w:t>do conta</w:t>
+      </w:r>
+      <w:proofErr w:type="gramEnd"/>
+      <w:r>
+        <w:t xml:space="preserve"> destino. Então, ele acaba sendo pra nós o nosso identificador único desse elemento, ok? Mas lembrando, ele está dentro de outro elemento, né? Então, o que que eu faço </w:t>
       </w:r>
       <w:r>
         <w:lastRenderedPageBreak/>
-        <w:t xml:space="preserve">aqui? Via Cypress, eu posso vir aqui, encontrar o conta origem, do conta origem subir aqui para o input </w:t>
+        <w:t xml:space="preserve">aqui? Via Cypress, eu posso vir aqui, encontrar o conta origem, </w:t>
+      </w:r>
+      <w:proofErr w:type="gramStart"/>
+      <w:r>
+        <w:t>do conta</w:t>
+      </w:r>
+      <w:proofErr w:type="gramEnd"/>
+      <w:r>
+        <w:t xml:space="preserve"> origem subir aqui para o input </w:t>
       </w:r>
       <w:proofErr w:type="spellStart"/>
       <w:r>
@@ -12674,7 +13702,15 @@
       </w:r>
       <w:proofErr w:type="spellEnd"/>
       <w:r>
-        <w:t xml:space="preserve"> com isso daqui, eu vou fazer </w:t>
+        <w:t xml:space="preserve"> com isso </w:t>
+      </w:r>
+      <w:proofErr w:type="gramStart"/>
+      <w:r>
+        <w:t>daqui, eu</w:t>
+      </w:r>
+      <w:proofErr w:type="gramEnd"/>
+      <w:r>
+        <w:t xml:space="preserve"> vou fazer </w:t>
       </w:r>
       <w:proofErr w:type="spellStart"/>
       <w:r>
@@ -12738,7 +13774,23 @@
       </w:r>
       <w:proofErr w:type="spellEnd"/>
       <w:r>
-        <w:t xml:space="preserve"> conto origem tem pai, eu quero pegar esse pai, é isso que a gente está fazendo aqui, ok? E aí eu vou fazer isso daqui e vou colocar aqui ponto a s que é pra criar apelido, eu vou chamar de campo ponta origem, ok? O que que gente fez aqui? A gente criou apelido pra esse conta origem. E agora o que a gente vai fazer aqui é o seguinte, a gente vai usar esse campo origem aqui com, esse campo conta origem pra que a gente possa fazer as demais coisas que a gente precisa fazer. Então olha como vai ficar. Eu pego aqui esse nome, que é nome de apelido que eu dei, não existe, Acabei de criar esse apelido. Quando eu fazer assim, sai ponto </w:t>
+        <w:t xml:space="preserve"> conto origem tem pai, eu quero pegar esse pai, é isso que a gente está fazendo aqui, ok? E aí eu vou fazer isso daqui e vou colocar aqui ponto a s que é pra criar apelido, eu vou chamar de campo ponta origem, ok? O que que gente fez aqui? A gente criou apelido pra esse conta origem. E agora o que a gente vai fazer aqui é o seguinte, a gente vai usar esse campo origem aqui </w:t>
+      </w:r>
+      <w:proofErr w:type="gramStart"/>
+      <w:r>
+        <w:t>com, esse</w:t>
+      </w:r>
+      <w:proofErr w:type="gramEnd"/>
+      <w:r>
+        <w:t xml:space="preserve"> campo conta origem pra que a gente possa fazer as demais coisas que a gente precisa fazer. Então olha como vai ficar. Eu pego aqui esse nome, que é nome de apelido que eu dei, não existe, </w:t>
+      </w:r>
+      <w:proofErr w:type="gramStart"/>
+      <w:r>
+        <w:t>Acabei</w:t>
+      </w:r>
+      <w:proofErr w:type="gramEnd"/>
+      <w:r>
+        <w:t xml:space="preserve"> de criar esse apelido. Quando eu fazer assim, sai ponto </w:t>
       </w:r>
       <w:proofErr w:type="spellStart"/>
       <w:r>
@@ -12746,7 +13798,23 @@
       </w:r>
       <w:proofErr w:type="spellEnd"/>
       <w:r>
-        <w:t xml:space="preserve">, com aspas simples aqui, arroba ponto origem, arroba campo ponto origem, é a mesma coisa que eu tivesse digitado esses 2 comando juntos. Por quê? Porque esse daqui é apelido para esses 2 juntos, entendeu? Agora sim, que eu já tenho isso daqui, que que isso daqui está representando agora? Está representando o pai do </w:t>
+        <w:t xml:space="preserve">, com aspas simples aqui, arroba ponto origem, arroba campo ponto origem, é a mesma coisa que eu tivesse digitado esses </w:t>
+      </w:r>
+      <w:proofErr w:type="gramStart"/>
+      <w:r>
+        <w:t>2 comando</w:t>
+      </w:r>
+      <w:proofErr w:type="gramEnd"/>
+      <w:r>
+        <w:t xml:space="preserve"> juntos. Por quê? Porque esse daqui é apelido para esses 2 juntos, entendeu? Agora sim, que eu já tenho isso </w:t>
+      </w:r>
+      <w:proofErr w:type="gramStart"/>
+      <w:r>
+        <w:t>daqui, que</w:t>
+      </w:r>
+      <w:proofErr w:type="gramEnd"/>
+      <w:r>
+        <w:t xml:space="preserve"> que isso daqui está representando agora? Está representando o pai do </w:t>
       </w:r>
       <w:proofErr w:type="spellStart"/>
       <w:r>
@@ -12866,7 +13934,15 @@
       </w:r>
       <w:proofErr w:type="spellEnd"/>
       <w:r>
-        <w:t xml:space="preserve">. Vem aqui, olha. Faço esse aspas simples aqui, e aqui dentro eu colo exatamente aquele texto que tem lá dentro aqui, olha, do elemento que eu quero clicar. Então vamos dizer que eu quero transferir da Priscila pro Júlio, clico com o botão direito aqui, </w:t>
+        <w:t xml:space="preserve">. Vem aqui, olha. Faço </w:t>
+      </w:r>
+      <w:proofErr w:type="gramStart"/>
+      <w:r>
+        <w:t>esse aspas simples</w:t>
+      </w:r>
+      <w:proofErr w:type="gramEnd"/>
+      <w:r>
+        <w:t xml:space="preserve"> aqui, e aqui dentro eu colo exatamente aquele texto que tem lá dentro aqui, olha, do elemento que eu quero clicar. Então vamos dizer que eu quero transferir da Priscila pro Júlio, clico com o botão direito aqui, </w:t>
       </w:r>
       <w:proofErr w:type="spellStart"/>
       <w:r>
@@ -12874,7 +13950,15 @@
       </w:r>
       <w:proofErr w:type="spellEnd"/>
       <w:r>
-        <w:t xml:space="preserve">, está vendo? Dou 2 cliques aqui, copio ele, volto lá pro meu script e colo, certo? Então olha só. Dentro do pai, existe elemento que tem o nome da Priscila. Eu venho aqui e faço ponto clique. Eu vou salvar, vamos lá ver se funcionou. Vou fechar aqui. Eu já vi que funcionou, mas vou rodar novamente pra você ver, Cliquei aqui, logou, selecionou a Priscila, está vendo? Então esse daqui foi jeito da gente conseguir interagir com esse elemento, tá, que é elemento pouco mais complexo do que os elementos comuns, certo? Agora o que eu vou fazer? Vou voltar aqui no script e vou fazer a mesma coisa só que agora eu vou fazer pro outro elemento que é o de conta destino. Então, novamente, eu venho aqui, clico com o botão direito nesse elemento, dou </w:t>
+        <w:t xml:space="preserve">, está vendo? Dou 2 cliques aqui, copio ele, volto lá pro meu script e colo, certo? Então olha só. Dentro do pai, existe elemento que tem o nome da Priscila. Eu venho aqui e faço ponto clique. Eu vou salvar, vamos lá ver se funcionou. Vou fechar aqui. Eu já vi que funcionou, mas vou rodar novamente pra você ver, </w:t>
+      </w:r>
+      <w:proofErr w:type="gramStart"/>
+      <w:r>
+        <w:t>Cliquei</w:t>
+      </w:r>
+      <w:proofErr w:type="gramEnd"/>
+      <w:r>
+        <w:t xml:space="preserve"> aqui, logou, selecionou a Priscila, está vendo? Então esse daqui foi jeito da gente conseguir interagir com esse elemento, tá, que é elemento pouco mais complexo do que os elementos comuns, certo? Agora o que eu vou fazer? Vou voltar aqui no script e vou fazer a mesma coisa só que agora eu vou fazer pro outro elemento que é o de conta destino. Então, novamente, eu venho aqui, clico com o botão direito nesse elemento, dou </w:t>
       </w:r>
       <w:proofErr w:type="spellStart"/>
       <w:r>
@@ -12906,11 +13990,27 @@
       </w:r>
       <w:proofErr w:type="spellEnd"/>
       <w:r>
-        <w:t xml:space="preserve"> pro conta destino, dá pra fazer exatamente a mesma coisa, padrão, está </w:t>
+        <w:t xml:space="preserve"> </w:t>
+      </w:r>
+      <w:proofErr w:type="gramStart"/>
+      <w:r>
+        <w:t>pro conta</w:t>
+      </w:r>
+      <w:proofErr w:type="gramEnd"/>
+      <w:r>
+        <w:t xml:space="preserve"> destino, dá pra fazer exatamente a mesma coisa, padrão, está </w:t>
       </w:r>
       <w:r>
         <w:lastRenderedPageBreak/>
-        <w:t xml:space="preserve">vendo? Então o que eu faço? Venho aqui, crio aqui 1 nova linha, vou Simplesmente copiar aqui todo esse comando. Vou colar aqui embaixo, e aqui vai ser conta destino. E aqui campo conta destino. Campo conta destino. Clique, campo conta destino, conténs, né, vou procurar elemento e vou dar clique, só que agora não vai ser da Priscila pra Priscila, né? Vai ser da Priscila para o Júlio. Então o eu vou fazer? Vou vir aqui, olha, dentro daquele meu elemento </w:t>
+        <w:t xml:space="preserve">vendo? Então o que eu faço? Venho aqui, crio aqui 1 nova linha, </w:t>
+      </w:r>
+      <w:proofErr w:type="gramStart"/>
+      <w:r>
+        <w:t>vou Simplesmente</w:t>
+      </w:r>
+      <w:proofErr w:type="gramEnd"/>
+      <w:r>
+        <w:t xml:space="preserve"> copiar aqui todo esse comando. Vou colar aqui embaixo, e aqui vai ser conta destino. E aqui campo conta destino. Campo conta destino. Clique, campo conta destino, conténs, né, vou procurar elemento e vou dar clique, só que agora não vai ser da Priscila pra Priscila, né? Vai ser da Priscila para o Júlio. Então o eu vou fazer? Vou vir aqui, olha, dentro daquele meu elemento </w:t>
       </w:r>
       <w:proofErr w:type="spellStart"/>
       <w:r>
@@ -12982,7 +14082,15 @@
       </w:r>
       <w:proofErr w:type="spellEnd"/>
       <w:r>
-        <w:t xml:space="preserve"> e clique. Eu não precisaria disso, mas isso daqui foi especificamente por quê? Porque o campo ele não tem identificador único, então quando o campo não tem identificador único, 1 prática que a gente tem em automação é procurar filho, subir pro pai e criar alias pra ele dentro do Cypress. Legal, né? Então vamos lá. Pra que a sala não fique tão grande, vamos fazer 1 pausa. Subir pro pai e Criar pra ele dentro do Cypress. Legal, né? Então vamos lá. Pra que essa aula não fique tão grande, vamos fazer 1 pausa aqui. E na próxima aula a gente retorna pra que a gente continue criando esse script de realização de transferências. Te vejo na próxima aula. Nessa aula a gente vai continuar criando o nosso script de realização de transferências. Vou voltar aqui no Cypress e vou continuar automatizando. Então eu vir aqui, vou pegar, né, o botão de seleção e eu vou pegar aqui o valor, olha. O valor se você vê, olha, passa o mouse assim, dá 1 procurada, você vai ver que aparece ele e ele tem o ID, olha só que fácil que está. Então eu só copio, venho aqui, faço aqui o ponto clique, faço aqui o ponto </w:t>
+        <w:t xml:space="preserve"> e clique. Eu não precisaria disso, mas isso daqui foi especificamente por quê? Porque o campo ele não tem identificador único, então quando o campo não tem identificador único, 1 prática que a gente tem em automação é procurar filho, subir pro pai e criar alias pra ele dentro do Cypress. Legal, né? Então vamos lá. Pra que a sala não fique tão grande, vamos fazer 1 pausa. Subir pro pai </w:t>
+      </w:r>
+      <w:proofErr w:type="gramStart"/>
+      <w:r>
+        <w:t>e Criar</w:t>
+      </w:r>
+      <w:proofErr w:type="gramEnd"/>
+      <w:r>
+        <w:t xml:space="preserve"> pra ele dentro do Cypress. Legal, né? Então vamos lá. Pra que essa aula não fique tão grande, vamos fazer 1 pausa aqui. E na próxima aula a gente retorna pra que a gente continue criando esse script de realização de transferências. Te vejo na próxima aula. Nessa aula a gente vai continuar criando o nosso script de realização de transferências. Vou voltar aqui no Cypress e vou continuar automatizando. Então eu vir aqui, vou pegar, né, o botão de seleção e eu vou pegar aqui o valor, olha. O valor se você vê, olha, passa o mouse assim, dá 1 procurada, você vai ver que aparece ele e ele tem o ID, olha só que fácil que está. Então eu só copio, venho aqui, faço aqui o ponto clique, faço aqui o ponto </w:t>
       </w:r>
       <w:proofErr w:type="spellStart"/>
       <w:r>
@@ -13090,7 +14198,15 @@
       </w:r>
       <w:proofErr w:type="spellEnd"/>
       <w:r>
-        <w:t xml:space="preserve"> ele achou, fiz clique nele, depois de clicar, olha só, ele veio aqui e fez 2 requisições, está vendo? Nessa requisição aqui ainda não tinha acontecido nada, mas nessa requisição aqui olha, olha só, apareceu o transferência realizada que é o que gente precisa aqui pra confirmar que o nosso teste passou. Clico aqui, já peguei o </w:t>
+        <w:t xml:space="preserve"> ele achou, fiz clique nele, depois de clicar, olha só, ele veio aqui e fez 2 requisições, está vendo? Nessa requisição aqui ainda não tinha acontecido nada, mas nessa requisição aqui olha, olha só, apareceu </w:t>
+      </w:r>
+      <w:proofErr w:type="gramStart"/>
+      <w:r>
+        <w:t>o transferência realizada</w:t>
+      </w:r>
+      <w:proofErr w:type="gramEnd"/>
+      <w:r>
+        <w:t xml:space="preserve"> que é o que gente precisa aqui pra confirmar que o nosso teste passou. Clico aqui, já peguei o </w:t>
       </w:r>
       <w:proofErr w:type="spellStart"/>
       <w:r>
@@ -13194,7 +14310,15 @@
       </w:r>
       <w:proofErr w:type="spellEnd"/>
       <w:r>
-        <w:t xml:space="preserve"> valor de 50011 e o julho tenha novamente o saldo de 49989, ou a gente encontra jeito melhor de encontrar os elementos que a gente quer clicar. Na dentro da nossa aplicação do banco a gente pode então pensar que esse esses campos aqui, esses elementos, eles sempre vão ter valor único, então aqui Priscila é a única da Priscila, e julho é o único julho por exemplo, entendeu? Então o eu vou fazer aqui? Vou vir aqui e vou apagar essa parte aqui olha, da Priscila, e vou apagar aqui esses dados do </w:t>
+        <w:t xml:space="preserve"> valor de 50011 e o julho tenha novamente o saldo de 49989, ou a gente encontra jeito melhor de encontrar os elementos que a gente quer clicar. Na dentro da nossa aplicação do banco a gente pode então pensar que </w:t>
+      </w:r>
+      <w:proofErr w:type="gramStart"/>
+      <w:r>
+        <w:t>esse esses campos</w:t>
+      </w:r>
+      <w:proofErr w:type="gramEnd"/>
+      <w:r>
+        <w:t xml:space="preserve"> aqui, esses elementos, eles sempre vão ter valor único, então aqui Priscila é a única da Priscila, e julho é o único julho por exemplo, entendeu? Então o eu vou fazer aqui? Vou vir aqui e vou apagar essa parte aqui olha, da Priscila, e vou apagar aqui esses dados do </w:t>
       </w:r>
       <w:proofErr w:type="spellStart"/>
       <w:r>
@@ -13202,7 +14326,15 @@
       </w:r>
       <w:proofErr w:type="spellEnd"/>
       <w:r>
-        <w:t xml:space="preserve">, e agora ele não olha mais pra questão de quanto saldo que ele tem, ele olha somente pro nome, se encontrou o nome ele clica, é isso que vai fazer. Então agora eu vou salvar, vou lá pro Cypress, vou mostrar pra você que agora esse script ele está repetitivo olha, vou rodar ele aqui de novo pra você. Rodei, logou, Olha lá, registrou o a transferência pra da Priscila pro </w:t>
+        <w:t xml:space="preserve">, e agora ele não olha mais pra questão de quanto saldo que ele tem, ele olha somente pro nome, se encontrou o nome ele clica, é isso que vai fazer. Então agora eu vou salvar, vou lá pro Cypress, vou mostrar pra você que agora esse script ele está repetitivo olha, vou rodar ele aqui de novo pra você. Rodei, logou, </w:t>
+      </w:r>
+      <w:proofErr w:type="gramStart"/>
+      <w:r>
+        <w:t>Olha</w:t>
+      </w:r>
+      <w:proofErr w:type="gramEnd"/>
+      <w:r>
+        <w:t xml:space="preserve"> lá, registrou o a transferência pra da Priscila pro </w:t>
       </w:r>
       <w:proofErr w:type="spellStart"/>
       <w:r>
@@ -13242,7 +14374,15 @@
       </w:r>
       <w:proofErr w:type="spellEnd"/>
       <w:r>
-        <w:t xml:space="preserve"> colocar tudo isso dentro de 1 função que vai ficar disponível em todo em toda a sua suíte de testes, e aí quando você precisar você chama apenas aquela função que faz o a mesma coisa que você vai servir pro nosso comando de login, está vendo? Ele tem aqui 4, 5 linhas olha, 1 do, 1, 2, 3, 4, 5 linhas, e ele sempre vai servir pra fazer login. Que muda aqui? Apenas o usuário que a gente está utilizando, então em caso como esse, a gente pode também, né, criar comando customizado pra que sempre que a quiser fazer o login a gente apenas chame esse essa função. Vamos aproveitar agora pra </w:t>
+        <w:t xml:space="preserve"> colocar tudo isso dentro de 1 função que vai ficar disponível em todo em toda a sua suíte de testes, e aí quando você precisar você chama apenas aquela função que faz o a mesma coisa que você vai servir pro nosso comando de login, está vendo? Ele tem aqui 4, 5 linhas olha, 1 do, 1, 2, 3, 4, 5 linhas, e ele sempre vai servir pra fazer login. Que muda aqui? Apenas o usuário que a gente está utilizando, então em caso como esse, a gente pode também, né, criar comando customizado pra que sempre que a quiser fazer o login a gente apenas chame </w:t>
+      </w:r>
+      <w:proofErr w:type="gramStart"/>
+      <w:r>
+        <w:t>esse essa função</w:t>
+      </w:r>
+      <w:proofErr w:type="gramEnd"/>
+      <w:r>
+        <w:t xml:space="preserve">. Vamos aproveitar agora pra </w:t>
       </w:r>
       <w:proofErr w:type="spellStart"/>
       <w:r>
@@ -13374,7 +14514,15 @@
       </w:r>
       <w:proofErr w:type="spellEnd"/>
       <w:r>
-        <w:t xml:space="preserve"> menos m e vou colocar aqui que eu estava adicionando o script de testes de transferências, ok? Beleza, agora vou fazer </w:t>
+        <w:t xml:space="preserve"> menos </w:t>
+      </w:r>
+      <w:proofErr w:type="gramStart"/>
+      <w:r>
+        <w:t>m e</w:t>
+      </w:r>
+      <w:proofErr w:type="gramEnd"/>
+      <w:r>
+        <w:t xml:space="preserve"> vou colocar aqui que eu estava adicionando o script de testes de transferências, ok? Beleza, agora vou fazer </w:t>
       </w:r>
       <w:proofErr w:type="spellStart"/>
       <w:r>
@@ -13641,6 +14789,2240 @@
       <w:pPr>
         <w:spacing w:after="0"/>
       </w:pPr>
+      <w:r>
+        <w:t xml:space="preserve">Nessa aula eu quero mostrar pra você como utilizar recurso muito, mas muito útil dentro do Cypress que são os </w:t>
+      </w:r>
+      <w:proofErr w:type="spellStart"/>
+      <w:r>
+        <w:t>custom</w:t>
+      </w:r>
+      <w:proofErr w:type="spellEnd"/>
+      <w:r>
+        <w:t xml:space="preserve"> </w:t>
+      </w:r>
+      <w:proofErr w:type="spellStart"/>
+      <w:r>
+        <w:t>commands</w:t>
+      </w:r>
+      <w:proofErr w:type="spellEnd"/>
+      <w:r>
+        <w:t xml:space="preserve">, ou seja, comandos customizados. Através desses comandos você consegue, então, criar funções que vão estar organizadas em 1 estrutura específica e que você vai poder reaproveitar sempre que você precisar. Pensa, por exemplo, na execução do login com credenciais válidas. Quantas vezes você vai utilizar isso no decorrer de toda a vida do projeto? Muitas, não é mesmo? Então, ao invés de ficar repetindo aquelas várias linhas todas as vezes, a gente </w:t>
+      </w:r>
+      <w:proofErr w:type="gramStart"/>
+      <w:r>
+        <w:t>transforma ela</w:t>
+      </w:r>
+      <w:proofErr w:type="gramEnd"/>
+      <w:r>
+        <w:t xml:space="preserve"> numa função e a gente usa essa função sempre que for necessário, entendeu? Então é bem simples e ajuda muito você no seu dia a dia, beleza? A gente poderia criar funções aqui, comandos customizados pra tudo, mas eu vou mostrar pra você apenas o começo aqui dessa organização e depois você mesmo pode continuar implementando outros comandos customizados dentro do seu projeto. Vamos nessa? Vamos lá então. 1º coisa, identificar comando customizado é basicamente você olhar pro seu script e ver coisas que se repetem muito. Por exemplo, login com credenciais válidas vai acontecer aqui, no nosso login ponto sai, tá, aqui já é login com credenciais inválidas, vai se repetir também aqui, olha, nas transferências, está vendo? E vai se repetir em muitos outros lugares. Logo, é, com certeza, candidato a se tornar comando customizado. Outro elemento também que, ou outro pedaço de código também que, nossa, tem 1 1 é ótimo candidato para se tornar comando customizado, </w:t>
+      </w:r>
+      <w:proofErr w:type="gramStart"/>
+      <w:r>
+        <w:t>É</w:t>
+      </w:r>
+      <w:proofErr w:type="gramEnd"/>
+      <w:r>
+        <w:t xml:space="preserve"> esse daqui olha. Preenchimento de campo, né, de seleção, 1 combo box. Por quê? Porque olha só, ele segue 1 estrutura que é muito similar aqui olha, em tanto aqui quanto aqui, né? A única coisa que muda é 0S0 nome do campo, e qual é o valor que eu quero digitar, mas a estrutura das linhas é exatamente igual, entendeu? Então é assim que você identifica, quando você percebe coisas que são muito, sabe, </w:t>
+      </w:r>
+      <w:proofErr w:type="gramStart"/>
+      <w:r>
+        <w:t>muito</w:t>
+      </w:r>
+      <w:proofErr w:type="gramEnd"/>
+      <w:r>
+        <w:t xml:space="preserve"> muito similares e que vão se repetir muito, né. Então com base nisso que eu acabei de te falar, o que a gente conclui é que nós temos comandos customizados que são relacionados a funcionalidades específicas, por exemplo, os comandos customizados que eu uso apenas na transferência ou apenas no login, e eu tenho também os </w:t>
+      </w:r>
+      <w:proofErr w:type="spellStart"/>
+      <w:r>
+        <w:t>os</w:t>
+      </w:r>
+      <w:proofErr w:type="spellEnd"/>
+      <w:r>
+        <w:t xml:space="preserve"> comandos customizados que servem pra todo o sistema, por exemplo, essa questão aqui de </w:t>
+      </w:r>
+      <w:proofErr w:type="spellStart"/>
+      <w:r>
+        <w:t>de</w:t>
+      </w:r>
+      <w:proofErr w:type="spellEnd"/>
+      <w:r>
+        <w:t xml:space="preserve"> ter 1 combo box, vai servir não só pra transferências, mas em qualquer lugar que tiver combo box no sistema, vai usar aquela mesma combo box que o desenvolvedor criou por transferências, entendeu? É outra coisa que também vale pra todo o sistema, 0A0 </w:t>
+      </w:r>
+      <w:proofErr w:type="spellStart"/>
+      <w:r>
+        <w:t>Toast</w:t>
+      </w:r>
+      <w:proofErr w:type="spellEnd"/>
+      <w:r>
+        <w:t xml:space="preserve">, e a validação dele. Sempre vai ser </w:t>
+      </w:r>
+      <w:proofErr w:type="spellStart"/>
+      <w:r>
+        <w:t>Toast</w:t>
+      </w:r>
+      <w:proofErr w:type="spellEnd"/>
+      <w:r>
+        <w:t xml:space="preserve">, seja mensagem de sucesso, seja mensagem de </w:t>
+      </w:r>
+      <w:proofErr w:type="spellStart"/>
+      <w:r>
+        <w:t>de</w:t>
+      </w:r>
+      <w:proofErr w:type="spellEnd"/>
+      <w:r>
+        <w:t xml:space="preserve"> erro, vai ter se tiver </w:t>
+      </w:r>
+      <w:proofErr w:type="spellStart"/>
+      <w:r>
+        <w:t>Toast</w:t>
+      </w:r>
+      <w:proofErr w:type="spellEnd"/>
+      <w:r>
+        <w:t xml:space="preserve"> ele vai </w:t>
+      </w:r>
+      <w:r>
+        <w:lastRenderedPageBreak/>
+        <w:t xml:space="preserve">funcionar com esse comando aqui. A única coisa que gente tem que mudar é o texto, logo está aqui passível a ser comando customizado, está bom? Então, agora o que a gente vai fazer, né, aprender 1º como criar a estrutura para que a possa separar o que são os comandos customizados do login, das transferências, e o que são comandos customizados gerais, entendeu? Vamos montar isso? A gente vai fazer o seguinte, nós vamos ver aqui olha, está vendo? Essa daqui é a nossa página de </w:t>
+      </w:r>
+      <w:proofErr w:type="spellStart"/>
+      <w:r>
+        <w:t>comments</w:t>
+      </w:r>
+      <w:proofErr w:type="spellEnd"/>
+      <w:r>
+        <w:t xml:space="preserve">, que são os nossos comandos customizados. Só que o vai acontecer aqui, esse é só arquivo de exemplo que o próprio Cypress criou pra gente. Se a gente quer criar a nossa própria estrutura, a gente não vai escrever aqui, como ele estava dizendo que você poderia. O que a gente vai fazer é o seguinte, nós vamos ver aqui em </w:t>
+      </w:r>
+      <w:proofErr w:type="spellStart"/>
+      <w:r>
+        <w:t>support</w:t>
+      </w:r>
+      <w:proofErr w:type="spellEnd"/>
+      <w:r>
+        <w:t xml:space="preserve">, na pasta </w:t>
+      </w:r>
+      <w:proofErr w:type="spellStart"/>
+      <w:r>
+        <w:t>support</w:t>
+      </w:r>
+      <w:proofErr w:type="spellEnd"/>
+      <w:r>
+        <w:t xml:space="preserve">, é a pasta onde está o </w:t>
+      </w:r>
+      <w:proofErr w:type="spellStart"/>
+      <w:r>
+        <w:t>comments</w:t>
+      </w:r>
+      <w:proofErr w:type="spellEnd"/>
+      <w:r>
+        <w:t xml:space="preserve">, nós vamos clicar com o botão direito e criar new folder, ok? </w:t>
+      </w:r>
+      <w:proofErr w:type="gramStart"/>
+      <w:r>
+        <w:t>Essa new folder</w:t>
+      </w:r>
+      <w:proofErr w:type="gramEnd"/>
+      <w:r>
+        <w:t xml:space="preserve"> vai se chamar também </w:t>
+      </w:r>
+      <w:proofErr w:type="spellStart"/>
+      <w:r>
+        <w:t>comments</w:t>
+      </w:r>
+      <w:proofErr w:type="spellEnd"/>
+      <w:r>
+        <w:t xml:space="preserve">, </w:t>
+      </w:r>
+      <w:proofErr w:type="spellStart"/>
+      <w:r>
+        <w:t>comments</w:t>
+      </w:r>
+      <w:proofErr w:type="spellEnd"/>
+      <w:r>
+        <w:t xml:space="preserve">, que são os nossos comandos. E aqui dentro a gente vai criar aqui, olha, new file pra login ponto j s. Vamos clicar com o botão direito aqui de novo, new file, e vamos criar aqui também pra transferências. Vamos colocar transferência, né, só pra bater aqui, ponto j s. Botão direito, new file, a gente vai criar outro comum, que é o nosso arquivo geral pra todos, está bom? Aqui então estão todos os arquivos que a gente já tem e que cobririam as coisas que a precisa até agora, esse </w:t>
+      </w:r>
+      <w:proofErr w:type="gramStart"/>
+      <w:r>
+        <w:t xml:space="preserve">daqui, </w:t>
+      </w:r>
+      <w:proofErr w:type="spellStart"/>
+      <w:r>
+        <w:t>geralzão</w:t>
+      </w:r>
+      <w:proofErr w:type="spellEnd"/>
+      <w:proofErr w:type="gramEnd"/>
+      <w:r>
+        <w:t xml:space="preserve">, esse daqui de login, esse daqui de transferência, ok? Beleza. Agora o que gente precisa é o seguinte, aqui dentro todo, cada desses arquivos vai ter que ser chamado aqui dentro do </w:t>
+      </w:r>
+      <w:proofErr w:type="spellStart"/>
+      <w:r>
+        <w:t>comments</w:t>
+      </w:r>
+      <w:proofErr w:type="spellEnd"/>
+      <w:r>
+        <w:t xml:space="preserve">. Como que a gente vai fazer isso? A gente vai fazer assim, olha. Import. Vou abrir aqui </w:t>
+      </w:r>
+      <w:proofErr w:type="gramStart"/>
+      <w:r>
+        <w:t>o aspas simples</w:t>
+      </w:r>
+      <w:proofErr w:type="gramEnd"/>
+      <w:r>
+        <w:t xml:space="preserve"> e vou digitar ponto barra, porque é dentro da mesma pasta, a gente quer pegar os arquivos que estão, que são irmãos aqui do arquivo </w:t>
+      </w:r>
+      <w:proofErr w:type="spellStart"/>
+      <w:r>
+        <w:t>comment</w:t>
+      </w:r>
+      <w:proofErr w:type="spellEnd"/>
+      <w:r>
+        <w:t xml:space="preserve">, que estão na pasta </w:t>
+      </w:r>
+      <w:proofErr w:type="spellStart"/>
+      <w:r>
+        <w:t>comments</w:t>
+      </w:r>
+      <w:proofErr w:type="spellEnd"/>
+      <w:r>
+        <w:t xml:space="preserve">. Então, pasta </w:t>
+      </w:r>
+      <w:proofErr w:type="spellStart"/>
+      <w:r>
+        <w:t>comments</w:t>
+      </w:r>
+      <w:proofErr w:type="spellEnd"/>
+      <w:r>
+        <w:t xml:space="preserve"> barra e vou pegar cada deles, então vou pegar o common, né, e aqui em cima eu vou escrever assim, olha, comandos customizados para interagir com a aplicação. Estou com problemas aqui no meu no teclado? Então eu vou deixar sem os acentos, está bom? Aí eu vou vir aqui e vou colocar o </w:t>
+      </w:r>
+      <w:proofErr w:type="spellStart"/>
+      <w:r>
+        <w:t>import</w:t>
+      </w:r>
+      <w:proofErr w:type="spellEnd"/>
+      <w:r>
+        <w:t xml:space="preserve"> ponto barra </w:t>
+      </w:r>
+      <w:proofErr w:type="spellStart"/>
+      <w:r>
+        <w:t>comments</w:t>
+      </w:r>
+      <w:proofErr w:type="spellEnd"/>
+      <w:r>
+        <w:t xml:space="preserve"> barra.</w:t>
+      </w:r>
+    </w:p>
+    <w:p>
+      <w:pPr>
+        <w:spacing w:after="0"/>
+      </w:pPr>
+    </w:p>
+    <w:p>
+      <w:pPr>
+        <w:spacing w:after="0"/>
+      </w:pPr>
+      <w:r>
+        <w:t xml:space="preserve">Já? Está. Pode estar no lado do reforço. Até no lado ou já fazendo pior? Vou falar como foi. Se não fosse, não veio, entendeu? Não é? Né? Agora você quiser, passar agora você vai fazer umas, sair esse exercício nós vamos pra ir com Deus, nós vamos. Já vem com a cabeça, cara, que não está essa na </w:t>
+      </w:r>
+      <w:proofErr w:type="spellStart"/>
+      <w:r>
+        <w:t>na</w:t>
+      </w:r>
+      <w:proofErr w:type="spellEnd"/>
+      <w:r>
+        <w:t xml:space="preserve"> </w:t>
+      </w:r>
+      <w:proofErr w:type="spellStart"/>
+      <w:r>
+        <w:t>na</w:t>
+      </w:r>
+      <w:proofErr w:type="spellEnd"/>
+      <w:r>
+        <w:t xml:space="preserve"> </w:t>
+      </w:r>
+      <w:proofErr w:type="spellStart"/>
+      <w:r>
+        <w:t>na</w:t>
+      </w:r>
+      <w:proofErr w:type="spellEnd"/>
+      <w:r>
+        <w:t xml:space="preserve"> letra. Muito. Tem que usar aquela caneta de lá, uai. Não, Maria, não tem nada de diferente não. O negócio é ruim ela para tomar mais cena, né? E ela troca em base alta, é isso. Tem cabelo. Mais diferente. Quê? Já que não sabe, já fiz a muito tempo, né? Já, </w:t>
+      </w:r>
+      <w:proofErr w:type="spellStart"/>
+      <w:r>
+        <w:t>aham</w:t>
+      </w:r>
+      <w:proofErr w:type="spellEnd"/>
+      <w:r>
+        <w:t>. Certo. Não. Não, mãe. Mas eu respondi e você. Você que não escutou então, meu amor, porque eu respondi.</w:t>
+      </w:r>
+    </w:p>
+    <w:p>
+      <w:pPr>
+        <w:spacing w:after="0"/>
+      </w:pPr>
+    </w:p>
+    <w:p>
+      <w:pPr>
+        <w:spacing w:after="0"/>
+      </w:pPr>
+      <w:r>
+        <w:t xml:space="preserve">Login, e o </w:t>
+      </w:r>
+      <w:proofErr w:type="spellStart"/>
+      <w:r>
+        <w:t>import</w:t>
+      </w:r>
+      <w:proofErr w:type="spellEnd"/>
+      <w:r>
+        <w:t xml:space="preserve">, ponto barra </w:t>
+      </w:r>
+      <w:proofErr w:type="spellStart"/>
+      <w:r>
+        <w:t>comments</w:t>
+      </w:r>
+      <w:proofErr w:type="spellEnd"/>
+      <w:r>
+        <w:t xml:space="preserve"> barra transferência, ok? E aqui, eu vou digitar esse </w:t>
+      </w:r>
+      <w:proofErr w:type="spellStart"/>
+      <w:r>
+        <w:t>esse</w:t>
+      </w:r>
+      <w:proofErr w:type="spellEnd"/>
+      <w:r>
+        <w:t xml:space="preserve"> comentário né, dizendo, comandos customizados para interagir com funcionalidades, opa, com funcionalidades específicas, ok? Beleza, vou salvar. E agora aqui, nesses carinhos aqui a gente começa a colocar os nossos comandos customizados. E você vai ver aqui nessa página de exemplo que ele mostra como funciona, olha, é assim, Cypress ponto </w:t>
+      </w:r>
+      <w:proofErr w:type="spellStart"/>
+      <w:r>
+        <w:t>comments</w:t>
+      </w:r>
+      <w:proofErr w:type="spellEnd"/>
+      <w:r>
+        <w:t xml:space="preserve"> ponto ADDE aí a gente coloca o nome do </w:t>
+      </w:r>
+      <w:proofErr w:type="spellStart"/>
+      <w:r>
+        <w:t>do</w:t>
+      </w:r>
+      <w:proofErr w:type="spellEnd"/>
+      <w:r>
+        <w:t xml:space="preserve"> </w:t>
+      </w:r>
+      <w:proofErr w:type="spellStart"/>
+      <w:r>
+        <w:t>do</w:t>
+      </w:r>
+      <w:proofErr w:type="spellEnd"/>
+      <w:r>
+        <w:t xml:space="preserve"> nosso comando customizado e depois coloca 1 Arrow </w:t>
+      </w:r>
+      <w:proofErr w:type="spellStart"/>
+      <w:r>
+        <w:t>Function</w:t>
+      </w:r>
+      <w:proofErr w:type="spellEnd"/>
+      <w:r>
+        <w:t xml:space="preserve"> com o comando em si, tá bom? Então vamos começar por aqui olha, por esse comum, e a gente vai vir aqui olha, no nosso login ponto sai, e vamos criar </w:t>
+      </w:r>
+      <w:proofErr w:type="spellStart"/>
+      <w:r>
+        <w:t>custom</w:t>
+      </w:r>
+      <w:proofErr w:type="spellEnd"/>
+      <w:r>
+        <w:t xml:space="preserve"> </w:t>
+      </w:r>
+      <w:proofErr w:type="spellStart"/>
+      <w:r>
+        <w:t>command</w:t>
+      </w:r>
+      <w:proofErr w:type="spellEnd"/>
+      <w:r>
+        <w:t xml:space="preserve"> para a nossa mensagem, pro nosso validador de mensagens, que vai olhar pro </w:t>
+      </w:r>
+      <w:proofErr w:type="spellStart"/>
+      <w:r>
+        <w:t>Toast</w:t>
+      </w:r>
+      <w:proofErr w:type="spellEnd"/>
+      <w:r>
+        <w:t xml:space="preserve"> e verificar se ele tem 1 mensagem em específico, está bom? Então agora vamos fazer o seguinte, a gente vai vir aqui olha, </w:t>
+      </w:r>
+      <w:proofErr w:type="spellStart"/>
+      <w:r>
+        <w:t>no na</w:t>
+      </w:r>
+      <w:proofErr w:type="spellEnd"/>
+      <w:r>
+        <w:t xml:space="preserve"> nossa página de login, vamos lá pro topo, e vamos começar a ver quais são as coisas que a gente poderia criar Custom Command, ok? São aquelas coisas que se repetem muito. Bem, aqui então a gente tem site ponto </w:t>
+      </w:r>
+      <w:proofErr w:type="spellStart"/>
+      <w:r>
+        <w:t>visit</w:t>
+      </w:r>
+      <w:proofErr w:type="spellEnd"/>
+      <w:r>
+        <w:t xml:space="preserve">. O site ponto </w:t>
+      </w:r>
+      <w:proofErr w:type="spellStart"/>
+      <w:r>
+        <w:t>visit</w:t>
+      </w:r>
+      <w:proofErr w:type="spellEnd"/>
+      <w:r>
+        <w:t xml:space="preserve"> já é comando do próprio Cypress, ele é super comum, super fácil de usar, eu não preciso criar 1 </w:t>
+      </w:r>
+      <w:proofErr w:type="spellStart"/>
+      <w:r>
+        <w:t>custom</w:t>
+      </w:r>
+      <w:proofErr w:type="spellEnd"/>
+      <w:r>
+        <w:t xml:space="preserve"> </w:t>
+      </w:r>
+      <w:proofErr w:type="spellStart"/>
+      <w:r>
+        <w:t>command</w:t>
+      </w:r>
+      <w:proofErr w:type="spellEnd"/>
+      <w:r>
+        <w:t xml:space="preserve"> especificamente pra isso, certo? O </w:t>
+      </w:r>
+      <w:proofErr w:type="spellStart"/>
+      <w:r>
+        <w:t>cy</w:t>
+      </w:r>
+      <w:proofErr w:type="spellEnd"/>
+      <w:r>
+        <w:t xml:space="preserve"> </w:t>
+      </w:r>
+      <w:r>
+        <w:lastRenderedPageBreak/>
+        <w:t xml:space="preserve">ponto </w:t>
+      </w:r>
+      <w:proofErr w:type="spellStart"/>
+      <w:r>
+        <w:t>screenshot</w:t>
+      </w:r>
+      <w:proofErr w:type="spellEnd"/>
+      <w:r>
+        <w:t xml:space="preserve"> é a mesma coisa, né, é comando simples do próprio Cypress que já traz pra gente com apenas 1 linha, tudo aquilo que a gente precisa pra tirar o </w:t>
+      </w:r>
+      <w:proofErr w:type="spellStart"/>
+      <w:r>
+        <w:t>screenshot</w:t>
+      </w:r>
+      <w:proofErr w:type="spellEnd"/>
+      <w:r>
+        <w:t xml:space="preserve">. Agora, olha só isso aqui olha. Se eu quiser vir aqui e </w:t>
+      </w:r>
+      <w:proofErr w:type="spellStart"/>
+      <w:r>
+        <w:t>e</w:t>
+      </w:r>
+      <w:proofErr w:type="spellEnd"/>
+      <w:r>
+        <w:t xml:space="preserve"> fazer o login, eu tenho que fazer todas essas 4 linhas aqui de cima, mais essa linha aqui de baixo que é a linha duplicar no botão entrar, entendeu? Então, se todas as vezes eu tiver que fazer isso, eu sempre vou utilizar muitas linhas, por isso, isso daqui é bom candidato pra se tornar dos nossos comandos customizados, e é isso que a gente vai fazer agora, está bom? Só lembrando, esse </w:t>
+      </w:r>
+      <w:proofErr w:type="spellStart"/>
+      <w:r>
+        <w:t>screenshot</w:t>
+      </w:r>
+      <w:proofErr w:type="spellEnd"/>
+      <w:r>
+        <w:t xml:space="preserve"> que você vê aqui, que você vê aqui, são coisas que a gente utilizou naquela aula em que a gente viu a necessidade de tirar </w:t>
+      </w:r>
+      <w:proofErr w:type="spellStart"/>
+      <w:r>
+        <w:t>screenshot</w:t>
+      </w:r>
+      <w:proofErr w:type="spellEnd"/>
+      <w:r>
+        <w:t xml:space="preserve">. O comando, os comandos que você coloca como comandos customizados, como </w:t>
+      </w:r>
+      <w:proofErr w:type="spellStart"/>
+      <w:r>
+        <w:t>custom</w:t>
+      </w:r>
+      <w:proofErr w:type="spellEnd"/>
+      <w:r>
+        <w:t xml:space="preserve"> </w:t>
+      </w:r>
+      <w:proofErr w:type="spellStart"/>
+      <w:r>
+        <w:t>commands</w:t>
+      </w:r>
+      <w:proofErr w:type="spellEnd"/>
+      <w:r>
+        <w:t xml:space="preserve">, eles vão ser comandos que eles vão sempre fazer a mesma coisa. Então você quer que </w:t>
+      </w:r>
+      <w:proofErr w:type="spellStart"/>
+      <w:r>
+        <w:t>screenshot</w:t>
+      </w:r>
+      <w:proofErr w:type="spellEnd"/>
+      <w:r>
+        <w:t xml:space="preserve"> esteja lá? Pode ser que às vezes sim, às vezes não. Entende o que eu quero dizer? Então, se você não tem certeza assim, </w:t>
+      </w:r>
+      <w:proofErr w:type="spellStart"/>
+      <w:r>
+        <w:t>aham</w:t>
+      </w:r>
+      <w:proofErr w:type="spellEnd"/>
+      <w:r>
+        <w:t xml:space="preserve">, arranca isso, retira, né? Como a gente fez aqui por exemplo transferência, lembra? Quando a gente foi fazer transferência, a gente só precisava de preencher e clicar. Então, é só isso aqui que a gente precisa, né? A gente não precisa desse </w:t>
+      </w:r>
+      <w:proofErr w:type="spellStart"/>
+      <w:r>
+        <w:t>screenshot</w:t>
+      </w:r>
+      <w:proofErr w:type="spellEnd"/>
+      <w:r>
+        <w:t xml:space="preserve">, pelo menos não mais, né? Então o que que a vai fazer? Vamos copiar essas </w:t>
+      </w:r>
+      <w:proofErr w:type="spellStart"/>
+      <w:r>
+        <w:t>essas</w:t>
+      </w:r>
+      <w:proofErr w:type="spellEnd"/>
+      <w:r>
+        <w:t xml:space="preserve"> linhas aqui pra lá, pro </w:t>
+      </w:r>
+      <w:proofErr w:type="spellStart"/>
+      <w:r>
+        <w:t>custom</w:t>
+      </w:r>
+      <w:proofErr w:type="spellEnd"/>
+      <w:r>
+        <w:t xml:space="preserve"> </w:t>
+      </w:r>
+      <w:proofErr w:type="spellStart"/>
+      <w:r>
+        <w:t>comments</w:t>
+      </w:r>
+      <w:proofErr w:type="spellEnd"/>
+      <w:r>
+        <w:t xml:space="preserve">, não, gente vai copiar né? E a gente vai criar </w:t>
+      </w:r>
+      <w:proofErr w:type="spellStart"/>
+      <w:r>
+        <w:t>custom</w:t>
+      </w:r>
+      <w:proofErr w:type="spellEnd"/>
+      <w:r>
+        <w:t xml:space="preserve"> </w:t>
+      </w:r>
+      <w:proofErr w:type="spellStart"/>
+      <w:r>
+        <w:t>comment</w:t>
+      </w:r>
+      <w:proofErr w:type="spellEnd"/>
+      <w:r>
+        <w:t xml:space="preserve"> pra isso, está bom? E esse </w:t>
+      </w:r>
+      <w:proofErr w:type="spellStart"/>
+      <w:r>
+        <w:t>custom</w:t>
+      </w:r>
+      <w:proofErr w:type="spellEnd"/>
+      <w:r>
+        <w:t xml:space="preserve"> </w:t>
+      </w:r>
+      <w:proofErr w:type="spellStart"/>
+      <w:r>
+        <w:t>comment</w:t>
+      </w:r>
+      <w:proofErr w:type="spellEnd"/>
+      <w:r>
+        <w:t>.</w:t>
+      </w:r>
+    </w:p>
+    <w:p>
+      <w:pPr>
+        <w:spacing w:after="0"/>
+      </w:pPr>
+    </w:p>
+    <w:p>
+      <w:pPr>
+        <w:spacing w:after="0"/>
+      </w:pPr>
+      <w:r>
+        <w:t xml:space="preserve">Me </w:t>
+      </w:r>
+      <w:proofErr w:type="spellStart"/>
+      <w:r>
+        <w:t>gusta</w:t>
+      </w:r>
+      <w:proofErr w:type="spellEnd"/>
+      <w:r>
+        <w:t xml:space="preserve"> </w:t>
+      </w:r>
+      <w:proofErr w:type="spellStart"/>
+      <w:r>
+        <w:t>mucho</w:t>
+      </w:r>
+      <w:proofErr w:type="spellEnd"/>
+      <w:r>
+        <w:t xml:space="preserve"> una </w:t>
+      </w:r>
+      <w:proofErr w:type="spellStart"/>
+      <w:r>
+        <w:t>canción</w:t>
+      </w:r>
+      <w:proofErr w:type="spellEnd"/>
+      <w:r>
+        <w:t xml:space="preserve"> de </w:t>
+      </w:r>
+      <w:proofErr w:type="spellStart"/>
+      <w:r>
+        <w:t>reguetón</w:t>
+      </w:r>
+      <w:proofErr w:type="spellEnd"/>
+      <w:r>
+        <w:t xml:space="preserve"> porque </w:t>
+      </w:r>
+      <w:proofErr w:type="spellStart"/>
+      <w:r>
+        <w:t>tiene</w:t>
+      </w:r>
+      <w:proofErr w:type="spellEnd"/>
+      <w:r>
+        <w:t xml:space="preserve"> </w:t>
+      </w:r>
+      <w:proofErr w:type="spellStart"/>
+      <w:r>
+        <w:t>un</w:t>
+      </w:r>
+      <w:proofErr w:type="spellEnd"/>
+      <w:r>
+        <w:t xml:space="preserve"> ritmo alegre, </w:t>
+      </w:r>
+      <w:proofErr w:type="spellStart"/>
+      <w:r>
+        <w:t>un</w:t>
+      </w:r>
+      <w:proofErr w:type="spellEnd"/>
+      <w:r>
+        <w:t xml:space="preserve"> </w:t>
+      </w:r>
+      <w:proofErr w:type="spellStart"/>
+      <w:r>
+        <w:t>niño</w:t>
+      </w:r>
+      <w:proofErr w:type="spellEnd"/>
+      <w:r>
+        <w:t xml:space="preserve"> bailar y me </w:t>
+      </w:r>
+      <w:proofErr w:type="spellStart"/>
+      <w:r>
+        <w:t>pone</w:t>
+      </w:r>
+      <w:proofErr w:type="spellEnd"/>
+      <w:r>
+        <w:t xml:space="preserve"> de </w:t>
+      </w:r>
+      <w:proofErr w:type="spellStart"/>
+      <w:r>
+        <w:t>buen</w:t>
+      </w:r>
+      <w:proofErr w:type="spellEnd"/>
+      <w:r>
+        <w:t xml:space="preserve"> humor.</w:t>
+      </w:r>
+    </w:p>
+    <w:p>
+      <w:pPr>
+        <w:spacing w:after="0"/>
+      </w:pPr>
+    </w:p>
+    <w:p>
+      <w:pPr>
+        <w:spacing w:after="0"/>
+      </w:pPr>
+      <w:proofErr w:type="spellStart"/>
+      <w:r>
+        <w:t>Muy</w:t>
+      </w:r>
+      <w:proofErr w:type="spellEnd"/>
+      <w:r>
+        <w:t xml:space="preserve"> </w:t>
+      </w:r>
+      <w:proofErr w:type="spellStart"/>
+      <w:r>
+        <w:t>bien</w:t>
+      </w:r>
+      <w:proofErr w:type="spellEnd"/>
+      <w:r>
+        <w:t xml:space="preserve">, Mariana. </w:t>
+      </w:r>
+      <w:proofErr w:type="spellStart"/>
+      <w:r>
+        <w:t>Has</w:t>
+      </w:r>
+      <w:proofErr w:type="spellEnd"/>
+      <w:r>
+        <w:t xml:space="preserve"> explicado </w:t>
+      </w:r>
+      <w:proofErr w:type="spellStart"/>
+      <w:r>
+        <w:t>con</w:t>
+      </w:r>
+      <w:proofErr w:type="spellEnd"/>
+      <w:r>
+        <w:t xml:space="preserve"> </w:t>
+      </w:r>
+      <w:proofErr w:type="spellStart"/>
+      <w:r>
+        <w:t>naturalidad</w:t>
+      </w:r>
+      <w:proofErr w:type="spellEnd"/>
+      <w:r>
+        <w:t xml:space="preserve"> </w:t>
+      </w:r>
+      <w:proofErr w:type="spellStart"/>
+      <w:r>
+        <w:t>cómo</w:t>
+      </w:r>
+      <w:proofErr w:type="spellEnd"/>
+      <w:r>
+        <w:t xml:space="preserve"> </w:t>
+      </w:r>
+      <w:proofErr w:type="spellStart"/>
+      <w:r>
+        <w:t>la</w:t>
+      </w:r>
+      <w:proofErr w:type="spellEnd"/>
+      <w:r>
+        <w:t xml:space="preserve"> música </w:t>
+      </w:r>
+      <w:proofErr w:type="spellStart"/>
+      <w:r>
+        <w:t>influye</w:t>
+      </w:r>
+      <w:proofErr w:type="spellEnd"/>
+      <w:r>
+        <w:t xml:space="preserve"> </w:t>
+      </w:r>
+      <w:proofErr w:type="spellStart"/>
+      <w:r>
+        <w:t>en</w:t>
+      </w:r>
+      <w:proofErr w:type="spellEnd"/>
+      <w:r>
+        <w:t xml:space="preserve"> tu </w:t>
+      </w:r>
+      <w:proofErr w:type="spellStart"/>
+      <w:r>
+        <w:t>ánimo</w:t>
+      </w:r>
+      <w:proofErr w:type="spellEnd"/>
+      <w:r>
+        <w:t xml:space="preserve">, y </w:t>
+      </w:r>
+      <w:proofErr w:type="spellStart"/>
+      <w:r>
+        <w:t>eso</w:t>
+      </w:r>
+      <w:proofErr w:type="spellEnd"/>
+      <w:r>
+        <w:t xml:space="preserve"> te </w:t>
+      </w:r>
+      <w:proofErr w:type="spellStart"/>
+      <w:r>
+        <w:t>muestra</w:t>
+      </w:r>
+      <w:proofErr w:type="spellEnd"/>
+      <w:r>
+        <w:t xml:space="preserve"> una </w:t>
+      </w:r>
+      <w:proofErr w:type="spellStart"/>
+      <w:r>
+        <w:t>buena</w:t>
+      </w:r>
+      <w:proofErr w:type="spellEnd"/>
+      <w:r>
+        <w:t xml:space="preserve"> base para </w:t>
+      </w:r>
+      <w:proofErr w:type="spellStart"/>
+      <w:r>
+        <w:t>ganar</w:t>
+      </w:r>
+      <w:proofErr w:type="spellEnd"/>
+      <w:r>
+        <w:t xml:space="preserve"> Twitter. Última pregunta, ¿</w:t>
+      </w:r>
+      <w:proofErr w:type="spellStart"/>
+      <w:r>
+        <w:t>qué</w:t>
+      </w:r>
+      <w:proofErr w:type="spellEnd"/>
+      <w:r>
+        <w:t xml:space="preserve"> </w:t>
+      </w:r>
+      <w:proofErr w:type="spellStart"/>
+      <w:r>
+        <w:t>tecnología</w:t>
+      </w:r>
+      <w:proofErr w:type="spellEnd"/>
+      <w:r>
+        <w:t xml:space="preserve"> usas a menudo y para ti?</w:t>
+      </w:r>
+    </w:p>
+    <w:p>
+      <w:pPr>
+        <w:spacing w:after="0"/>
+      </w:pPr>
+    </w:p>
+    <w:p>
+      <w:pPr>
+        <w:spacing w:after="0"/>
+      </w:pPr>
+      <w:r>
+        <w:t xml:space="preserve">Vai se chamar fazer login. Então, copiai aqui, vou ir lá no login e vou digitar Cypress ponto </w:t>
+      </w:r>
+      <w:proofErr w:type="spellStart"/>
+      <w:r>
+        <w:t>commands</w:t>
+      </w:r>
+      <w:proofErr w:type="spellEnd"/>
+      <w:r>
+        <w:t xml:space="preserve">, </w:t>
+      </w:r>
+      <w:proofErr w:type="spellStart"/>
+      <w:r>
+        <w:t>commands</w:t>
+      </w:r>
+      <w:proofErr w:type="spellEnd"/>
+      <w:r>
+        <w:t xml:space="preserve"> ponto ADD. Abro parênteses, dou aspas simples aqui e falo qual vai ser o nome do comando, ok? Tem times que definem que toda a função a ser criada, e aqui no caso todo comando personalizado a ser criado, vai ter que ser escrito em inglês. Outros times falam, não, a gente vai escrever os nossos em português. Você aí do outro lado define junto com o seu time qual você prefere, beleza? Eu preferiria escrever todo em inglês, mas pra que a gente possa melhorar a didática aqui, ao invés de colocar você enrascada porque você não entendeu o eu escrevi em inglês, eu vou optar pelo português, está bom? Então vamos lá. Que que é esse comando que a gente está querendo fazer? É comando para fazer login com credenciais válidas, certo? Esse é o nome da função. Vou vir aqui, dar 1 vírgula, vou colocar aqui agora 1 </w:t>
+      </w:r>
+      <w:proofErr w:type="spellStart"/>
+      <w:r>
+        <w:t>arrow</w:t>
+      </w:r>
+      <w:proofErr w:type="spellEnd"/>
+      <w:r>
+        <w:t xml:space="preserve"> </w:t>
+      </w:r>
+      <w:proofErr w:type="spellStart"/>
+      <w:r>
+        <w:t>function</w:t>
+      </w:r>
+      <w:proofErr w:type="spellEnd"/>
+      <w:r>
+        <w:t xml:space="preserve"> que é a nossa função de </w:t>
+      </w:r>
+      <w:proofErr w:type="spellStart"/>
+      <w:r>
+        <w:t>callback</w:t>
+      </w:r>
+      <w:proofErr w:type="spellEnd"/>
+      <w:r>
+        <w:t xml:space="preserve">, e aqui dentro eu vou colar todo aquele script que a gente já tinha e vou remover aqui o </w:t>
+      </w:r>
+      <w:proofErr w:type="spellStart"/>
+      <w:r>
+        <w:t>screenshot</w:t>
+      </w:r>
+      <w:proofErr w:type="spellEnd"/>
+      <w:r>
+        <w:t xml:space="preserve">, ok? Prontinho. Agora a gente já tem comando para fazer login com credenciais válidas. </w:t>
+      </w:r>
+      <w:proofErr w:type="spellStart"/>
+      <w:r>
+        <w:t>Julio</w:t>
+      </w:r>
+      <w:proofErr w:type="spellEnd"/>
+      <w:r>
+        <w:t xml:space="preserve">, como que eu faço pra usar isso? Simples, você vem aqui olha, lá na sua função de login, onde você tinha todo esse código aqui olha o que eu fazer? Vou dar delete em tudo, tudo essas </w:t>
+      </w:r>
+      <w:proofErr w:type="spellStart"/>
+      <w:r>
+        <w:t>essas</w:t>
+      </w:r>
+      <w:proofErr w:type="spellEnd"/>
+      <w:r>
+        <w:t xml:space="preserve"> linhas aqui que a colocou lá dentro. Delete? Venho aqui digito sai ponto fazer login com credenciais válidas, abre e fecha parênteses, assim, simples assim. Ou seja, que que Júlio, como que eu faço pra usar isso? Simples, você vem aqui olha, lá na sua função de login, onde você tinha todo esse código aqui, o que vou fazer? Vou dar delete em tudo. Tudo essas </w:t>
+      </w:r>
+      <w:proofErr w:type="spellStart"/>
+      <w:r>
+        <w:t>essas</w:t>
+      </w:r>
+      <w:proofErr w:type="spellEnd"/>
+      <w:r>
+        <w:t xml:space="preserve"> linhas aqui que a colocou lá dentro. Delete, venho aqui digito sai ponto fazer login com credenciais válidas, abre e fecha parênteses, assim, simples assim. Ou seja, que que era, o que que o meu, o meu, de login fez? Ele fez com que agora a forma de fazer login com credenciais válidas ficasse aqui, se algum dia mudar é aqui que eu mudo, entendeu? Mas lá dentro dos meus scripts, se eu quiser fazer login com credenciais válidos eu só vou ter que digitar isso. </w:t>
+      </w:r>
+      <w:proofErr w:type="spellStart"/>
+      <w:r>
+        <w:t>Julio</w:t>
+      </w:r>
+      <w:proofErr w:type="spellEnd"/>
+      <w:r>
+        <w:t xml:space="preserve">, mas lá </w:t>
+      </w:r>
+      <w:proofErr w:type="gramStart"/>
+      <w:r>
+        <w:t>no transferência</w:t>
+      </w:r>
+      <w:proofErr w:type="gramEnd"/>
+      <w:r>
+        <w:t xml:space="preserve"> você também tinha o login, que que você faz aqui? Mesma coisa, olha só, eu venho aqui, apago essas questões aqui do que eu já tenho olha, veja, elas são iguais o que a gente </w:t>
+      </w:r>
+      <w:r>
+        <w:lastRenderedPageBreak/>
+        <w:t xml:space="preserve">tem lá, está vendo olha? São 2, 3, 4, 5 linhas aqui, e aqui </w:t>
+      </w:r>
+      <w:proofErr w:type="gramStart"/>
+      <w:r>
+        <w:t>no transferência</w:t>
+      </w:r>
+      <w:proofErr w:type="gramEnd"/>
+      <w:r>
+        <w:t xml:space="preserve"> é igualzinho a 3, 4, 5 linhas exatamente os mesmos comandos pra </w:t>
+      </w:r>
+      <w:proofErr w:type="gramStart"/>
+      <w:r>
+        <w:t>credenciais válidos</w:t>
+      </w:r>
+      <w:proofErr w:type="gramEnd"/>
+      <w:r>
+        <w:t xml:space="preserve">, então o eu faço? Apago daqui, digito sai, ponto, colo aqui, olha, o nome da minha função. Prontinho, ok? E agora em todo lugar que eu tiver credenciais válidas é assim que eu vou fazer. Vou salvar </w:t>
+      </w:r>
+      <w:proofErr w:type="gramStart"/>
+      <w:r>
+        <w:t>o transferências</w:t>
+      </w:r>
+      <w:proofErr w:type="gramEnd"/>
+      <w:r>
+        <w:t xml:space="preserve">, vou salvar o login sai e vou abrir aqui o Cypress pra você ver que realmente isso daqui funciona, tá? Então olha só, vou digitar aqui </w:t>
+      </w:r>
+      <w:proofErr w:type="spellStart"/>
+      <w:r>
+        <w:t>npm</w:t>
+      </w:r>
+      <w:proofErr w:type="spellEnd"/>
+      <w:r>
+        <w:t xml:space="preserve"> </w:t>
+      </w:r>
+      <w:proofErr w:type="spellStart"/>
+      <w:r>
+        <w:t>run</w:t>
+      </w:r>
+      <w:proofErr w:type="spellEnd"/>
+      <w:r>
+        <w:t xml:space="preserve"> sai open. Está abrindo aqui, está abrindo aqui o </w:t>
+      </w:r>
+      <w:proofErr w:type="gramStart"/>
+      <w:r>
+        <w:t>Cypress,,</w:t>
+      </w:r>
+      <w:proofErr w:type="gramEnd"/>
+      <w:r>
+        <w:t xml:space="preserve"> Electron. Vem aqui olha, clica aqui no login. Olha o login preenchendo. Login com dados válidos olha, funcionou certinho olha. Tem aqui o </w:t>
+      </w:r>
+      <w:proofErr w:type="spellStart"/>
+      <w:r>
+        <w:t>get</w:t>
+      </w:r>
+      <w:proofErr w:type="spellEnd"/>
+      <w:r>
+        <w:t xml:space="preserve"> do </w:t>
+      </w:r>
+      <w:proofErr w:type="spellStart"/>
+      <w:r>
+        <w:t>username</w:t>
+      </w:r>
+      <w:proofErr w:type="spellEnd"/>
+      <w:r>
+        <w:t xml:space="preserve">, o click, o </w:t>
+      </w:r>
+      <w:proofErr w:type="spellStart"/>
+      <w:r>
+        <w:t>type</w:t>
+      </w:r>
+      <w:proofErr w:type="spellEnd"/>
+      <w:r>
+        <w:t xml:space="preserve">, o 0 </w:t>
+      </w:r>
+      <w:proofErr w:type="spellStart"/>
+      <w:r>
+        <w:t>get</w:t>
+      </w:r>
+      <w:proofErr w:type="spellEnd"/>
+      <w:r>
+        <w:t xml:space="preserve"> aqui </w:t>
+      </w:r>
+      <w:proofErr w:type="gramStart"/>
+      <w:r>
+        <w:t>do senha</w:t>
+      </w:r>
+      <w:proofErr w:type="gramEnd"/>
+      <w:r>
+        <w:t xml:space="preserve">, o click e o </w:t>
+      </w:r>
+      <w:proofErr w:type="spellStart"/>
+      <w:r>
+        <w:t>type</w:t>
+      </w:r>
+      <w:proofErr w:type="spellEnd"/>
+      <w:r>
+        <w:t xml:space="preserve">, clicou no botão entrar, foi lá e fez as ações, e chegou no realizar transferência. Ok? Agora eu vou fazer o de transferência pra você ver, então vou vir aqui em </w:t>
+      </w:r>
+      <w:proofErr w:type="spellStart"/>
+      <w:r>
+        <w:t>specs</w:t>
+      </w:r>
+      <w:proofErr w:type="spellEnd"/>
+      <w:r>
+        <w:t xml:space="preserve">, clico aqui em transferência, está vendo? Olha lá, transferência rodou certinho também, aqui olha, no </w:t>
+      </w:r>
+      <w:proofErr w:type="spellStart"/>
+      <w:r>
+        <w:t>before</w:t>
+      </w:r>
+      <w:proofErr w:type="spellEnd"/>
+      <w:r>
+        <w:t xml:space="preserve"> it fez o login, está vendo? Muito legal né, então a gente consegue assim aproveitar código, monte de código, né? Aí eu volto aqui pro login, certo? E continuo olhando aqui pra coisas que eu poderia substituir, né, por </w:t>
+      </w:r>
+      <w:proofErr w:type="spellStart"/>
+      <w:r>
+        <w:t>por</w:t>
+      </w:r>
+      <w:proofErr w:type="spellEnd"/>
+      <w:r>
+        <w:t xml:space="preserve"> comandos aqui customizados. Então olha só, por exemplo, esse daqui olha, esse daqui é o lugar com credenciais inválidas. Eu venho aqui, mesma coisa olha, seleciono todo ele, está vendo? Copio daqui, vou lá no login, porque ele faz parte do login, né? Faço aqui olha, Cypress ponto </w:t>
+      </w:r>
+      <w:proofErr w:type="spellStart"/>
+      <w:r>
+        <w:t>comments</w:t>
+      </w:r>
+      <w:proofErr w:type="spellEnd"/>
+      <w:r>
+        <w:t xml:space="preserve"> ponto ADD, coloco aqui olha, fazer login com credenciais inválidas, inválidas. Ponho aqui a minha </w:t>
+      </w:r>
+      <w:proofErr w:type="spellStart"/>
+      <w:r>
+        <w:t>arrow</w:t>
+      </w:r>
+      <w:proofErr w:type="spellEnd"/>
+      <w:r>
+        <w:t xml:space="preserve"> </w:t>
+      </w:r>
+      <w:proofErr w:type="spellStart"/>
+      <w:r>
+        <w:t>function</w:t>
+      </w:r>
+      <w:proofErr w:type="spellEnd"/>
+      <w:r>
+        <w:t xml:space="preserve">, colo aqui, vou tirar essa linha porque não faz sentido </w:t>
+      </w:r>
+      <w:proofErr w:type="spellStart"/>
+      <w:r>
+        <w:t>deixála</w:t>
+      </w:r>
+      <w:proofErr w:type="spellEnd"/>
+      <w:r>
+        <w:t xml:space="preserve"> aqui. Beleza? Volto lá aqui na minha, no meu Graça a linha porque não faz sentido </w:t>
+      </w:r>
+      <w:proofErr w:type="spellStart"/>
+      <w:r>
+        <w:t>deixála</w:t>
+      </w:r>
+      <w:proofErr w:type="spellEnd"/>
+      <w:r>
+        <w:t xml:space="preserve"> aqui. Beleza? Volto lá aqui na minha no meu login e troco tudo isso daqui por fazer login com credenciais inválidas, né? Lembrando que há sai ponto, então vem aqui sai ponto, fazer login com credenciais inválidas, está lá, ele é? Já fiz aqui o do login. Vou voltar aqui no Cypress, clico aqui nos </w:t>
+      </w:r>
+      <w:proofErr w:type="spellStart"/>
+      <w:r>
+        <w:t>specs</w:t>
+      </w:r>
+      <w:proofErr w:type="spellEnd"/>
+      <w:r>
+        <w:t xml:space="preserve">, vou em login. </w:t>
+      </w:r>
+      <w:proofErr w:type="spellStart"/>
+      <w:r>
+        <w:t>Fez</w:t>
+      </w:r>
+      <w:proofErr w:type="spellEnd"/>
+      <w:r>
+        <w:t xml:space="preserve"> login com credenciais válidas, </w:t>
+      </w:r>
+      <w:proofErr w:type="spellStart"/>
+      <w:r>
+        <w:t>fez</w:t>
+      </w:r>
+      <w:proofErr w:type="spellEnd"/>
+      <w:r>
+        <w:t xml:space="preserve"> login com credenciais inválidas, tudo funcionando certinho. Então, estamos economizando linhas de código, né? Está vendo esses </w:t>
+      </w:r>
+      <w:proofErr w:type="spellStart"/>
+      <w:r>
+        <w:t>screenshots</w:t>
+      </w:r>
+      <w:proofErr w:type="spellEnd"/>
+      <w:r>
+        <w:t xml:space="preserve"> aqui? Eu, como eu disse pra você, a </w:t>
+      </w:r>
+      <w:proofErr w:type="gramStart"/>
+      <w:r>
+        <w:t>estava</w:t>
+      </w:r>
+      <w:proofErr w:type="gramEnd"/>
+      <w:r>
+        <w:t xml:space="preserve"> </w:t>
+      </w:r>
+      <w:proofErr w:type="spellStart"/>
+      <w:r>
+        <w:t>estava</w:t>
+      </w:r>
+      <w:proofErr w:type="spellEnd"/>
+      <w:r>
+        <w:t xml:space="preserve"> usando lá naquela aula de </w:t>
+      </w:r>
+      <w:proofErr w:type="spellStart"/>
+      <w:r>
+        <w:t>screenshot</w:t>
+      </w:r>
+      <w:proofErr w:type="spellEnd"/>
+      <w:r>
+        <w:t xml:space="preserve"> pra você aprender, mas eu vou remover, está bom? Só pra você ver como vai ficar legal aqui o nosso </w:t>
+      </w:r>
+      <w:proofErr w:type="spellStart"/>
+      <w:r>
+        <w:t>nosso</w:t>
+      </w:r>
+      <w:proofErr w:type="spellEnd"/>
+      <w:r>
+        <w:t xml:space="preserve"> código. Olha. Agora, o que que a gente tem? Temos aqui o </w:t>
+      </w:r>
+      <w:proofErr w:type="spellStart"/>
+      <w:r>
+        <w:t>before</w:t>
+      </w:r>
+      <w:proofErr w:type="spellEnd"/>
+      <w:r>
+        <w:t xml:space="preserve"> it, temos aqui o it, temos aqui esse it também, e está belezinha, né? Está vendo? A gente está conseguindo aqui então executar as ações, fazer 1 validação, executar as ações, fazer 1 validação. Ok? Aqui a gente tem essa asserção que nós estamos fazendo aqui dentro da, né, dos testes de login, que ela é 1 asserção de verificar aqui o texto que a caixa né, contexto realizar transferência, está visível, e isso daqui representa que a gente fez o login. Quantas vezes a gente vai usar esse comando aqui? Ah, </w:t>
+      </w:r>
+      <w:proofErr w:type="spellStart"/>
+      <w:r>
+        <w:t>Julio</w:t>
+      </w:r>
+      <w:proofErr w:type="spellEnd"/>
+      <w:r>
+        <w:t xml:space="preserve">, pelo que pelo que eu vi aqui é 1 só, é login com </w:t>
+      </w:r>
+      <w:proofErr w:type="spellStart"/>
+      <w:r>
+        <w:t>com</w:t>
+      </w:r>
+      <w:proofErr w:type="spellEnd"/>
+      <w:r>
+        <w:t xml:space="preserve"> 1 1 validação de login válido e eu verifico aqui que realmente entrou. Legal. Agora olha pra essa outra aqui olha, essa aqui é a do </w:t>
+      </w:r>
+      <w:proofErr w:type="spellStart"/>
+      <w:r>
+        <w:t>Toast</w:t>
+      </w:r>
+      <w:proofErr w:type="spellEnd"/>
+      <w:r>
+        <w:t xml:space="preserve">. Quantas vezes a gente vai validar </w:t>
+      </w:r>
+      <w:proofErr w:type="spellStart"/>
+      <w:r>
+        <w:t>Toast</w:t>
+      </w:r>
+      <w:proofErr w:type="spellEnd"/>
+      <w:r>
+        <w:t xml:space="preserve">? Ah, </w:t>
+      </w:r>
+      <w:proofErr w:type="spellStart"/>
+      <w:r>
+        <w:t>Julio</w:t>
+      </w:r>
+      <w:proofErr w:type="spellEnd"/>
+      <w:r>
+        <w:t xml:space="preserve">, vai aparecer monte de </w:t>
+      </w:r>
+      <w:proofErr w:type="spellStart"/>
+      <w:r>
+        <w:t>Toast</w:t>
+      </w:r>
+      <w:proofErr w:type="spellEnd"/>
+      <w:r>
+        <w:t xml:space="preserve">, né? Tem o </w:t>
+      </w:r>
+      <w:proofErr w:type="spellStart"/>
+      <w:r>
+        <w:t>Toast</w:t>
+      </w:r>
+      <w:proofErr w:type="spellEnd"/>
+      <w:r>
+        <w:t xml:space="preserve"> do </w:t>
+      </w:r>
+      <w:proofErr w:type="spellStart"/>
+      <w:r>
+        <w:t>do</w:t>
+      </w:r>
+      <w:proofErr w:type="spellEnd"/>
+      <w:r>
+        <w:t xml:space="preserve"> da transferência a falha, transferência com sucesso, do login com falha, tem monte de </w:t>
+      </w:r>
+      <w:proofErr w:type="spellStart"/>
+      <w:r>
+        <w:t>toast</w:t>
+      </w:r>
+      <w:proofErr w:type="spellEnd"/>
+      <w:r>
+        <w:t xml:space="preserve"> né, é isso, no que muda entre </w:t>
+      </w:r>
+      <w:proofErr w:type="spellStart"/>
+      <w:r>
+        <w:t>toast</w:t>
+      </w:r>
+      <w:proofErr w:type="spellEnd"/>
+      <w:r>
+        <w:t xml:space="preserve"> e outro. E aí você me fala o que muda </w:t>
+      </w:r>
+      <w:proofErr w:type="spellStart"/>
+      <w:r>
+        <w:t>Julio</w:t>
+      </w:r>
+      <w:proofErr w:type="spellEnd"/>
+      <w:r>
+        <w:t xml:space="preserve">? É o texto. Excelente. Se ele vai acontecer várias vezes e ele tem 1 estrutura que é igual e só muda dado dentro dele, gente pode transformar ele em </w:t>
+      </w:r>
+      <w:proofErr w:type="spellStart"/>
+      <w:r>
+        <w:t>custom</w:t>
+      </w:r>
+      <w:proofErr w:type="spellEnd"/>
+      <w:r>
+        <w:t xml:space="preserve"> </w:t>
+      </w:r>
+      <w:proofErr w:type="spellStart"/>
+      <w:r>
+        <w:t>comment</w:t>
+      </w:r>
+      <w:proofErr w:type="spellEnd"/>
+      <w:r>
+        <w:t xml:space="preserve">. Agora, </w:t>
+      </w:r>
+      <w:proofErr w:type="spellStart"/>
+      <w:r>
+        <w:t>Julio</w:t>
+      </w:r>
+      <w:proofErr w:type="spellEnd"/>
+      <w:r>
+        <w:t xml:space="preserve">, esse </w:t>
+      </w:r>
+      <w:proofErr w:type="spellStart"/>
+      <w:r>
+        <w:t>custom</w:t>
+      </w:r>
+      <w:proofErr w:type="spellEnd"/>
+      <w:r>
+        <w:t xml:space="preserve"> </w:t>
+      </w:r>
+      <w:proofErr w:type="spellStart"/>
+      <w:r>
+        <w:t>comment</w:t>
+      </w:r>
+      <w:proofErr w:type="spellEnd"/>
+      <w:r>
+        <w:t xml:space="preserve"> deveria estar dentro do login e dentro da transferência porque ele vai aparecer nos 2? Não. Se ele vai aparecer nos 2 ou em mais, ele tem que estar dentro do common, entendeu o objetivo do common aqui? O common é algo que é comum em toda aplicação. Então eu vou criar aqui agora </w:t>
+      </w:r>
+      <w:proofErr w:type="spellStart"/>
+      <w:r>
+        <w:t>custom</w:t>
+      </w:r>
+      <w:proofErr w:type="spellEnd"/>
+      <w:r>
+        <w:t xml:space="preserve"> </w:t>
+      </w:r>
+      <w:proofErr w:type="spellStart"/>
+      <w:r>
+        <w:t>comment</w:t>
+      </w:r>
+      <w:proofErr w:type="spellEnd"/>
+      <w:r>
+        <w:t xml:space="preserve">. Cypress ponto </w:t>
+      </w:r>
+      <w:proofErr w:type="spellStart"/>
+      <w:r>
+        <w:t>comments</w:t>
+      </w:r>
+      <w:proofErr w:type="spellEnd"/>
+      <w:r>
+        <w:t xml:space="preserve"> ponto ADD, verificar mensagem no </w:t>
+      </w:r>
+      <w:proofErr w:type="spellStart"/>
+      <w:r>
+        <w:t>Toast</w:t>
+      </w:r>
+      <w:proofErr w:type="spellEnd"/>
+      <w:r>
+        <w:t xml:space="preserve">, ok? Nesse caso aqui, eu vou fazer simples 1º, está bom? Olha só, coloquei aqui a minha a minha </w:t>
+      </w:r>
+      <w:proofErr w:type="spellStart"/>
+      <w:r>
+        <w:t>arrow</w:t>
+      </w:r>
+      <w:proofErr w:type="spellEnd"/>
+      <w:r>
+        <w:t xml:space="preserve"> </w:t>
+      </w:r>
+      <w:proofErr w:type="spellStart"/>
+      <w:r>
+        <w:t>function</w:t>
+      </w:r>
+      <w:proofErr w:type="spellEnd"/>
+      <w:r>
+        <w:t xml:space="preserve"> e coloquei aqui esse comando. Só que olha só, esse comando aqui que a gente acabou de criar é o verificar mensagem no </w:t>
+      </w:r>
+      <w:proofErr w:type="spellStart"/>
+      <w:r>
+        <w:t>Toast</w:t>
+      </w:r>
+      <w:proofErr w:type="spellEnd"/>
+      <w:r>
+        <w:t xml:space="preserve">, e ele, olha só, ele tem aqui 1 mensagem que é a mensagem erro no login </w:t>
+      </w:r>
+      <w:proofErr w:type="spellStart"/>
+      <w:r>
+        <w:t>intent</w:t>
+      </w:r>
+      <w:proofErr w:type="spellEnd"/>
+      <w:r>
+        <w:t xml:space="preserve"> novamente. Essa mensagem erro no login </w:t>
+      </w:r>
+      <w:proofErr w:type="spellStart"/>
+      <w:r>
+        <w:t>intent</w:t>
+      </w:r>
+      <w:proofErr w:type="spellEnd"/>
+      <w:r>
+        <w:t xml:space="preserve"> novamente, ela só serve pra 1 mensagem de erro no login. Se fosse pra criar comando para apenas essa mensagem eu teria que criar aqui dentro do login, e criar muitos comandos parecidos com esse que só tem o texto alterado. </w:t>
+      </w:r>
+      <w:r>
+        <w:lastRenderedPageBreak/>
+        <w:t xml:space="preserve">Mas não é isso que eu quero, eu quero que </w:t>
+      </w:r>
+      <w:proofErr w:type="gramStart"/>
+      <w:r>
+        <w:t xml:space="preserve">essa esse </w:t>
+      </w:r>
+      <w:proofErr w:type="spellStart"/>
+      <w:r>
+        <w:t>esse</w:t>
+      </w:r>
+      <w:proofErr w:type="spellEnd"/>
+      <w:r>
+        <w:t xml:space="preserve"> nosso comando</w:t>
+      </w:r>
+      <w:proofErr w:type="gramEnd"/>
+      <w:r>
+        <w:t xml:space="preserve"> customizado ele sirva pra várias coisas na própria aplicação, ok? É por isso que eu coloquei dentro do comum. Então o que eu vou fazer? Aqui olha, no lugar </w:t>
+      </w:r>
+      <w:proofErr w:type="gramStart"/>
+      <w:r>
+        <w:t>desse parênteses</w:t>
+      </w:r>
+      <w:proofErr w:type="gramEnd"/>
+      <w:r>
+        <w:t xml:space="preserve"> aqui, eu vou colocar 1, é parâmetro, né, que é o parâmetro que eu vou passar o texto que eu quero verificar. Então aqui eu vou colocar assim olha, mensagem, está vendo? Então olha só, eu estou criando comando chamado verificar mensagem no </w:t>
+      </w:r>
+      <w:proofErr w:type="spellStart"/>
+      <w:r>
+        <w:t>Toast</w:t>
+      </w:r>
+      <w:proofErr w:type="spellEnd"/>
+      <w:r>
+        <w:t xml:space="preserve"> que vai receber 1 mensagem, e ao receber essa mensagem ele vai usar a mensagem aqui olha, no lugar dessa mensagem fixa, está vendo? Mensagem. Então, o que que ele está dizendo? Ele falando olha, quando alguém chamar o verificar mensagem no </w:t>
+      </w:r>
+      <w:proofErr w:type="spellStart"/>
+      <w:r>
+        <w:t>Toast</w:t>
+      </w:r>
+      <w:proofErr w:type="spellEnd"/>
+      <w:r>
+        <w:t xml:space="preserve"> tem que passar a mensagem por parâmetro e aí eu vou usar aqui o Cypress pra pegar o </w:t>
+      </w:r>
+      <w:proofErr w:type="spellStart"/>
+      <w:r>
+        <w:t>Toast</w:t>
+      </w:r>
+      <w:proofErr w:type="spellEnd"/>
+      <w:r>
+        <w:t xml:space="preserve"> e verificar aqui dentro do </w:t>
+      </w:r>
+      <w:proofErr w:type="spellStart"/>
+      <w:r>
+        <w:t>Toast</w:t>
+      </w:r>
+      <w:proofErr w:type="spellEnd"/>
+      <w:r>
+        <w:t xml:space="preserve"> tem aquela determinada mensagem, é comando customizado. Agora o eu faço? Venho aqui olha, seleciono verificar mensagem no </w:t>
+      </w:r>
+      <w:proofErr w:type="spellStart"/>
+      <w:r>
+        <w:t>Toast</w:t>
+      </w:r>
+      <w:proofErr w:type="spellEnd"/>
+      <w:r>
+        <w:t xml:space="preserve">, volto lá pro login, opa, aqui olha, pro login sai, e aqui no lugar desse sai ponto </w:t>
+      </w:r>
+      <w:proofErr w:type="spellStart"/>
+      <w:r>
+        <w:t>get</w:t>
+      </w:r>
+      <w:proofErr w:type="spellEnd"/>
+      <w:r>
+        <w:t xml:space="preserve">, vou escrever embaixo aqui pra você ver como vai ficar, vai ficar assim olha, sai ponto verificar mensagem no </w:t>
+      </w:r>
+      <w:proofErr w:type="spellStart"/>
+      <w:r>
+        <w:t>Toast</w:t>
+      </w:r>
+      <w:proofErr w:type="spellEnd"/>
+      <w:r>
+        <w:t xml:space="preserve"> parênteses, e aqui </w:t>
+      </w:r>
+      <w:proofErr w:type="gramStart"/>
+      <w:r>
+        <w:t>dentro do parênteses</w:t>
+      </w:r>
+      <w:proofErr w:type="gramEnd"/>
+      <w:r>
+        <w:t xml:space="preserve"> vai ter a mensagem que eu quero verificar, lembra que eu falei que tem que passar a mensagem por parâmetro? Então olha como era, e olha como ficou, ok? E agora, esse sai verificar mensagem no </w:t>
+      </w:r>
+      <w:proofErr w:type="spellStart"/>
+      <w:r>
+        <w:t>Toast</w:t>
+      </w:r>
+      <w:proofErr w:type="spellEnd"/>
+      <w:r>
+        <w:t xml:space="preserve">, ele vai servir em qualquer lugar, inclusive aqui olha, transferência sai, todo lugar que tiver </w:t>
+      </w:r>
+      <w:proofErr w:type="spellStart"/>
+      <w:r>
+        <w:t>Toast</w:t>
+      </w:r>
+      <w:proofErr w:type="spellEnd"/>
+      <w:r>
+        <w:t xml:space="preserve"> eu posso trocar, olha, está vendo </w:t>
+      </w:r>
+      <w:proofErr w:type="spellStart"/>
+      <w:r>
+        <w:t>Toast</w:t>
+      </w:r>
+      <w:proofErr w:type="spellEnd"/>
+      <w:r>
+        <w:t xml:space="preserve"> aqui? Eu venho aqui e faço sai ponto, opa, deixa eu pegar aqui né, </w:t>
+      </w:r>
+      <w:proofErr w:type="gramStart"/>
+      <w:r>
+        <w:t>Sai</w:t>
+      </w:r>
+      <w:proofErr w:type="gramEnd"/>
+      <w:r>
+        <w:t xml:space="preserve"> ponto verificar mensagem no Tost, parênteses, aspas simples e coloco aí dentro a mensagem, está vendo? E agora não preciso mais desse aqui porque eu estou usando esse meu </w:t>
+      </w:r>
+      <w:proofErr w:type="spellStart"/>
+      <w:r>
+        <w:t>custom</w:t>
+      </w:r>
+      <w:proofErr w:type="spellEnd"/>
+      <w:r>
+        <w:t xml:space="preserve"> </w:t>
+      </w:r>
+      <w:proofErr w:type="spellStart"/>
+      <w:r>
+        <w:t>command</w:t>
+      </w:r>
+      <w:proofErr w:type="spellEnd"/>
+      <w:r>
+        <w:t xml:space="preserve"> que é geral, ok? Fiz isso daqui, fiz essa mudança aqui no </w:t>
+      </w:r>
+      <w:proofErr w:type="spellStart"/>
+      <w:r>
+        <w:t>no</w:t>
+      </w:r>
+      <w:proofErr w:type="spellEnd"/>
+      <w:r>
+        <w:t xml:space="preserve"> login, fiz a mudança aqui na transferência, vou lá rodar, está bom? E aí só pra concluir, né, aqui você vê então que esse comando aqui ele é comando de inserção sem o uso de </w:t>
+      </w:r>
+      <w:proofErr w:type="spellStart"/>
+      <w:r>
+        <w:t>custom</w:t>
+      </w:r>
+      <w:proofErr w:type="spellEnd"/>
+      <w:r>
+        <w:t xml:space="preserve"> </w:t>
+      </w:r>
+      <w:proofErr w:type="spellStart"/>
+      <w:r>
+        <w:t>command</w:t>
+      </w:r>
+      <w:proofErr w:type="spellEnd"/>
+      <w:r>
+        <w:t xml:space="preserve">, porque </w:t>
+      </w:r>
+      <w:proofErr w:type="spellStart"/>
+      <w:r>
+        <w:t>porque</w:t>
+      </w:r>
+      <w:proofErr w:type="spellEnd"/>
+      <w:r>
+        <w:t xml:space="preserve"> ele aconteceu apenas 1 vez, e esse daqui já é </w:t>
+      </w:r>
+      <w:proofErr w:type="spellStart"/>
+      <w:r>
+        <w:t>custom</w:t>
+      </w:r>
+      <w:proofErr w:type="spellEnd"/>
+      <w:r>
+        <w:t xml:space="preserve"> </w:t>
+      </w:r>
+      <w:proofErr w:type="spellStart"/>
+      <w:r>
+        <w:t>command</w:t>
+      </w:r>
+      <w:proofErr w:type="spellEnd"/>
+      <w:r>
+        <w:t xml:space="preserve">. Por quê? Porque essa verificação do </w:t>
+      </w:r>
+      <w:proofErr w:type="spellStart"/>
+      <w:r>
+        <w:t>Toast</w:t>
+      </w:r>
+      <w:proofErr w:type="spellEnd"/>
+      <w:r>
+        <w:t xml:space="preserve"> vai acontecer muitas vezes dentro do nosso script, então é assim que você define se tem ou não que fazer parte na, de </w:t>
+      </w:r>
+      <w:proofErr w:type="spellStart"/>
+      <w:r>
+        <w:t>custom</w:t>
+      </w:r>
+      <w:proofErr w:type="spellEnd"/>
+      <w:r>
+        <w:t xml:space="preserve"> </w:t>
+      </w:r>
+      <w:proofErr w:type="spellStart"/>
+      <w:r>
+        <w:t>command</w:t>
+      </w:r>
+      <w:proofErr w:type="spellEnd"/>
+      <w:r>
+        <w:t xml:space="preserve">, ok? Parece que o login já está pronto, né? Vamos lá pra transferência agora. Aqui </w:t>
+      </w:r>
+      <w:proofErr w:type="gramStart"/>
+      <w:r>
+        <w:t>no transferência</w:t>
+      </w:r>
+      <w:proofErr w:type="gramEnd"/>
+      <w:r>
+        <w:t xml:space="preserve">, a gente também tem aqui, olha só que interessante, né, outro comando que se repete muito, é esse daqui, olha, que é aquele elemento. De combo box, né, que a tem aqui na transferência. E a gente tem que pensar assim, o nosso sistema, não é, deixa eu voltar aqui pra você ver, não, deixa eu clicar aqui, aqui. Olha só, o nosso sistema do banco por enquanto ele só tem 1 funcionalidade que é de realizar transferência, mas, em qualquer lugar. Vem então. Por quê? Porque essa verificação do </w:t>
+      </w:r>
+      <w:proofErr w:type="spellStart"/>
+      <w:r>
+        <w:t>toast</w:t>
+      </w:r>
+      <w:proofErr w:type="spellEnd"/>
+      <w:r>
+        <w:t xml:space="preserve"> vai. Por enquanto ele só tem 1 funcionalidade que é de realizar transferência, mas em qualquer lugar do sistema que tenha caixa de seleção ela sempre vai ser assim, entendeu? Não é padrão. Se ela sempre vai ser assim, que que eu faço? Vou ter que ficar toda vez copiando e colando esses 3 essas 3 linhas? Não, não faz sentido. Então o eu faço? Transformo isso daqui em </w:t>
+      </w:r>
+      <w:proofErr w:type="spellStart"/>
+      <w:r>
+        <w:t>custom</w:t>
+      </w:r>
+      <w:proofErr w:type="spellEnd"/>
+      <w:r>
+        <w:t xml:space="preserve"> </w:t>
+      </w:r>
+      <w:proofErr w:type="spellStart"/>
+      <w:r>
+        <w:t>command</w:t>
+      </w:r>
+      <w:proofErr w:type="spellEnd"/>
+      <w:r>
+        <w:t xml:space="preserve"> e passo pra ele apenas os parâmetros que eu preciso que são, nome do </w:t>
+      </w:r>
+      <w:proofErr w:type="spellStart"/>
+      <w:r>
+        <w:t>label</w:t>
+      </w:r>
+      <w:proofErr w:type="spellEnd"/>
+      <w:r>
+        <w:t xml:space="preserve">, está vendo? Nome do </w:t>
+      </w:r>
+      <w:proofErr w:type="spellStart"/>
+      <w:r>
+        <w:t>label</w:t>
+      </w:r>
+      <w:proofErr w:type="spellEnd"/>
+      <w:r>
+        <w:t xml:space="preserve"> que vai ser usado aqui nas em todos esses lugares, e também eu vou passar qual é o 0 elemento que eu quero selecionar, certo? Então é isso aqui que a gente vai fazer. Vou copiar daqui, e aí você tem que pensar, puxa, isso daqui está dentro do transferências, mas a pergunta é, está dentro do </w:t>
+      </w:r>
+      <w:proofErr w:type="gramStart"/>
+      <w:r>
+        <w:t>transferências</w:t>
+      </w:r>
+      <w:proofErr w:type="gramEnd"/>
+      <w:r>
+        <w:t xml:space="preserve"> mas é só do transferências? Se sim, jogo aqui. Ah não, é de toda aplicação, então jogo aqui, está bom? Então vou vir aqui, vou fazer Cypress, complemento, por quê? Porque eu posso encontrar esse tipo de caixa em várias outras partes do sistema conforme ele for se tornando mais maduro, né? E o que eu vou dizer? Selecionar opção na combo box, ok? Esse é o nome que eu vou dar aqui pra </w:t>
+      </w:r>
+      <w:proofErr w:type="spellStart"/>
+      <w:r>
+        <w:t>pra</w:t>
+      </w:r>
+      <w:proofErr w:type="spellEnd"/>
+      <w:r>
+        <w:t xml:space="preserve"> nossa pro nosso comando customizado. E aí inicialmente eu vou colocar aqui apenas o código aqui dentro, só pra ajudar você entender o que que a gente vai fazer agora. Olha só, conta a origem o nome do </w:t>
+      </w:r>
+      <w:proofErr w:type="spellStart"/>
+      <w:r>
+        <w:t>label</w:t>
+      </w:r>
+      <w:proofErr w:type="spellEnd"/>
+      <w:r>
+        <w:t xml:space="preserve">, não é? Então, o que que eu fazer aqui? Ao invés de </w:t>
+      </w:r>
+      <w:proofErr w:type="spellStart"/>
+      <w:r>
+        <w:t>de</w:t>
+      </w:r>
+      <w:proofErr w:type="spellEnd"/>
+      <w:r>
+        <w:t xml:space="preserve"> ter apenas </w:t>
+      </w:r>
+      <w:proofErr w:type="gramStart"/>
+      <w:r>
+        <w:t>o parênteses</w:t>
+      </w:r>
+      <w:proofErr w:type="gramEnd"/>
+      <w:r>
+        <w:t xml:space="preserve">, vou colocar aqui o </w:t>
+      </w:r>
+      <w:proofErr w:type="spellStart"/>
+      <w:r>
+        <w:t>label</w:t>
+      </w:r>
+      <w:proofErr w:type="spellEnd"/>
+      <w:r>
+        <w:t xml:space="preserve">, vai ser </w:t>
+      </w:r>
+      <w:proofErr w:type="spellStart"/>
+      <w:r>
+        <w:t>label</w:t>
+      </w:r>
+      <w:proofErr w:type="spellEnd"/>
+      <w:r>
+        <w:t xml:space="preserve"> do campo. Por quê? Porque a gente já precisa desse </w:t>
+      </w:r>
+      <w:proofErr w:type="spellStart"/>
+      <w:r>
+        <w:t>desse</w:t>
+      </w:r>
+      <w:proofErr w:type="spellEnd"/>
+      <w:r>
+        <w:t xml:space="preserve"> elemento, que ele vai basicamente substituir isso, isso e isso </w:t>
+      </w:r>
+      <w:proofErr w:type="gramStart"/>
+      <w:r>
+        <w:t>daqui, certo</w:t>
+      </w:r>
+      <w:proofErr w:type="gramEnd"/>
+      <w:r>
+        <w:t xml:space="preserve">? Então olha o que vou fazer, vou pegar aqui </w:t>
+      </w:r>
+      <w:proofErr w:type="gramStart"/>
+      <w:r>
+        <w:t>00000 campo</w:t>
+      </w:r>
+      <w:proofErr w:type="gramEnd"/>
+      <w:r>
+        <w:t xml:space="preserve"> e vou vir </w:t>
+      </w:r>
+      <w:r>
+        <w:lastRenderedPageBreak/>
+        <w:t xml:space="preserve">aqui olha, e vou substituir, em vez de conta origem vai ser o do campo, certo? Só que daí você já aprendeu, né, em aula de programação que eu tenho negócio chamado </w:t>
+      </w:r>
+      <w:proofErr w:type="spellStart"/>
+      <w:r>
+        <w:t>template</w:t>
+      </w:r>
+      <w:proofErr w:type="spellEnd"/>
+      <w:r>
+        <w:t xml:space="preserve"> </w:t>
+      </w:r>
+      <w:proofErr w:type="spellStart"/>
+      <w:r>
+        <w:t>string</w:t>
+      </w:r>
+      <w:proofErr w:type="spellEnd"/>
+      <w:r>
+        <w:t xml:space="preserve">, que é assim, se eu quero colocar alguma coisa aqui, que está dentro de 1 </w:t>
+      </w:r>
+      <w:proofErr w:type="spellStart"/>
+      <w:r>
+        <w:t>string</w:t>
+      </w:r>
+      <w:proofErr w:type="spellEnd"/>
+      <w:r>
+        <w:t xml:space="preserve"> maior, eu venho aqui e coloco 1 crase, venho aqui olha, coloco 1 crase, e aqui no lugar de conta origem eu quero que está dentro de </w:t>
+      </w:r>
+      <w:proofErr w:type="spellStart"/>
+      <w:r>
+        <w:t>label</w:t>
+      </w:r>
+      <w:proofErr w:type="spellEnd"/>
+      <w:r>
+        <w:t xml:space="preserve"> do campo, então eu coloco dólar, chave, chave, E aqui no meio eu coloco o do campo, certo? Vou vir aqui, mesma coisa olha. Se eu quero trocar aqui no ponto origem, né, eu posso vir aqui e colocar 1 crase, 1 crase, aqui também. E aqui no lugar de ponto origem eu coloco dólar, chave, levou do campo, certo? Vou fazer isso daqui, pros demais aqui também, por exemplo, pra esse, olha. Campo origem, campo origem. No lugar aqui olha, do </w:t>
+      </w:r>
+      <w:proofErr w:type="spellStart"/>
+      <w:r>
+        <w:t>do</w:t>
+      </w:r>
+      <w:proofErr w:type="spellEnd"/>
+      <w:r>
+        <w:t xml:space="preserve"> ponto origem eu coloco o dólar chave. Ok. Cola aqui </w:t>
+      </w:r>
+      <w:proofErr w:type="spellStart"/>
+      <w:r>
+        <w:t>leibu</w:t>
+      </w:r>
+      <w:proofErr w:type="spellEnd"/>
+      <w:r>
+        <w:t xml:space="preserve"> do campo. Passa a mesma coisa aqui embaixo. Certo? Agora, </w:t>
+      </w:r>
+      <w:proofErr w:type="spellStart"/>
+      <w:r>
+        <w:t>que</w:t>
+      </w:r>
+      <w:proofErr w:type="spellEnd"/>
+      <w:r>
+        <w:t xml:space="preserve"> que eu posso fazer aqui? Eu posso vir aqui, olha, e também falar que quem for usar o selecionar a opção com box tem que falar qual é a opção que quer selecionar. Só que aqui eu tenho apenas parâmetro. Se eu quiser usar 2, </w:t>
+      </w:r>
+      <w:proofErr w:type="spellStart"/>
+      <w:r>
+        <w:t>Julio</w:t>
+      </w:r>
+      <w:proofErr w:type="spellEnd"/>
+      <w:r>
+        <w:t xml:space="preserve">, aí eu tenho que voltar </w:t>
+      </w:r>
+      <w:proofErr w:type="gramStart"/>
+      <w:r>
+        <w:t>o parênteses</w:t>
+      </w:r>
+      <w:proofErr w:type="gramEnd"/>
+      <w:r>
+        <w:t xml:space="preserve">, volto </w:t>
+      </w:r>
+      <w:proofErr w:type="gramStart"/>
+      <w:r>
+        <w:t>o parênteses</w:t>
+      </w:r>
+      <w:proofErr w:type="gramEnd"/>
+      <w:r>
+        <w:t xml:space="preserve"> e coloco 1 vírgula aqui olha, e falo opção. Está vendo? Aí o que eu faço aqui? Copio opção e substituo aqui Priscila pela opção. Pronto. Agora, selecionar a opção na combo box é o nosso novo comando customizado. Ok? Que eu fiz? Criei parâmetro pra ser o do campo, criei parâmetro pra ser a opção. Venho aqui eu selecionei esse carinha, venho aqui no </w:t>
+      </w:r>
+      <w:proofErr w:type="gramStart"/>
+      <w:r>
+        <w:t>nosso transferências</w:t>
+      </w:r>
+      <w:proofErr w:type="gramEnd"/>
+      <w:r>
+        <w:t xml:space="preserve">, aqui olha, transferência sai, e aqui no lugar de tudo isso </w:t>
+      </w:r>
+      <w:proofErr w:type="gramStart"/>
+      <w:r>
+        <w:t>daqui, que</w:t>
+      </w:r>
+      <w:proofErr w:type="gramEnd"/>
+      <w:r>
+        <w:t xml:space="preserve"> que eu faço? Olha, eu vou colocar aqui embaixo 1º pra depois apagar. Sai, ponto. Selecionar campo na combo box, aí eu tenho que passar 2 coisas. Que é o ponto origem. Vem aqui olha, as placentas ponto origem. E o 2º que é qual é o elemento que eu qual </w:t>
+      </w:r>
+      <w:proofErr w:type="spellStart"/>
+      <w:r>
+        <w:t>qual</w:t>
+      </w:r>
+      <w:proofErr w:type="spellEnd"/>
+      <w:r>
+        <w:t xml:space="preserve"> opção que quero selecionar, que é Priscila. Posso apagar tudo isso daqui, uso só esse, e eu vou fazer a mesma coisinha. O </w:t>
+      </w:r>
+      <w:proofErr w:type="gramStart"/>
+      <w:r>
+        <w:t>nosso transferências</w:t>
+      </w:r>
+      <w:proofErr w:type="gramEnd"/>
+      <w:r>
+        <w:t xml:space="preserve">, aqui olha, transferência sai. E aqui no lugar de tudo isso </w:t>
+      </w:r>
+      <w:proofErr w:type="gramStart"/>
+      <w:r>
+        <w:t>daqui, o</w:t>
+      </w:r>
+      <w:proofErr w:type="gramEnd"/>
+      <w:r>
+        <w:t xml:space="preserve"> que que eu faço? Olha, eu vou colocar aqui embaixo 1º pra depois apagar. Sai, ponto. Selecionar campo na combo box, aí eu tenho que passar 2 coisas. Que é o conto origem, vem aqui olha, as </w:t>
+      </w:r>
+      <w:proofErr w:type="spellStart"/>
+      <w:r>
+        <w:t>pasitas</w:t>
+      </w:r>
+      <w:proofErr w:type="spellEnd"/>
+      <w:r>
+        <w:t xml:space="preserve">, conto origem, e o 2º que é qual é o elemento que eu qual que a opção que eu quero selecionar, que é a Priscila. Posso apagar tudo isso daqui? Uso só esse. Eu vou fazer a mesma coisinha pro </w:t>
+      </w:r>
+      <w:proofErr w:type="spellStart"/>
+      <w:r>
+        <w:t>Julio</w:t>
+      </w:r>
+      <w:proofErr w:type="spellEnd"/>
+      <w:r>
+        <w:t xml:space="preserve">, só que agora, né, vai ser assim, olha, em vez de ser conta origem, é conta destino, em vez de ser Priscila, é julho. Vem aqui olha, apago todo esse resto. Olha só como ficou, só 2, está vendo? Vou salvar, vou vir aqui no Cypress e vamos lá pras, transferência e ver se vai funcionar. Olha só. Ele vem aqui, olha. Pegou o contar origem, clicou, verificou o elemento, clicou no elemento, e fez a seleção. Está vendo? Vem aqui no </w:t>
+      </w:r>
+      <w:proofErr w:type="spellStart"/>
+      <w:r>
+        <w:t>get</w:t>
+      </w:r>
+      <w:proofErr w:type="spellEnd"/>
+      <w:r>
+        <w:t xml:space="preserve">, clique, pegou o elemento, verificou lá dentro, clicou, olha só. Todo selecionado certinho. Continua, digitou 11, conténs e assim por diante, certo? E aqui olha, viu lá que a transferência foi realizada. Então, esse </w:t>
+      </w:r>
+      <w:proofErr w:type="spellStart"/>
+      <w:r>
+        <w:t>custom</w:t>
+      </w:r>
+      <w:proofErr w:type="spellEnd"/>
+      <w:r>
+        <w:t xml:space="preserve"> </w:t>
+      </w:r>
+      <w:proofErr w:type="spellStart"/>
+      <w:r>
+        <w:t>comment</w:t>
+      </w:r>
+      <w:proofErr w:type="spellEnd"/>
+      <w:r>
+        <w:t xml:space="preserve"> que a gente acabou de criar, que a gente acabou de criar aqui olha, ele substituiu todas aquelas linhas, 6 linhas, por 2 linhas apenas, e todas as vezes que dentro do </w:t>
+      </w:r>
+      <w:proofErr w:type="spellStart"/>
+      <w:r>
+        <w:t>do</w:t>
+      </w:r>
+      <w:proofErr w:type="spellEnd"/>
+      <w:r>
+        <w:t xml:space="preserve"> sistema tiver combo box eu posso usar essa mesma função. Legal, né? Agora, o que mais que eu posso fazer aqui? Se </w:t>
+      </w:r>
+      <w:proofErr w:type="gramStart"/>
+      <w:r>
+        <w:t>eu já substitui</w:t>
+      </w:r>
+      <w:proofErr w:type="gramEnd"/>
+      <w:r>
+        <w:t xml:space="preserve"> isso daqui por, né, comandos customizados e esse daqui também. Tem 1 outra coisa que é comum também em comandos customizados que é o seguinte, por exemplo, esse nosso teste aqui, a gente fez teste onde a gente vai selecionar os elementos, vai digitar aqui, né, valor, vai clicar no botão de transferir e vai realizar a transferência. Pra que você entenda essa necessidade de outro Custom </w:t>
+      </w:r>
+      <w:proofErr w:type="spellStart"/>
+      <w:r>
+        <w:t>Comment</w:t>
+      </w:r>
+      <w:proofErr w:type="spellEnd"/>
+      <w:r>
+        <w:t xml:space="preserve"> que a gente vai colocar aqui </w:t>
+      </w:r>
+      <w:proofErr w:type="gramStart"/>
+      <w:r>
+        <w:t>dentro do transferência</w:t>
+      </w:r>
+      <w:proofErr w:type="gramEnd"/>
+      <w:r>
+        <w:t xml:space="preserve">, eu preciso levar você a construir mais teste de transferências, mas agora que você já está bom nesses testes, já fica fácil, né. O que que a gente vai fazer agora? Vamos fazer teste que que vai ferir a regra do token. Você lembra lá da regra do token como funciona? É assim olha, se a gente colocar aqui valor acima de 5000, tem que digitar o token, mas eu não vou digitar o token, só vou colocar valor acima de 5000 pra gente ver se essa regra funciona. Se ela funcionar, vai apresentar 1 outra mensagem pra gente, e é esse teste que eu quero fazer, é teste que valida que token que o token deve ser pedido para valores acima de 5000 reais. Vamos fazer esse teste? Vou vir aqui, vou copiar completamente isso daqui. Todas vezes que você escutar isso ou que o seu cérebro </w:t>
+      </w:r>
+      <w:r>
+        <w:lastRenderedPageBreak/>
+        <w:t xml:space="preserve">falar isso, vou copiar completamente isso daqui e mudar 1 pouca coisa, já sabe, é comando customizado vindo por aí, mas eu vou te levar a fazer isso, está bom? Então olha só como vai ser esse nosso 2º teste. Deve, olha só, deve apresentar erro quando transferir mais que 5000 sem o token. Está bom? Então vamos lá, botão transferir, valor aqui olha, vou colocar 5000 e está bom? Ou melhor, </w:t>
+      </w:r>
+      <w:proofErr w:type="gramStart"/>
+      <w:r>
+        <w:t>5000.0 beleza</w:t>
+      </w:r>
+      <w:proofErr w:type="gramEnd"/>
+      <w:r>
+        <w:t xml:space="preserve">? Então quando </w:t>
+      </w:r>
+      <w:proofErr w:type="spellStart"/>
+      <w:r>
+        <w:t>quando</w:t>
+      </w:r>
+      <w:proofErr w:type="spellEnd"/>
+      <w:r>
+        <w:t xml:space="preserve"> fizer isso daqui, 1 tentativa de transferência com 5000 e né, eu vou até melhorar isso olha, deve apresentar erro quando tentar transferir mais que 5000, Beleza? Agora </w:t>
+      </w:r>
+      <w:proofErr w:type="gramStart"/>
+      <w:r>
+        <w:t>está</w:t>
+      </w:r>
+      <w:proofErr w:type="gramEnd"/>
+      <w:r>
+        <w:t xml:space="preserve"> </w:t>
+      </w:r>
+      <w:proofErr w:type="spellStart"/>
+      <w:r>
+        <w:t>está</w:t>
+      </w:r>
+      <w:proofErr w:type="spellEnd"/>
+      <w:r>
+        <w:t xml:space="preserve"> melhor, né? E vou fazer aqui olha, ponto </w:t>
+      </w:r>
+      <w:proofErr w:type="spellStart"/>
+      <w:r>
+        <w:t>only</w:t>
+      </w:r>
+      <w:proofErr w:type="spellEnd"/>
+      <w:r>
+        <w:t xml:space="preserve"> pra gente testar apenas esse. Então agora, se eu venho aqui no Cypress, aqui olha, olha só, a autenticação necessária pra transferência acima de 5000. Vou vir aqui e vou colocar essa mensagem aqui, certo? E agora se eu rodar de novo, agora sim o teste passa porque ele veio olha, tentou fazer a transferência acima de 5001 mensagem apareceu e aqui a gente validou que estava com ele, está vendo? Agora sim eu tenho algo aqui que eu queria te mostrar, olha que bacana. Até então a gente tinha teste apenas de transferência, mas agora a gente tem 2. E se você for olhar, agora a gente já tem coisas que se repetem nos 2. </w:t>
+      </w:r>
+      <w:proofErr w:type="gramStart"/>
+      <w:r>
+        <w:t>Deixa eu</w:t>
+      </w:r>
+      <w:proofErr w:type="gramEnd"/>
+      <w:r>
+        <w:t xml:space="preserve"> deixar aqui mais claro pra você olha, vou pegar esse comando aqui, vou juntar com esse, esse com esse. Esse com esse, esse com esse. E você vai ver agora claramente olha, isso daqui é o quê? </w:t>
+      </w:r>
+      <w:proofErr w:type="spellStart"/>
+      <w:r>
+        <w:t>Act</w:t>
+      </w:r>
+      <w:proofErr w:type="spellEnd"/>
+      <w:r>
+        <w:t xml:space="preserve">. Esse daqui é o quê? </w:t>
+      </w:r>
+      <w:proofErr w:type="spellStart"/>
+      <w:r>
+        <w:t>Accept</w:t>
+      </w:r>
+      <w:proofErr w:type="spellEnd"/>
+      <w:r>
+        <w:t xml:space="preserve">, certo? Esse daqui é </w:t>
+      </w:r>
+      <w:proofErr w:type="spellStart"/>
+      <w:r>
+        <w:t>act</w:t>
+      </w:r>
+      <w:proofErr w:type="spellEnd"/>
+      <w:r>
+        <w:t xml:space="preserve">, e esse daqui é, </w:t>
+      </w:r>
+      <w:proofErr w:type="spellStart"/>
+      <w:r>
+        <w:t>assert</w:t>
+      </w:r>
+      <w:proofErr w:type="spellEnd"/>
+      <w:r>
+        <w:t xml:space="preserve">. Não é? Olha só esse </w:t>
+      </w:r>
+      <w:proofErr w:type="spellStart"/>
+      <w:r>
+        <w:t>act</w:t>
+      </w:r>
+      <w:proofErr w:type="spellEnd"/>
+      <w:r>
+        <w:t xml:space="preserve">. Seleciona, seleciona, depois digita o valor, depois transfere. Seleciona, seleciona, digita o valor, depois transfere. Qual que a diferença entre esses de cima e os de baixo? A diferença é que a gente tem no de cima o valor 11 e no de baixo o valor 6000, certo? Que que a gente podia fazer aqui? A gente podia criar </w:t>
+      </w:r>
+      <w:proofErr w:type="spellStart"/>
+      <w:r>
+        <w:t>custom</w:t>
+      </w:r>
+      <w:proofErr w:type="spellEnd"/>
+      <w:r>
+        <w:t xml:space="preserve"> </w:t>
+      </w:r>
+      <w:proofErr w:type="spellStart"/>
+      <w:r>
+        <w:t>comments</w:t>
+      </w:r>
+      <w:proofErr w:type="spellEnd"/>
+      <w:r>
+        <w:t xml:space="preserve"> pra preencher e submeter a transferência de valores, não é? E essa esse </w:t>
+      </w:r>
+      <w:proofErr w:type="spellStart"/>
+      <w:r>
+        <w:t>custom</w:t>
+      </w:r>
+      <w:proofErr w:type="spellEnd"/>
+      <w:r>
+        <w:t xml:space="preserve"> </w:t>
+      </w:r>
+      <w:proofErr w:type="spellStart"/>
+      <w:r>
+        <w:t>comments</w:t>
+      </w:r>
+      <w:proofErr w:type="spellEnd"/>
+      <w:r>
+        <w:t xml:space="preserve"> de preencher e submeter a transferência de valores, né, que é transferir valores aqui no caso. Eu pergunto pra você, ela é válida pro login? Não. E pra transferência? Sim. Se ela é válida só pra e não é válida pra outra, ela não pode entrar no comum, entendeu? Ah, </w:t>
+      </w:r>
+      <w:proofErr w:type="spellStart"/>
+      <w:r>
+        <w:t>Julio</w:t>
+      </w:r>
+      <w:proofErr w:type="spellEnd"/>
+      <w:r>
+        <w:t xml:space="preserve">, mas o selecionar a opção na combo box só tem </w:t>
+      </w:r>
+      <w:proofErr w:type="gramStart"/>
+      <w:r>
+        <w:t>no transferência</w:t>
+      </w:r>
+      <w:proofErr w:type="gramEnd"/>
+      <w:r>
+        <w:t xml:space="preserve">. É, mas vamos dizer que a gente tem 1 nova tela agora, que é a tela de cadastro de usuário, e lá tem combo box, esse daqui vai servir pra ela. Agora, nessa nova tela de cadastro de usuário vai </w:t>
+      </w:r>
+      <w:proofErr w:type="gramStart"/>
+      <w:r>
+        <w:t>ter</w:t>
+      </w:r>
+      <w:proofErr w:type="gramEnd"/>
+      <w:r>
+        <w:t xml:space="preserve"> realizar transferência? Não vai. Entende o que eu quero dizer? Então, essa questão aqui do da escolha de onde vai ficar os seus </w:t>
+      </w:r>
+      <w:proofErr w:type="spellStart"/>
+      <w:r>
+        <w:t>custom</w:t>
+      </w:r>
+      <w:proofErr w:type="spellEnd"/>
+      <w:r>
+        <w:t xml:space="preserve"> </w:t>
+      </w:r>
+      <w:proofErr w:type="spellStart"/>
+      <w:r>
+        <w:t>comments</w:t>
+      </w:r>
+      <w:proofErr w:type="spellEnd"/>
+      <w:r>
+        <w:t xml:space="preserve"> vai do contexto, nesse caso aqui, esse </w:t>
+      </w:r>
+      <w:proofErr w:type="spellStart"/>
+      <w:r>
+        <w:t>custom</w:t>
+      </w:r>
+      <w:proofErr w:type="spellEnd"/>
+      <w:r>
+        <w:t xml:space="preserve"> </w:t>
+      </w:r>
+      <w:proofErr w:type="spellStart"/>
+      <w:r>
+        <w:t>comments</w:t>
+      </w:r>
+      <w:proofErr w:type="spellEnd"/>
+      <w:r>
+        <w:t xml:space="preserve"> que a gente vai criar pra realizar a transferência ele vale apenas para o contexto da transferência mesmo, por isso ele vai estar aqui dentro desse arquivo. Então eu vou vir aqui, vou digitar Cypress ponto </w:t>
+      </w:r>
+      <w:proofErr w:type="spellStart"/>
+      <w:r>
+        <w:t>comments</w:t>
+      </w:r>
+      <w:proofErr w:type="spellEnd"/>
+      <w:r>
+        <w:t xml:space="preserve"> ponto ADDE aqui eu vou colocar 1 1 mensagem, nome pra essa função de realizar, nome pra esse </w:t>
+      </w:r>
+      <w:proofErr w:type="spellStart"/>
+      <w:r>
+        <w:t>custom</w:t>
+      </w:r>
+      <w:proofErr w:type="spellEnd"/>
+      <w:r>
+        <w:t xml:space="preserve"> </w:t>
+      </w:r>
+      <w:proofErr w:type="spellStart"/>
+      <w:r>
+        <w:t>comment</w:t>
+      </w:r>
+      <w:proofErr w:type="spellEnd"/>
+      <w:r>
+        <w:t xml:space="preserve"> de realizar transferência, ok? Aí eu vou vir aqui e vou colocar aqui </w:t>
+      </w:r>
+      <w:proofErr w:type="gramStart"/>
+      <w:r>
+        <w:t>o parênteses</w:t>
+      </w:r>
+      <w:proofErr w:type="gramEnd"/>
+      <w:r>
+        <w:t xml:space="preserve"> igual símbolo de maior chave e vou colar aqui o que seria esse nosso </w:t>
+      </w:r>
+      <w:proofErr w:type="spellStart"/>
+      <w:r>
+        <w:t>custom</w:t>
+      </w:r>
+      <w:proofErr w:type="spellEnd"/>
+      <w:r>
+        <w:t xml:space="preserve"> </w:t>
+      </w:r>
+      <w:proofErr w:type="spellStart"/>
+      <w:r>
+        <w:t>comment</w:t>
+      </w:r>
+      <w:proofErr w:type="spellEnd"/>
+      <w:r>
+        <w:t xml:space="preserve">. Agora olha só, que que eu vou ter aqui como parâmetro? É só ou são vários? Se é eu tiro </w:t>
+      </w:r>
+      <w:proofErr w:type="gramStart"/>
+      <w:r>
+        <w:t>o parênteses</w:t>
+      </w:r>
+      <w:proofErr w:type="gramEnd"/>
+      <w:r>
+        <w:t xml:space="preserve">, se é vários eu deixo </w:t>
+      </w:r>
+      <w:proofErr w:type="gramStart"/>
+      <w:r>
+        <w:t>o parênteses</w:t>
+      </w:r>
+      <w:proofErr w:type="gramEnd"/>
+      <w:r>
+        <w:t xml:space="preserve"> e coloco aqui. Então vamos ver o que que a vai ter aqui? A gente vai ter o conta origem, vamos ter o conta destino. Ah, Júlio, mas por que o conta origem? Porque a gente vai substituir aqui a Priscila. E o conta origem? A conta destino, né? Que mais que gente vai ter? Gente vai ter o valor também. Então, valor, certo? Conta origem, conta destino e valor. Agora o que que a gente faz? Pega o conta origem, substitui o Priscila, pega o conta destino, substitui o </w:t>
+      </w:r>
+      <w:proofErr w:type="spellStart"/>
+      <w:r>
+        <w:t>Julio</w:t>
+      </w:r>
+      <w:proofErr w:type="spellEnd"/>
+      <w:r>
+        <w:t xml:space="preserve">, pega o valor, substitui o valor que a gente está colocando aqui que é 11. Pronto. Agora eu pego o nome do comando customizado, vou lá </w:t>
+      </w:r>
+      <w:proofErr w:type="gramStart"/>
+      <w:r>
+        <w:t>no transferência</w:t>
+      </w:r>
+      <w:proofErr w:type="gramEnd"/>
+      <w:r>
+        <w:t xml:space="preserve">, ok? O valor que a está colocando aqui que é 11. Pronto. Agora eu pego o nome do comando customizado, vou lá </w:t>
+      </w:r>
+      <w:proofErr w:type="gramStart"/>
+      <w:r>
+        <w:t>no transferência</w:t>
+      </w:r>
+      <w:proofErr w:type="gramEnd"/>
+      <w:r>
+        <w:t xml:space="preserve">, ok? </w:t>
+      </w:r>
+      <w:proofErr w:type="gramStart"/>
+      <w:r>
+        <w:t>Na verdade</w:t>
+      </w:r>
+      <w:proofErr w:type="gramEnd"/>
+      <w:r>
+        <w:t xml:space="preserve"> eu vou apagar tudo isso daqui que tem aqui, mas 1º eu vou fazer o comando pra você enxergar. Então sai ponto o nome realizar a transferência, parênteses e aqui eu vou colocar conta origem, vai ser Priscila, conta destino, vai ser </w:t>
+      </w:r>
+      <w:proofErr w:type="spellStart"/>
+      <w:r>
+        <w:t>Julio</w:t>
+      </w:r>
+      <w:proofErr w:type="spellEnd"/>
+      <w:r>
+        <w:t xml:space="preserve">, valor vai ser 11, certo? E apago todo esse resto aqui, quê? Porque esse nosso </w:t>
+      </w:r>
+      <w:proofErr w:type="spellStart"/>
+      <w:r>
+        <w:t>custom</w:t>
+      </w:r>
+      <w:proofErr w:type="spellEnd"/>
+      <w:r>
+        <w:t xml:space="preserve"> come e substituiu tudo. Copio daqui, vem aqui embaixo. Priscila é conta origem, Julia é conta destino e 6000 é o valor que a gente vai ter aqui. Apago. Olha só como ficou curtinho agora. Legal, né? Então aqui, site ponto </w:t>
+      </w:r>
+      <w:proofErr w:type="spellStart"/>
+      <w:r>
+        <w:t>visit</w:t>
+      </w:r>
+      <w:proofErr w:type="spellEnd"/>
+      <w:r>
+        <w:t xml:space="preserve">, já é comando do próprio Cypress. Site ponto fazer </w:t>
+      </w:r>
+      <w:r>
+        <w:lastRenderedPageBreak/>
+        <w:t xml:space="preserve">login com credenciais válidas é </w:t>
+      </w:r>
+      <w:proofErr w:type="spellStart"/>
+      <w:r>
+        <w:t>custom</w:t>
+      </w:r>
+      <w:proofErr w:type="spellEnd"/>
+      <w:r>
+        <w:t xml:space="preserve"> </w:t>
+      </w:r>
+      <w:proofErr w:type="spellStart"/>
+      <w:r>
+        <w:t>command</w:t>
+      </w:r>
+      <w:proofErr w:type="spellEnd"/>
+      <w:r>
+        <w:t xml:space="preserve"> nosso, né, do login. Realizar transferência é </w:t>
+      </w:r>
+      <w:proofErr w:type="spellStart"/>
+      <w:r>
+        <w:t>custom</w:t>
+      </w:r>
+      <w:proofErr w:type="spellEnd"/>
+      <w:r>
+        <w:t xml:space="preserve"> </w:t>
+      </w:r>
+      <w:proofErr w:type="spellStart"/>
+      <w:r>
+        <w:t>command</w:t>
+      </w:r>
+      <w:proofErr w:type="spellEnd"/>
+      <w:r>
+        <w:t xml:space="preserve"> nosso, </w:t>
+      </w:r>
+      <w:proofErr w:type="gramStart"/>
+      <w:r>
+        <w:t>do transferência</w:t>
+      </w:r>
+      <w:proofErr w:type="gramEnd"/>
+      <w:r>
+        <w:t xml:space="preserve">. Verificar mensagem no </w:t>
+      </w:r>
+      <w:proofErr w:type="spellStart"/>
+      <w:r>
+        <w:t>Toast</w:t>
+      </w:r>
+      <w:proofErr w:type="spellEnd"/>
+      <w:r>
+        <w:t xml:space="preserve"> é </w:t>
+      </w:r>
+      <w:proofErr w:type="spellStart"/>
+      <w:r>
+        <w:t>custom</w:t>
+      </w:r>
+      <w:proofErr w:type="spellEnd"/>
+      <w:r>
+        <w:t xml:space="preserve"> </w:t>
+      </w:r>
+      <w:proofErr w:type="spellStart"/>
+      <w:r>
+        <w:t>command</w:t>
+      </w:r>
+      <w:proofErr w:type="spellEnd"/>
+      <w:r>
+        <w:t xml:space="preserve"> do common. E aí, aqui tem uns aqui tem 6000. Depois tem a validação dos 2 e a gente já está pronto, eu salvo. Vou lá no Cypress. Olha só, tem aqui a transferência, </w:t>
+      </w:r>
+      <w:proofErr w:type="gramStart"/>
+      <w:r>
+        <w:t>Ah</w:t>
+      </w:r>
+      <w:proofErr w:type="gramEnd"/>
+      <w:r>
+        <w:t xml:space="preserve">, ele está rodando só que o Only, </w:t>
+      </w:r>
+      <w:proofErr w:type="gramStart"/>
+      <w:r>
+        <w:t>Então</w:t>
+      </w:r>
+      <w:proofErr w:type="gramEnd"/>
+      <w:r>
+        <w:t xml:space="preserve"> eu vou voltar aqui, vou tirar o Only daqui, olha. Salvei.</w:t>
+      </w:r>
     </w:p>
     <w:p>
       <w:pPr>
@@ -13654,7 +17036,10 @@
     </w:p>
     <w:p>
       <w:pPr>
-        <w:spacing w:after="0"/>
+        <w:rPr>
+          <w:b/>
+          <w:bCs/>
+        </w:rPr>
       </w:pPr>
       <w:r>
         <w:rPr>
@@ -13669,6 +17054,13 @@
           <w:bCs/>
         </w:rPr>
         <w:t xml:space="preserve">. </w:t>
+      </w:r>
+      <w:r>
+        <w:rPr>
+          <w:b/>
+          <w:bCs/>
+        </w:rPr>
+        <w:t>Configurando a Geração de Relatórios em HTML</w:t>
       </w:r>
     </w:p>
     <w:p>

</xml_diff>